<commit_message>
Update project book with mentor feedback
</commit_message>
<xml_diff>
--- a/docs/project-book/Damka_Project_Book_TCP_Profile.docx
+++ b/docs/project-book/Damka_Project_Book_TCP_Profile.docx
@@ -490,7 +490,7 @@
             <w:rtl w:val="0"/>
             <w:szCs w:val="24"/>
           </w:rPr>
-          <w:t>4</w:t>
+          <w:t>5</w:t>
         </w:r>
       </w:fldSimple>
     </w:p>
@@ -532,7 +532,7 @@
             <w:rtl w:val="0"/>
             <w:szCs w:val="24"/>
           </w:rPr>
-          <w:t>5</w:t>
+          <w:t>6</w:t>
         </w:r>
       </w:fldSimple>
     </w:p>
@@ -596,7 +596,7 @@
             <w:rtl w:val="0"/>
             <w:szCs w:val="24"/>
           </w:rPr>
-          <w:t>7</w:t>
+          <w:t>8</w:t>
         </w:r>
       </w:fldSimple>
     </w:p>
@@ -660,7 +660,7 @@
             <w:rtl w:val="0"/>
             <w:szCs w:val="24"/>
           </w:rPr>
-          <w:t>9</w:t>
+          <w:t>11</w:t>
         </w:r>
       </w:fldSimple>
     </w:p>
@@ -724,7 +724,7 @@
             <w:rtl w:val="0"/>
             <w:szCs w:val="24"/>
           </w:rPr>
-          <w:t>10</w:t>
+          <w:t>13</w:t>
         </w:r>
       </w:fldSimple>
     </w:p>
@@ -757,90 +757,6 @@
         <w:t xml:space="preserve"> ממשק המשתמש ומסכי המערכת  ..................................  </w:t>
       </w:r>
       <w:fldSimple w:instr="PAGEREF chapter_7 \h">
-        <w:r>
-          <w:rPr>
-            <w:rFonts w:ascii="Times New Roman" w:hAnsi="Times New Roman" w:eastAsia="Times New Roman" w:cs="Times New Roman"/>
-            <w:b w:val="0"/>
-            <w:color w:val="172337"/>
-            <w:sz w:val="24"/>
-            <w:rtl w:val="0"/>
-            <w:szCs w:val="24"/>
-          </w:rPr>
-          <w:t>12</w:t>
-        </w:r>
-      </w:fldSimple>
-    </w:p>
-    <w:p>
-      <w:pPr>
-        <w:spacing w:after="120" w:line="293" w:lineRule="auto"/>
-        <w:jc w:val="right"/>
-        <w:bidi w:val="1"/>
-      </w:pPr>
-      <w:r>
-        <w:rPr>
-          <w:rFonts w:ascii="Times New Roman" w:hAnsi="Times New Roman" w:eastAsia="Times New Roman" w:cs="Times New Roman"/>
-          <w:b w:val="0"/>
-          <w:color w:val="172337"/>
-          <w:sz w:val="24"/>
-          <w:rtl w:val="0"/>
-          <w:szCs w:val="24"/>
-        </w:rPr>
-        <w:t>8.</w:t>
-      </w:r>
-      <w:r>
-        <w:rPr>
-          <w:rFonts w:ascii="David" w:hAnsi="David" w:eastAsia="David" w:cs="David"/>
-          <w:b w:val="0"/>
-          <w:color w:val="172337"/>
-          <w:sz w:val="24"/>
-          <w:rtl w:val="1"/>
-          <w:szCs w:val="24"/>
-        </w:rPr>
-        <w:t xml:space="preserve"> בדיקות ואימות המערכת  ..................................  </w:t>
-      </w:r>
-      <w:fldSimple w:instr="PAGEREF chapter_8 \h">
-        <w:r>
-          <w:rPr>
-            <w:rFonts w:ascii="Times New Roman" w:hAnsi="Times New Roman" w:eastAsia="Times New Roman" w:cs="Times New Roman"/>
-            <w:b w:val="0"/>
-            <w:color w:val="172337"/>
-            <w:sz w:val="24"/>
-            <w:rtl w:val="0"/>
-            <w:szCs w:val="24"/>
-          </w:rPr>
-          <w:t>14</w:t>
-        </w:r>
-      </w:fldSimple>
-    </w:p>
-    <w:p>
-      <w:pPr>
-        <w:spacing w:after="120" w:line="293" w:lineRule="auto"/>
-        <w:jc w:val="right"/>
-        <w:bidi w:val="1"/>
-      </w:pPr>
-      <w:r>
-        <w:rPr>
-          <w:rFonts w:ascii="Times New Roman" w:hAnsi="Times New Roman" w:eastAsia="Times New Roman" w:cs="Times New Roman"/>
-          <w:b w:val="0"/>
-          <w:color w:val="172337"/>
-          <w:sz w:val="24"/>
-          <w:rtl w:val="0"/>
-          <w:szCs w:val="24"/>
-        </w:rPr>
-        <w:t>9.</w:t>
-      </w:r>
-      <w:r>
-        <w:rPr>
-          <w:rFonts w:ascii="David" w:hAnsi="David" w:eastAsia="David" w:cs="David"/>
-          <w:b w:val="0"/>
-          <w:color w:val="172337"/>
-          <w:sz w:val="24"/>
-          <w:rtl w:val="1"/>
-          <w:szCs w:val="24"/>
-        </w:rPr>
-        <w:t xml:space="preserve"> הפעלה ומדריך משתמש  ..................................  </w:t>
-      </w:r>
-      <w:fldSimple w:instr="PAGEREF chapter_9 \h">
         <w:r>
           <w:rPr>
             <w:rFonts w:ascii="Times New Roman" w:hAnsi="Times New Roman" w:eastAsia="Times New Roman" w:cs="Times New Roman"/>
@@ -869,6 +785,90 @@
           <w:rtl w:val="0"/>
           <w:szCs w:val="24"/>
         </w:rPr>
+        <w:t>8.</w:t>
+      </w:r>
+      <w:r>
+        <w:rPr>
+          <w:rFonts w:ascii="David" w:hAnsi="David" w:eastAsia="David" w:cs="David"/>
+          <w:b w:val="0"/>
+          <w:color w:val="172337"/>
+          <w:sz w:val="24"/>
+          <w:rtl w:val="1"/>
+          <w:szCs w:val="24"/>
+        </w:rPr>
+        <w:t xml:space="preserve"> בדיקות ואימות המערכת  ..................................  </w:t>
+      </w:r>
+      <w:fldSimple w:instr="PAGEREF chapter_8 \h">
+        <w:r>
+          <w:rPr>
+            <w:rFonts w:ascii="Times New Roman" w:hAnsi="Times New Roman" w:eastAsia="Times New Roman" w:cs="Times New Roman"/>
+            <w:b w:val="0"/>
+            <w:color w:val="172337"/>
+            <w:sz w:val="24"/>
+            <w:rtl w:val="0"/>
+            <w:szCs w:val="24"/>
+          </w:rPr>
+          <w:t>17</w:t>
+        </w:r>
+      </w:fldSimple>
+    </w:p>
+    <w:p>
+      <w:pPr>
+        <w:spacing w:after="120" w:line="293" w:lineRule="auto"/>
+        <w:jc w:val="right"/>
+        <w:bidi w:val="1"/>
+      </w:pPr>
+      <w:r>
+        <w:rPr>
+          <w:rFonts w:ascii="Times New Roman" w:hAnsi="Times New Roman" w:eastAsia="Times New Roman" w:cs="Times New Roman"/>
+          <w:b w:val="0"/>
+          <w:color w:val="172337"/>
+          <w:sz w:val="24"/>
+          <w:rtl w:val="0"/>
+          <w:szCs w:val="24"/>
+        </w:rPr>
+        <w:t>9.</w:t>
+      </w:r>
+      <w:r>
+        <w:rPr>
+          <w:rFonts w:ascii="David" w:hAnsi="David" w:eastAsia="David" w:cs="David"/>
+          <w:b w:val="0"/>
+          <w:color w:val="172337"/>
+          <w:sz w:val="24"/>
+          <w:rtl w:val="1"/>
+          <w:szCs w:val="24"/>
+        </w:rPr>
+        <w:t xml:space="preserve"> הפעלה ומדריך משתמש  ..................................  </w:t>
+      </w:r>
+      <w:fldSimple w:instr="PAGEREF chapter_9 \h">
+        <w:r>
+          <w:rPr>
+            <w:rFonts w:ascii="Times New Roman" w:hAnsi="Times New Roman" w:eastAsia="Times New Roman" w:cs="Times New Roman"/>
+            <w:b w:val="0"/>
+            <w:color w:val="172337"/>
+            <w:sz w:val="24"/>
+            <w:rtl w:val="0"/>
+            <w:szCs w:val="24"/>
+          </w:rPr>
+          <w:t>19</w:t>
+        </w:r>
+      </w:fldSimple>
+    </w:p>
+    <w:p>
+      <w:pPr>
+        <w:spacing w:after="120" w:line="293" w:lineRule="auto"/>
+        <w:jc w:val="right"/>
+        <w:bidi w:val="1"/>
+      </w:pPr>
+      <w:r>
+        <w:rPr>
+          <w:rFonts w:ascii="Times New Roman" w:hAnsi="Times New Roman" w:eastAsia="Times New Roman" w:cs="Times New Roman"/>
+          <w:b w:val="0"/>
+          <w:color w:val="172337"/>
+          <w:sz w:val="24"/>
+          <w:rtl w:val="0"/>
+          <w:szCs w:val="24"/>
+        </w:rPr>
         <w:t>10.</w:t>
       </w:r>
       <w:r>
@@ -914,7 +914,7 @@
             <w:rtl w:val="0"/>
             <w:szCs w:val="24"/>
           </w:rPr>
-          <w:t>16</w:t>
+          <w:t>20</w:t>
         </w:r>
       </w:fldSimple>
     </w:p>
@@ -956,7 +956,7 @@
             <w:rtl w:val="0"/>
             <w:szCs w:val="24"/>
           </w:rPr>
-          <w:t>17</w:t>
+          <w:t>22</w:t>
         </w:r>
       </w:fldSimple>
     </w:p>
@@ -1405,6 +1405,246 @@
           <w:szCs w:val="26"/>
         </w:rPr>
         <w:t>damka.css.</w:t>
+      </w:r>
+    </w:p>
+    <w:p>
+      <w:pPr>
+        <w:spacing w:after="260" w:line="293" w:lineRule="auto" w:before="0"/>
+        <w:jc w:val="right"/>
+        <w:pStyle w:val="Heading1"/>
+        <w:keepNext/>
+        <w:pageBreakBefore/>
+        <w:bidi w:val="1"/>
+        <w:pBdr>
+          <w:bottom w:val="single" w:sz="18" w:color="D9E9F4"/>
+        </w:pBdr>
+      </w:pPr>
+      <w:r>
+        <w:rPr>
+          <w:rFonts w:ascii="Times New Roman" w:hAnsi="Times New Roman" w:eastAsia="Times New Roman" w:cs="Times New Roman"/>
+          <w:b/>
+          <w:color w:val="174C73"/>
+          <w:sz w:val="44"/>
+          <w:rtl w:val="0"/>
+          <w:szCs w:val="44"/>
+          <w:bCs w:val="1"/>
+        </w:rPr>
+        <w:t>1.</w:t>
+      </w:r>
+      <w:r>
+        <w:rPr>
+          <w:rFonts w:ascii="David" w:hAnsi="David" w:eastAsia="David" w:cs="David"/>
+          <w:b/>
+          <w:color w:val="174C73"/>
+          <w:sz w:val="44"/>
+          <w:rtl w:val="1"/>
+          <w:szCs w:val="44"/>
+          <w:bCs w:val="1"/>
+        </w:rPr>
+        <w:t xml:space="preserve"> מבוא, מטרות ודרישות — המשך</w:t>
+      </w:r>
+    </w:p>
+    <w:p>
+      <w:pPr>
+        <w:spacing w:after="140" w:line="293" w:lineRule="auto" w:before="160"/>
+        <w:jc w:val="right"/>
+        <w:pStyle w:val="Heading2"/>
+        <w:keepNext/>
+        <w:bidi w:val="1"/>
+      </w:pPr>
+      <w:r>
+        <w:rPr>
+          <w:rFonts w:ascii="David" w:hAnsi="David" w:eastAsia="David" w:cs="David"/>
+          <w:b/>
+          <w:color w:val="174C73"/>
+          <w:sz w:val="32"/>
+          <w:rtl w:val="1"/>
+          <w:szCs w:val="32"/>
+          <w:bCs w:val="1"/>
+        </w:rPr>
+        <w:t>מגבלות המערכת</w:t>
+      </w:r>
+    </w:p>
+    <w:p>
+      <w:pPr>
+        <w:spacing w:after="140" w:line="293" w:lineRule="auto"/>
+        <w:jc w:val="right"/>
+        <w:bidi w:val="1"/>
+      </w:pPr>
+      <w:r>
+        <w:rPr>
+          <w:rFonts w:ascii="David" w:hAnsi="David" w:eastAsia="David" w:cs="David"/>
+          <w:b w:val="0"/>
+          <w:color w:val="172337"/>
+          <w:sz w:val="26"/>
+          <w:rtl w:val="1"/>
+          <w:szCs w:val="26"/>
+        </w:rPr>
+        <w:t xml:space="preserve">המימוש הנוכחי מכוון למשחק ברשת מקומית. כתובת השרת והפורט ניתנים להגדרה, אך תקשורת </w:t>
+      </w:r>
+      <w:r>
+        <w:rPr>
+          <w:rFonts w:ascii="Times New Roman" w:hAnsi="Times New Roman" w:eastAsia="Times New Roman" w:cs="Times New Roman"/>
+          <w:b w:val="0"/>
+          <w:color w:val="172337"/>
+          <w:sz w:val="26"/>
+          <w:rtl w:val="0"/>
+          <w:szCs w:val="26"/>
+        </w:rPr>
+        <w:t>TCP</w:t>
+      </w:r>
+      <w:r>
+        <w:rPr>
+          <w:rFonts w:ascii="David" w:hAnsi="David" w:eastAsia="David" w:cs="David"/>
+          <w:b w:val="0"/>
+          <w:color w:val="172337"/>
+          <w:sz w:val="26"/>
+          <w:rtl w:val="1"/>
+          <w:szCs w:val="26"/>
+        </w:rPr>
+        <w:t xml:space="preserve"> אינה מוצפנת. שמירת הסיסמה כערך גיבוב במסד אינה מצפינה את ההעברה ברשת; </w:t>
+      </w:r>
+      <w:r>
+        <w:rPr>
+          <w:rFonts w:ascii="Times New Roman" w:hAnsi="Times New Roman" w:eastAsia="Times New Roman" w:cs="Times New Roman"/>
+          <w:b w:val="0"/>
+          <w:color w:val="172337"/>
+          <w:sz w:val="26"/>
+          <w:rtl w:val="0"/>
+          <w:szCs w:val="26"/>
+        </w:rPr>
+        <w:t>Base64</w:t>
+      </w:r>
+      <w:r>
+        <w:rPr>
+          <w:rFonts w:ascii="David" w:hAnsi="David" w:eastAsia="David" w:cs="David"/>
+          <w:b w:val="0"/>
+          <w:color w:val="172337"/>
+          <w:sz w:val="26"/>
+          <w:rtl w:val="1"/>
+          <w:szCs w:val="26"/>
+        </w:rPr>
+        <w:t xml:space="preserve"> בהודעות משמשת לייצוג טקסט.</w:t>
+      </w:r>
+    </w:p>
+    <w:p>
+      <w:pPr>
+        <w:spacing w:after="140" w:line="293" w:lineRule="auto"/>
+        <w:jc w:val="right"/>
+        <w:bidi w:val="1"/>
+      </w:pPr>
+      <w:r>
+        <w:rPr>
+          <w:rFonts w:ascii="David" w:hAnsi="David" w:eastAsia="David" w:cs="David"/>
+          <w:b w:val="0"/>
+          <w:color w:val="172337"/>
+          <w:sz w:val="26"/>
+          <w:rtl w:val="1"/>
+          <w:szCs w:val="26"/>
+        </w:rPr>
+        <w:t>לא קיים מנגנון לשחזור משחק פעיל לאחר ניתוק. כאשר השרת מזהה עזיבה או ניתוק במהלך משחק, הוא מסיים את המשחק לטובת היריב. לאחר התחברות מחדש אפשר לפתוח משחק נוסף.</w:t>
+      </w:r>
+    </w:p>
+    <w:p>
+      <w:pPr>
+        <w:spacing w:after="140" w:line="293" w:lineRule="auto"/>
+        <w:jc w:val="right"/>
+        <w:bidi w:val="1"/>
+      </w:pPr>
+      <w:r>
+        <w:rPr>
+          <w:rFonts w:ascii="David" w:hAnsi="David" w:eastAsia="David" w:cs="David"/>
+          <w:b w:val="0"/>
+          <w:color w:val="172337"/>
+          <w:sz w:val="26"/>
+          <w:rtl w:val="1"/>
+          <w:szCs w:val="26"/>
+        </w:rPr>
+        <w:t xml:space="preserve">משחקי </w:t>
+      </w:r>
+      <w:r>
+        <w:rPr>
+          <w:rFonts w:ascii="Times New Roman" w:hAnsi="Times New Roman" w:eastAsia="Times New Roman" w:cs="Times New Roman"/>
+          <w:b w:val="0"/>
+          <w:color w:val="172337"/>
+          <w:sz w:val="26"/>
+          <w:rtl w:val="0"/>
+          <w:szCs w:val="26"/>
+        </w:rPr>
+        <w:t>BOT</w:t>
+      </w:r>
+      <w:r>
+        <w:rPr>
+          <w:rFonts w:ascii="David" w:hAnsi="David" w:eastAsia="David" w:cs="David"/>
+          <w:b w:val="0"/>
+          <w:color w:val="172337"/>
+          <w:sz w:val="26"/>
+          <w:rtl w:val="1"/>
+          <w:szCs w:val="26"/>
+        </w:rPr>
+        <w:t xml:space="preserve"> מתנהלים אצל הלקוח ותוצאותיהם מדווחות לשרת, ולכן מוצגות בנפרד מתוצאות משחקי הרשת. תוצאות אימון ללא התחברות או לאחר אובדן החיבור אינן נשמרות, ואין העלאה מאוחרת שלהן.</w:t>
+      </w:r>
+    </w:p>
+    <w:p>
+      <w:pPr>
+        <w:spacing w:after="140" w:line="293" w:lineRule="auto"/>
+        <w:jc w:val="right"/>
+        <w:bidi w:val="1"/>
+      </w:pPr>
+      <w:r>
+        <w:rPr>
+          <w:rFonts w:ascii="David" w:hAnsi="David" w:eastAsia="David" w:cs="David"/>
+          <w:b w:val="0"/>
+          <w:color w:val="172337"/>
+          <w:sz w:val="26"/>
+          <w:rtl w:val="1"/>
+          <w:szCs w:val="26"/>
+        </w:rPr>
+        <w:t>חיפוש ה־</w:t>
+      </w:r>
+      <w:r>
+        <w:rPr>
+          <w:rFonts w:ascii="Times New Roman" w:hAnsi="Times New Roman" w:eastAsia="Times New Roman" w:cs="Times New Roman"/>
+          <w:b w:val="0"/>
+          <w:color w:val="172337"/>
+          <w:sz w:val="26"/>
+          <w:rtl w:val="0"/>
+          <w:szCs w:val="26"/>
+        </w:rPr>
+        <w:t>BOT</w:t>
+      </w:r>
+      <w:r>
+        <w:rPr>
+          <w:rFonts w:ascii="David" w:hAnsi="David" w:eastAsia="David" w:cs="David"/>
+          <w:b w:val="0"/>
+          <w:color w:val="172337"/>
+          <w:sz w:val="26"/>
+          <w:rtl w:val="1"/>
+          <w:szCs w:val="26"/>
+        </w:rPr>
+        <w:t xml:space="preserve"> מוגבל לעומק של רמת הקושי ולפונקציית ההערכה. לכן הוא אינו מבטיח בחירה מושלמת בכל מצב. חלון ההיסטוריה מציג את </w:t>
+      </w:r>
+      <w:r>
+        <w:rPr>
+          <w:rFonts w:ascii="Times New Roman" w:hAnsi="Times New Roman" w:eastAsia="Times New Roman" w:cs="Times New Roman"/>
+          <w:b w:val="0"/>
+          <w:color w:val="172337"/>
+          <w:sz w:val="26"/>
+          <w:rtl w:val="0"/>
+          <w:szCs w:val="26"/>
+        </w:rPr>
+        <w:t>100</w:t>
+      </w:r>
+      <w:r>
+        <w:rPr>
+          <w:rFonts w:ascii="David" w:hAnsi="David" w:eastAsia="David" w:cs="David"/>
+          <w:b w:val="0"/>
+          <w:color w:val="172337"/>
+          <w:sz w:val="26"/>
+          <w:rtl w:val="1"/>
+          <w:szCs w:val="26"/>
+        </w:rPr>
+        <w:t xml:space="preserve"> התוצאות האחרונות, בעוד הסטטיסטיקות מחושבות מכל התוצאות.</w:t>
       </w:r>
     </w:p>
     <w:p>
@@ -3138,6 +3378,17 @@
       </w:pPr>
       <w:r>
         <w:rPr>
+          <w:rFonts w:ascii="Times New Roman" w:hAnsi="Times New Roman" w:eastAsia="Times New Roman" w:cs="Times New Roman"/>
+          <w:b w:val="0"/>
+          <w:color w:val="172337"/>
+          <w:sz w:val="26"/>
+          <w:rtl w:val="0"/>
+          <w:szCs w:val="26"/>
+        </w:rPr>
+        <w:t>ServerSocket</w:t>
+      </w:r>
+      <w:r>
+        <w:rPr>
           <w:rFonts w:ascii="David" w:hAnsi="David" w:eastAsia="David" w:cs="David"/>
           <w:b w:val="0"/>
           <w:color w:val="172337"/>
@@ -3145,7 +3396,7 @@
           <w:rtl w:val="1"/>
           <w:szCs w:val="26"/>
         </w:rPr>
-        <w:t xml:space="preserve">כל שחקן מפעיל לקוח </w:t>
+        <w:t xml:space="preserve"> ממתינה לחיבורים בשרת. </w:t>
       </w:r>
       <w:r>
         <w:rPr>
@@ -3156,7 +3407,7 @@
           <w:rtl w:val="0"/>
           <w:szCs w:val="26"/>
         </w:rPr>
-        <w:t>JavaFX</w:t>
+        <w:t>accept</w:t>
       </w:r>
       <w:r>
         <w:rPr>
@@ -3167,7 +3418,7 @@
           <w:rtl w:val="1"/>
           <w:szCs w:val="26"/>
         </w:rPr>
-        <w:t xml:space="preserve"> שמתחבר לשרת באמצעות </w:t>
+        <w:t xml:space="preserve"> מחזירה </w:t>
       </w:r>
       <w:r>
         <w:rPr>
@@ -3178,7 +3429,7 @@
           <w:rtl w:val="0"/>
           <w:szCs w:val="26"/>
         </w:rPr>
-        <w:t>TCP. ServerSocket</w:t>
+        <w:t>Socket</w:t>
       </w:r>
       <w:r>
         <w:rPr>
@@ -3189,7 +3440,7 @@
           <w:rtl w:val="1"/>
           <w:szCs w:val="26"/>
         </w:rPr>
-        <w:t xml:space="preserve"> ממתינה לחיבורים חדשים, ו־</w:t>
+        <w:t xml:space="preserve"> עבור כל לקוח, והשרת מפעיל חוט ביצוע לטיפול בהודעותיו. הלקוח פותח חיבור בעת הרשמה או כניסה, ולאחר אימות החשבון משתמש בו גם לבקשות חדרים, מהלכים ופרופיל. כתובת השרת והפורט מוגדרים בהפעלה; פורט ברירת המחדל הוא </w:t>
       </w:r>
       <w:r>
         <w:rPr>
@@ -3200,18 +3451,7 @@
           <w:rtl w:val="0"/>
           <w:szCs w:val="26"/>
         </w:rPr>
-        <w:t>Socket</w:t>
-      </w:r>
-      <w:r>
-        <w:rPr>
-          <w:rFonts w:ascii="David" w:hAnsi="David" w:eastAsia="David" w:cs="David"/>
-          <w:b w:val="0"/>
-          <w:color w:val="172337"/>
-          <w:sz w:val="26"/>
-          <w:rtl w:val="1"/>
-          <w:szCs w:val="26"/>
-        </w:rPr>
-        <w:t xml:space="preserve"> משמשת לשליחה ולקבלה של הודעות. החיבור נפתח בעת הרשמה או כניסה ונשאר פעיל גם במהלך המשחק ובצפייה בפרופיל. הודעות הרשת מטופלות ברקע כדי שהממשק יוכל להמשיך להגיב לפעולות המשתמש.</w:t>
+        <w:t>5000.</w:t>
       </w:r>
     </w:p>
     <w:p>
@@ -3878,7 +4118,964 @@
           <w:szCs w:val="32"/>
           <w:bCs w:val="1"/>
         </w:rPr>
-        <w:t xml:space="preserve"> מהלך אחד מתחילתו ועד התצוגה</w:t>
+        <w:t xml:space="preserve"> מסגרת ההודעות</w:t>
+      </w:r>
+    </w:p>
+    <w:p>
+      <w:pPr>
+        <w:spacing w:after="140" w:line="293" w:lineRule="auto"/>
+        <w:jc w:val="right"/>
+        <w:bidi w:val="1"/>
+      </w:pPr>
+      <w:r>
+        <w:rPr>
+          <w:rFonts w:ascii="Times New Roman" w:hAnsi="Times New Roman" w:eastAsia="Times New Roman" w:cs="Times New Roman"/>
+          <w:b w:val="0"/>
+          <w:color w:val="172337"/>
+          <w:sz w:val="26"/>
+          <w:rtl w:val="0"/>
+          <w:szCs w:val="26"/>
+        </w:rPr>
+        <w:t>TCP</w:t>
+      </w:r>
+      <w:r>
+        <w:rPr>
+          <w:rFonts w:ascii="David" w:hAnsi="David" w:eastAsia="David" w:cs="David"/>
+          <w:b w:val="0"/>
+          <w:color w:val="172337"/>
+          <w:sz w:val="26"/>
+          <w:rtl w:val="1"/>
+          <w:szCs w:val="26"/>
+        </w:rPr>
+        <w:t xml:space="preserve"> מעבירה זרם מסודר של בתים ואינה מגדירה בעצמה גבולות בין הודעות היישום. בפרויקט כל הודעה היא שורת טקסט בקידוד </w:t>
+      </w:r>
+      <w:r>
+        <w:rPr>
+          <w:rFonts w:ascii="Times New Roman" w:hAnsi="Times New Roman" w:eastAsia="Times New Roman" w:cs="Times New Roman"/>
+          <w:b w:val="0"/>
+          <w:color w:val="172337"/>
+          <w:sz w:val="26"/>
+          <w:rtl w:val="0"/>
+          <w:szCs w:val="26"/>
+        </w:rPr>
+        <w:t>UTF-8. println</w:t>
+      </w:r>
+      <w:r>
+        <w:rPr>
+          <w:rFonts w:ascii="David" w:hAnsi="David" w:eastAsia="David" w:cs="David"/>
+          <w:b w:val="0"/>
+          <w:color w:val="172337"/>
+          <w:sz w:val="26"/>
+          <w:rtl w:val="1"/>
+          <w:szCs w:val="26"/>
+        </w:rPr>
+        <w:t xml:space="preserve"> שולחת שורה, ו־</w:t>
+      </w:r>
+      <w:r>
+        <w:rPr>
+          <w:rFonts w:ascii="Times New Roman" w:hAnsi="Times New Roman" w:eastAsia="Times New Roman" w:cs="Times New Roman"/>
+          <w:b w:val="0"/>
+          <w:color w:val="172337"/>
+          <w:sz w:val="26"/>
+          <w:rtl w:val="0"/>
+          <w:szCs w:val="26"/>
+        </w:rPr>
+        <w:t>BufferedReader.readLine</w:t>
+      </w:r>
+      <w:r>
+        <w:rPr>
+          <w:rFonts w:ascii="David" w:hAnsi="David" w:eastAsia="David" w:cs="David"/>
+          <w:b w:val="0"/>
+          <w:color w:val="172337"/>
+          <w:sz w:val="26"/>
+          <w:rtl w:val="1"/>
+          <w:szCs w:val="26"/>
+        </w:rPr>
+        <w:t xml:space="preserve"> קוראת עד סוף השורה. לכן פקודה יכולה להגיע בכמה חלקים ברשת ועדיין להיקרא כהודעה שלמה. תחילת השורה, כגון </w:t>
+      </w:r>
+      <w:r>
+        <w:rPr>
+          <w:rFonts w:ascii="Times New Roman" w:hAnsi="Times New Roman" w:eastAsia="Times New Roman" w:cs="Times New Roman"/>
+          <w:b w:val="0"/>
+          <w:color w:val="172337"/>
+          <w:sz w:val="26"/>
+          <w:rtl w:val="0"/>
+          <w:szCs w:val="26"/>
+        </w:rPr>
+        <w:t>MOVE</w:t>
+      </w:r>
+      <w:r>
+        <w:rPr>
+          <w:rFonts w:ascii="David" w:hAnsi="David" w:eastAsia="David" w:cs="David"/>
+          <w:b w:val="0"/>
+          <w:color w:val="172337"/>
+          <w:sz w:val="26"/>
+          <w:rtl w:val="1"/>
+          <w:szCs w:val="26"/>
+        </w:rPr>
+        <w:t xml:space="preserve"> או </w:t>
+      </w:r>
+      <w:r>
+        <w:rPr>
+          <w:rFonts w:ascii="Times New Roman" w:hAnsi="Times New Roman" w:eastAsia="Times New Roman" w:cs="Times New Roman"/>
+          <w:b w:val="0"/>
+          <w:color w:val="172337"/>
+          <w:sz w:val="26"/>
+          <w:rtl w:val="0"/>
+          <w:szCs w:val="26"/>
+        </w:rPr>
+        <w:t>PROFILE_REQUEST,</w:t>
+      </w:r>
+      <w:r>
+        <w:rPr>
+          <w:rFonts w:ascii="David" w:hAnsi="David" w:eastAsia="David" w:cs="David"/>
+          <w:b w:val="0"/>
+          <w:color w:val="172337"/>
+          <w:sz w:val="26"/>
+          <w:rtl w:val="1"/>
+          <w:szCs w:val="26"/>
+        </w:rPr>
+        <w:t xml:space="preserve"> קובעת כיצד הבקשה תטופל.</w:t>
+      </w:r>
+    </w:p>
+    <w:p>
+      <w:pPr>
+        <w:spacing w:after="140" w:line="293" w:lineRule="auto" w:before="160"/>
+        <w:jc w:val="right"/>
+        <w:pStyle w:val="Heading2"/>
+        <w:keepNext/>
+        <w:bidi w:val="1"/>
+      </w:pPr>
+      <w:r>
+        <w:rPr>
+          <w:rFonts w:ascii="Times New Roman" w:hAnsi="Times New Roman" w:eastAsia="Times New Roman" w:cs="Times New Roman"/>
+          <w:b/>
+          <w:color w:val="174C73"/>
+          <w:sz w:val="32"/>
+          <w:rtl w:val="0"/>
+          <w:szCs w:val="32"/>
+          <w:bCs w:val="1"/>
+        </w:rPr>
+        <w:t>4.5</w:t>
+      </w:r>
+      <w:r>
+        <w:rPr>
+          <w:rFonts w:ascii="David" w:hAnsi="David" w:eastAsia="David" w:cs="David"/>
+          <w:b/>
+          <w:color w:val="174C73"/>
+          <w:sz w:val="32"/>
+          <w:rtl w:val="1"/>
+          <w:szCs w:val="32"/>
+          <w:bCs w:val="1"/>
+        </w:rPr>
+        <w:t xml:space="preserve"> מעקב אחר מהלך</w:t>
+      </w:r>
+    </w:p>
+    <w:p>
+      <w:pPr>
+        <w:spacing w:after="140" w:line="293" w:lineRule="auto"/>
+        <w:jc w:val="right"/>
+        <w:bidi w:val="1"/>
+      </w:pPr>
+      <w:r>
+        <w:rPr>
+          <w:rFonts w:ascii="David" w:hAnsi="David" w:eastAsia="David" w:cs="David"/>
+          <w:b w:val="0"/>
+          <w:color w:val="172337"/>
+          <w:sz w:val="26"/>
+          <w:rtl w:val="1"/>
+          <w:szCs w:val="26"/>
+        </w:rPr>
+        <w:t xml:space="preserve">לדוגמה, שחקן </w:t>
+      </w:r>
+      <w:r>
+        <w:rPr>
+          <w:rFonts w:ascii="Times New Roman" w:hAnsi="Times New Roman" w:eastAsia="Times New Roman" w:cs="Times New Roman"/>
+          <w:b w:val="0"/>
+          <w:color w:val="172337"/>
+          <w:sz w:val="26"/>
+          <w:rtl w:val="0"/>
+          <w:szCs w:val="26"/>
+        </w:rPr>
+        <w:t>X</w:t>
+      </w:r>
+      <w:r>
+        <w:rPr>
+          <w:rFonts w:ascii="David" w:hAnsi="David" w:eastAsia="David" w:cs="David"/>
+          <w:b w:val="0"/>
+          <w:color w:val="172337"/>
+          <w:sz w:val="26"/>
+          <w:rtl w:val="1"/>
+          <w:szCs w:val="26"/>
+        </w:rPr>
+        <w:t xml:space="preserve"> מבקש לעבור מהמשבצת </w:t>
+      </w:r>
+      <w:r>
+        <w:rPr>
+          <w:rFonts w:ascii="Times New Roman" w:hAnsi="Times New Roman" w:eastAsia="Times New Roman" w:cs="Times New Roman"/>
+          <w:b w:val="0"/>
+          <w:color w:val="172337"/>
+          <w:sz w:val="26"/>
+          <w:rtl w:val="0"/>
+          <w:szCs w:val="26"/>
+        </w:rPr>
+        <w:t>(5,0)</w:t>
+      </w:r>
+      <w:r>
+        <w:rPr>
+          <w:rFonts w:ascii="David" w:hAnsi="David" w:eastAsia="David" w:cs="David"/>
+          <w:b w:val="0"/>
+          <w:color w:val="172337"/>
+          <w:sz w:val="26"/>
+          <w:rtl w:val="1"/>
+          <w:szCs w:val="26"/>
+        </w:rPr>
+        <w:t xml:space="preserve"> למשבצת </w:t>
+      </w:r>
+      <w:r>
+        <w:rPr>
+          <w:rFonts w:ascii="Times New Roman" w:hAnsi="Times New Roman" w:eastAsia="Times New Roman" w:cs="Times New Roman"/>
+          <w:b w:val="0"/>
+          <w:color w:val="172337"/>
+          <w:sz w:val="26"/>
+          <w:rtl w:val="0"/>
+          <w:szCs w:val="26"/>
+        </w:rPr>
+        <w:t>(4,1)</w:t>
+      </w:r>
+      <w:r>
+        <w:rPr>
+          <w:rFonts w:ascii="David" w:hAnsi="David" w:eastAsia="David" w:cs="David"/>
+          <w:b w:val="0"/>
+          <w:color w:val="172337"/>
+          <w:sz w:val="26"/>
+          <w:rtl w:val="1"/>
+          <w:szCs w:val="26"/>
+        </w:rPr>
+        <w:t xml:space="preserve"> ושולח </w:t>
+      </w:r>
+      <w:r>
+        <w:rPr>
+          <w:rFonts w:ascii="Times New Roman" w:hAnsi="Times New Roman" w:eastAsia="Times New Roman" w:cs="Times New Roman"/>
+          <w:b w:val="0"/>
+          <w:color w:val="172337"/>
+          <w:sz w:val="26"/>
+          <w:rtl w:val="0"/>
+          <w:szCs w:val="26"/>
+        </w:rPr>
+        <w:t>MOVE 5 0 4 1.</w:t>
+      </w:r>
+      <w:r>
+        <w:rPr>
+          <w:rFonts w:ascii="David" w:hAnsi="David" w:eastAsia="David" w:cs="David"/>
+          <w:b w:val="0"/>
+          <w:color w:val="172337"/>
+          <w:sz w:val="26"/>
+          <w:rtl w:val="1"/>
+          <w:szCs w:val="26"/>
+        </w:rPr>
+        <w:t xml:space="preserve"> התהליך מתחיל באירוע לחיצה ב־</w:t>
+      </w:r>
+      <w:r>
+        <w:rPr>
+          <w:rFonts w:ascii="Times New Roman" w:hAnsi="Times New Roman" w:eastAsia="Times New Roman" w:cs="Times New Roman"/>
+          <w:b w:val="0"/>
+          <w:color w:val="172337"/>
+          <w:sz w:val="26"/>
+          <w:rtl w:val="0"/>
+          <w:szCs w:val="26"/>
+        </w:rPr>
+        <w:t>DamkaFX,</w:t>
+      </w:r>
+      <w:r>
+        <w:rPr>
+          <w:rFonts w:ascii="David" w:hAnsi="David" w:eastAsia="David" w:cs="David"/>
+          <w:b w:val="0"/>
+          <w:color w:val="172337"/>
+          <w:sz w:val="26"/>
+          <w:rtl w:val="1"/>
+          <w:szCs w:val="26"/>
+        </w:rPr>
+        <w:t xml:space="preserve"> עובר דרך </w:t>
+      </w:r>
+      <w:r>
+        <w:rPr>
+          <w:rFonts w:ascii="Times New Roman" w:hAnsi="Times New Roman" w:eastAsia="Times New Roman" w:cs="Times New Roman"/>
+          <w:b w:val="0"/>
+          <w:color w:val="172337"/>
+          <w:sz w:val="26"/>
+          <w:rtl w:val="0"/>
+          <w:szCs w:val="26"/>
+        </w:rPr>
+        <w:t>RoomConnection</w:t>
+      </w:r>
+      <w:r>
+        <w:rPr>
+          <w:rFonts w:ascii="David" w:hAnsi="David" w:eastAsia="David" w:cs="David"/>
+          <w:b w:val="0"/>
+          <w:color w:val="172337"/>
+          <w:sz w:val="26"/>
+          <w:rtl w:val="1"/>
+          <w:szCs w:val="26"/>
+        </w:rPr>
+        <w:t xml:space="preserve"> אל </w:t>
+      </w:r>
+      <w:r>
+        <w:rPr>
+          <w:rFonts w:ascii="Times New Roman" w:hAnsi="Times New Roman" w:eastAsia="Times New Roman" w:cs="Times New Roman"/>
+          <w:b w:val="0"/>
+          <w:color w:val="172337"/>
+          <w:sz w:val="26"/>
+          <w:rtl w:val="0"/>
+          <w:szCs w:val="26"/>
+        </w:rPr>
+        <w:t>DamkaServer</w:t>
+      </w:r>
+      <w:r>
+        <w:rPr>
+          <w:rFonts w:ascii="David" w:hAnsi="David" w:eastAsia="David" w:cs="David"/>
+          <w:b w:val="0"/>
+          <w:color w:val="172337"/>
+          <w:sz w:val="26"/>
+          <w:rtl w:val="1"/>
+          <w:szCs w:val="26"/>
+        </w:rPr>
+        <w:t xml:space="preserve"> ומגיע לחדר שאליו שייך החיבור. </w:t>
+      </w:r>
+      <w:r>
+        <w:rPr>
+          <w:rFonts w:ascii="Times New Roman" w:hAnsi="Times New Roman" w:eastAsia="Times New Roman" w:cs="Times New Roman"/>
+          <w:b w:val="0"/>
+          <w:color w:val="172337"/>
+          <w:sz w:val="26"/>
+          <w:rtl w:val="0"/>
+          <w:szCs w:val="26"/>
+        </w:rPr>
+        <w:t>Room</w:t>
+      </w:r>
+      <w:r>
+        <w:rPr>
+          <w:rFonts w:ascii="David" w:hAnsi="David" w:eastAsia="David" w:cs="David"/>
+          <w:b w:val="0"/>
+          <w:color w:val="172337"/>
+          <w:sz w:val="26"/>
+          <w:rtl w:val="1"/>
+          <w:szCs w:val="26"/>
+        </w:rPr>
+        <w:t xml:space="preserve"> מזהה את השחקן ובודקת את מצב החדר ואת התור. </w:t>
+      </w:r>
+      <w:r>
+        <w:rPr>
+          <w:rFonts w:ascii="Times New Roman" w:hAnsi="Times New Roman" w:eastAsia="Times New Roman" w:cs="Times New Roman"/>
+          <w:b w:val="0"/>
+          <w:color w:val="172337"/>
+          <w:sz w:val="26"/>
+          <w:rtl w:val="0"/>
+          <w:szCs w:val="26"/>
+        </w:rPr>
+        <w:t>Game.move</w:t>
+      </w:r>
+      <w:r>
+        <w:rPr>
+          <w:rFonts w:ascii="David" w:hAnsi="David" w:eastAsia="David" w:cs="David"/>
+          <w:b w:val="0"/>
+          <w:color w:val="172337"/>
+          <w:sz w:val="26"/>
+          <w:rtl w:val="1"/>
+          <w:szCs w:val="26"/>
+        </w:rPr>
+        <w:t xml:space="preserve"> בודקת את חוקי הדמקה ומעדכנת את המשחק רק כאשר המהלך חוקי.</w:t>
+      </w:r>
+    </w:p>
+    <w:tbl>
+      <w:tblPr>
+        <w:tblW w:type="auto" w:w="0"/>
+        <w:tblLayout w:type="autofit"/>
+        <w:tblLook w:firstColumn="1" w:firstRow="1" w:lastColumn="0" w:lastRow="0" w:noHBand="0" w:noVBand="1" w:val="04A0"/>
+        <w:bidiVisual w:val="1"/>
+        <w:tblBorders>
+          <w:top w:val="single" w:sz="4" w:color="B6D0DF"/>
+          <w:left w:val="single" w:sz="4" w:color="B6D0DF"/>
+          <w:bottom w:val="single" w:sz="4" w:color="B6D0DF"/>
+          <w:right w:val="single" w:sz="4" w:color="B6D0DF"/>
+          <w:insideH w:val="single" w:sz="4" w:color="B6D0DF"/>
+          <w:insideV w:val="single" w:sz="4" w:color="B6D0DF"/>
+        </w:tblBorders>
+      </w:tblPr>
+      <w:tblGrid>
+        <w:gridCol w:w="3453"/>
+        <w:gridCol w:w="6412"/>
+      </w:tblGrid>
+      <w:tr>
+        <w:tc>
+          <w:tcPr>
+            <w:tcW w:type="dxa" w:w="4933"/>
+            <w:shd w:fill="d9e9f4"/>
+          </w:tcPr>
+          <w:p>
+            <w:pPr>
+              <w:spacing w:after="80" w:line="269" w:lineRule="auto"/>
+              <w:jc w:val="right"/>
+              <w:bidi w:val="1"/>
+            </w:pPr>
+            <w:r>
+              <w:rPr>
+                <w:rFonts w:ascii="David" w:hAnsi="David" w:eastAsia="David" w:cs="David"/>
+                <w:b/>
+                <w:color w:val="174C73"/>
+                <w:sz w:val="23"/>
+                <w:rtl w:val="1"/>
+                <w:szCs w:val="23"/>
+                <w:bCs w:val="1"/>
+              </w:rPr>
+              <w:t>שלב</w:t>
+            </w:r>
+          </w:p>
+        </w:tc>
+        <w:tc>
+          <w:tcPr>
+            <w:tcW w:type="dxa" w:w="4933"/>
+            <w:shd w:fill="d9e9f4"/>
+          </w:tcPr>
+          <w:p>
+            <w:pPr>
+              <w:spacing w:after="80" w:line="269" w:lineRule="auto"/>
+              <w:jc w:val="right"/>
+              <w:bidi w:val="1"/>
+            </w:pPr>
+            <w:r>
+              <w:rPr>
+                <w:rFonts w:ascii="David" w:hAnsi="David" w:eastAsia="David" w:cs="David"/>
+                <w:b/>
+                <w:color w:val="174C73"/>
+                <w:sz w:val="23"/>
+                <w:rtl w:val="1"/>
+                <w:szCs w:val="23"/>
+                <w:bCs w:val="1"/>
+              </w:rPr>
+              <w:t>אחריות ותוצאה</w:t>
+            </w:r>
+          </w:p>
+        </w:tc>
+      </w:tr>
+      <w:tr>
+        <w:tc>
+          <w:tcPr>
+            <w:tcW w:type="dxa" w:w="4933"/>
+          </w:tcPr>
+          <w:p>
+            <w:pPr>
+              <w:spacing w:after="80" w:line="269" w:lineRule="auto"/>
+              <w:jc w:val="right"/>
+              <w:bidi w:val="1"/>
+            </w:pPr>
+            <w:r>
+              <w:rPr>
+                <w:rFonts w:ascii="David" w:hAnsi="David" w:eastAsia="David" w:cs="David"/>
+                <w:b w:val="0"/>
+                <w:color w:val="172337"/>
+                <w:sz w:val="23"/>
+                <w:rtl w:val="1"/>
+                <w:szCs w:val="23"/>
+              </w:rPr>
+              <w:t>בחירת מקור ויעד</w:t>
+            </w:r>
+          </w:p>
+        </w:tc>
+        <w:tc>
+          <w:tcPr>
+            <w:tcW w:type="dxa" w:w="4933"/>
+          </w:tcPr>
+          <w:p>
+            <w:pPr>
+              <w:spacing w:after="80" w:line="269" w:lineRule="auto"/>
+              <w:jc w:val="right"/>
+              <w:bidi w:val="1"/>
+            </w:pPr>
+            <w:r>
+              <w:rPr>
+                <w:rFonts w:ascii="Times New Roman" w:hAnsi="Times New Roman" w:eastAsia="Times New Roman" w:cs="Times New Roman"/>
+                <w:b w:val="0"/>
+                <w:color w:val="172337"/>
+                <w:sz w:val="23"/>
+                <w:rtl w:val="0"/>
+                <w:szCs w:val="23"/>
+              </w:rPr>
+              <w:t>DamkaFX</w:t>
+            </w:r>
+            <w:r>
+              <w:rPr>
+                <w:rFonts w:ascii="David" w:hAnsi="David" w:eastAsia="David" w:cs="David"/>
+                <w:b w:val="0"/>
+                <w:color w:val="172337"/>
+                <w:sz w:val="23"/>
+                <w:rtl w:val="1"/>
+                <w:szCs w:val="23"/>
+              </w:rPr>
+              <w:t xml:space="preserve"> שולחת את בקשת המהלך דרך החיבור הקיים.</w:t>
+            </w:r>
+          </w:p>
+        </w:tc>
+      </w:tr>
+      <w:tr>
+        <w:tc>
+          <w:tcPr>
+            <w:tcW w:type="dxa" w:w="4933"/>
+          </w:tcPr>
+          <w:p>
+            <w:pPr>
+              <w:spacing w:after="80" w:line="269" w:lineRule="auto"/>
+              <w:jc w:val="right"/>
+              <w:bidi w:val="1"/>
+            </w:pPr>
+            <w:r>
+              <w:rPr>
+                <w:rFonts w:ascii="David" w:hAnsi="David" w:eastAsia="David" w:cs="David"/>
+                <w:b w:val="0"/>
+                <w:color w:val="172337"/>
+                <w:sz w:val="23"/>
+                <w:rtl w:val="1"/>
+                <w:szCs w:val="23"/>
+              </w:rPr>
+              <w:t>ניתוב הבקשה</w:t>
+            </w:r>
+          </w:p>
+        </w:tc>
+        <w:tc>
+          <w:tcPr>
+            <w:tcW w:type="dxa" w:w="4933"/>
+          </w:tcPr>
+          <w:p>
+            <w:pPr>
+              <w:spacing w:after="80" w:line="269" w:lineRule="auto"/>
+              <w:jc w:val="right"/>
+              <w:bidi w:val="1"/>
+            </w:pPr>
+            <w:r>
+              <w:rPr>
+                <w:rFonts w:ascii="Times New Roman" w:hAnsi="Times New Roman" w:eastAsia="Times New Roman" w:cs="Times New Roman"/>
+                <w:b w:val="0"/>
+                <w:color w:val="172337"/>
+                <w:sz w:val="23"/>
+                <w:rtl w:val="0"/>
+                <w:szCs w:val="23"/>
+              </w:rPr>
+              <w:t>DamkaServer</w:t>
+            </w:r>
+            <w:r>
+              <w:rPr>
+                <w:rFonts w:ascii="David" w:hAnsi="David" w:eastAsia="David" w:cs="David"/>
+                <w:b w:val="0"/>
+                <w:color w:val="172337"/>
+                <w:sz w:val="23"/>
+                <w:rtl w:val="1"/>
+                <w:szCs w:val="23"/>
+              </w:rPr>
+              <w:t xml:space="preserve"> מעבירה אותה ל־</w:t>
+            </w:r>
+            <w:r>
+              <w:rPr>
+                <w:rFonts w:ascii="Times New Roman" w:hAnsi="Times New Roman" w:eastAsia="Times New Roman" w:cs="Times New Roman"/>
+                <w:b w:val="0"/>
+                <w:color w:val="172337"/>
+                <w:sz w:val="23"/>
+                <w:rtl w:val="0"/>
+                <w:szCs w:val="23"/>
+              </w:rPr>
+              <w:t>Room</w:t>
+            </w:r>
+            <w:r>
+              <w:rPr>
+                <w:rFonts w:ascii="David" w:hAnsi="David" w:eastAsia="David" w:cs="David"/>
+                <w:b w:val="0"/>
+                <w:color w:val="172337"/>
+                <w:sz w:val="23"/>
+                <w:rtl w:val="1"/>
+                <w:szCs w:val="23"/>
+              </w:rPr>
+              <w:t xml:space="preserve"> של השחקן.</w:t>
+            </w:r>
+          </w:p>
+        </w:tc>
+      </w:tr>
+      <w:tr>
+        <w:tc>
+          <w:tcPr>
+            <w:tcW w:type="dxa" w:w="4933"/>
+          </w:tcPr>
+          <w:p>
+            <w:pPr>
+              <w:spacing w:after="80" w:line="269" w:lineRule="auto"/>
+              <w:jc w:val="right"/>
+              <w:bidi w:val="1"/>
+            </w:pPr>
+            <w:r>
+              <w:rPr>
+                <w:rFonts w:ascii="David" w:hAnsi="David" w:eastAsia="David" w:cs="David"/>
+                <w:b w:val="0"/>
+                <w:color w:val="172337"/>
+                <w:sz w:val="23"/>
+                <w:rtl w:val="1"/>
+                <w:szCs w:val="23"/>
+              </w:rPr>
+              <w:t>בדיקת המהלך</w:t>
+            </w:r>
+          </w:p>
+        </w:tc>
+        <w:tc>
+          <w:tcPr>
+            <w:tcW w:type="dxa" w:w="4933"/>
+          </w:tcPr>
+          <w:p>
+            <w:pPr>
+              <w:spacing w:after="80" w:line="269" w:lineRule="auto"/>
+              <w:jc w:val="right"/>
+              <w:bidi w:val="1"/>
+            </w:pPr>
+            <w:r>
+              <w:rPr>
+                <w:rFonts w:ascii="Times New Roman" w:hAnsi="Times New Roman" w:eastAsia="Times New Roman" w:cs="Times New Roman"/>
+                <w:b w:val="0"/>
+                <w:color w:val="172337"/>
+                <w:sz w:val="23"/>
+                <w:rtl w:val="0"/>
+                <w:szCs w:val="23"/>
+              </w:rPr>
+              <w:t>Room</w:t>
+            </w:r>
+            <w:r>
+              <w:rPr>
+                <w:rFonts w:ascii="David" w:hAnsi="David" w:eastAsia="David" w:cs="David"/>
+                <w:b w:val="0"/>
+                <w:color w:val="172337"/>
+                <w:sz w:val="23"/>
+                <w:rtl w:val="1"/>
+                <w:szCs w:val="23"/>
+              </w:rPr>
+              <w:t xml:space="preserve"> בודקת את ההקשר ו־</w:t>
+            </w:r>
+            <w:r>
+              <w:rPr>
+                <w:rFonts w:ascii="Times New Roman" w:hAnsi="Times New Roman" w:eastAsia="Times New Roman" w:cs="Times New Roman"/>
+                <w:b w:val="0"/>
+                <w:color w:val="172337"/>
+                <w:sz w:val="23"/>
+                <w:rtl w:val="0"/>
+                <w:szCs w:val="23"/>
+              </w:rPr>
+              <w:t>Game.move</w:t>
+            </w:r>
+            <w:r>
+              <w:rPr>
+                <w:rFonts w:ascii="David" w:hAnsi="David" w:eastAsia="David" w:cs="David"/>
+                <w:b w:val="0"/>
+                <w:color w:val="172337"/>
+                <w:sz w:val="23"/>
+                <w:rtl w:val="1"/>
+                <w:szCs w:val="23"/>
+              </w:rPr>
+              <w:t xml:space="preserve"> בודקת את הכללים.</w:t>
+            </w:r>
+          </w:p>
+        </w:tc>
+      </w:tr>
+      <w:tr>
+        <w:tc>
+          <w:tcPr>
+            <w:tcW w:type="dxa" w:w="4933"/>
+          </w:tcPr>
+          <w:p>
+            <w:pPr>
+              <w:spacing w:after="80" w:line="269" w:lineRule="auto"/>
+              <w:jc w:val="right"/>
+              <w:bidi w:val="1"/>
+            </w:pPr>
+            <w:r>
+              <w:rPr>
+                <w:rFonts w:ascii="David" w:hAnsi="David" w:eastAsia="David" w:cs="David"/>
+                <w:b w:val="0"/>
+                <w:color w:val="172337"/>
+                <w:sz w:val="23"/>
+                <w:rtl w:val="1"/>
+                <w:szCs w:val="23"/>
+              </w:rPr>
+              <w:t>דחיית בקשה</w:t>
+            </w:r>
+          </w:p>
+        </w:tc>
+        <w:tc>
+          <w:tcPr>
+            <w:tcW w:type="dxa" w:w="4933"/>
+          </w:tcPr>
+          <w:p>
+            <w:pPr>
+              <w:spacing w:after="80" w:line="269" w:lineRule="auto"/>
+              <w:jc w:val="right"/>
+              <w:bidi w:val="1"/>
+            </w:pPr>
+            <w:r>
+              <w:rPr>
+                <w:rFonts w:ascii="Times New Roman" w:hAnsi="Times New Roman" w:eastAsia="Times New Roman" w:cs="Times New Roman"/>
+                <w:b w:val="0"/>
+                <w:color w:val="172337"/>
+                <w:sz w:val="23"/>
+                <w:rtl w:val="0"/>
+                <w:szCs w:val="23"/>
+              </w:rPr>
+              <w:t>ERROR</w:t>
+            </w:r>
+            <w:r>
+              <w:rPr>
+                <w:rFonts w:ascii="David" w:hAnsi="David" w:eastAsia="David" w:cs="David"/>
+                <w:b w:val="0"/>
+                <w:color w:val="172337"/>
+                <w:sz w:val="23"/>
+                <w:rtl w:val="1"/>
+                <w:szCs w:val="23"/>
+              </w:rPr>
+              <w:t xml:space="preserve"> נשלחת למבקש; מצב הלוח והתור אינו משתנה.</w:t>
+            </w:r>
+          </w:p>
+        </w:tc>
+      </w:tr>
+      <w:tr>
+        <w:tc>
+          <w:tcPr>
+            <w:tcW w:type="dxa" w:w="4933"/>
+          </w:tcPr>
+          <w:p>
+            <w:pPr>
+              <w:spacing w:after="80" w:line="269" w:lineRule="auto"/>
+              <w:jc w:val="right"/>
+              <w:bidi w:val="1"/>
+            </w:pPr>
+            <w:r>
+              <w:rPr>
+                <w:rFonts w:ascii="David" w:hAnsi="David" w:eastAsia="David" w:cs="David"/>
+                <w:b w:val="0"/>
+                <w:color w:val="172337"/>
+                <w:sz w:val="23"/>
+                <w:rtl w:val="1"/>
+                <w:szCs w:val="23"/>
+              </w:rPr>
+              <w:t>קבלת בקשה</w:t>
+            </w:r>
+          </w:p>
+        </w:tc>
+        <w:tc>
+          <w:tcPr>
+            <w:tcW w:type="dxa" w:w="4933"/>
+          </w:tcPr>
+          <w:p>
+            <w:pPr>
+              <w:spacing w:after="80" w:line="269" w:lineRule="auto"/>
+              <w:jc w:val="right"/>
+              <w:bidi w:val="1"/>
+            </w:pPr>
+            <w:r>
+              <w:rPr>
+                <w:rFonts w:ascii="David" w:hAnsi="David" w:eastAsia="David" w:cs="David"/>
+                <w:b w:val="0"/>
+                <w:color w:val="172337"/>
+                <w:sz w:val="23"/>
+                <w:rtl w:val="1"/>
+                <w:szCs w:val="23"/>
+              </w:rPr>
+              <w:t xml:space="preserve">לשני הלקוחות נשלחות </w:t>
+            </w:r>
+            <w:r>
+              <w:rPr>
+                <w:rFonts w:ascii="Times New Roman" w:hAnsi="Times New Roman" w:eastAsia="Times New Roman" w:cs="Times New Roman"/>
+                <w:b w:val="0"/>
+                <w:color w:val="172337"/>
+                <w:sz w:val="23"/>
+                <w:rtl w:val="0"/>
+                <w:szCs w:val="23"/>
+              </w:rPr>
+              <w:t>MOVE_APPLIED, BOARD</w:t>
+            </w:r>
+            <w:r>
+              <w:rPr>
+                <w:rFonts w:ascii="David" w:hAnsi="David" w:eastAsia="David" w:cs="David"/>
+                <w:b w:val="0"/>
+                <w:color w:val="172337"/>
+                <w:sz w:val="23"/>
+                <w:rtl w:val="1"/>
+                <w:szCs w:val="23"/>
+              </w:rPr>
+              <w:t xml:space="preserve"> ו־</w:t>
+            </w:r>
+            <w:r>
+              <w:rPr>
+                <w:rFonts w:ascii="Times New Roman" w:hAnsi="Times New Roman" w:eastAsia="Times New Roman" w:cs="Times New Roman"/>
+                <w:b w:val="0"/>
+                <w:color w:val="172337"/>
+                <w:sz w:val="23"/>
+                <w:rtl w:val="0"/>
+                <w:szCs w:val="23"/>
+              </w:rPr>
+              <w:t>TURN,</w:t>
+            </w:r>
+            <w:r>
+              <w:rPr>
+                <w:rFonts w:ascii="David" w:hAnsi="David" w:eastAsia="David" w:cs="David"/>
+                <w:b w:val="0"/>
+                <w:color w:val="172337"/>
+                <w:sz w:val="23"/>
+                <w:rtl w:val="1"/>
+                <w:szCs w:val="23"/>
+              </w:rPr>
+              <w:t xml:space="preserve"> בסדר זה.</w:t>
+            </w:r>
+          </w:p>
+        </w:tc>
+      </w:tr>
+      <w:tr>
+        <w:tc>
+          <w:tcPr>
+            <w:tcW w:type="dxa" w:w="4933"/>
+          </w:tcPr>
+          <w:p>
+            <w:pPr>
+              <w:spacing w:after="80" w:line="269" w:lineRule="auto"/>
+              <w:jc w:val="right"/>
+              <w:bidi w:val="1"/>
+            </w:pPr>
+            <w:r>
+              <w:rPr>
+                <w:rFonts w:ascii="David" w:hAnsi="David" w:eastAsia="David" w:cs="David"/>
+                <w:b w:val="0"/>
+                <w:color w:val="172337"/>
+                <w:sz w:val="23"/>
+                <w:rtl w:val="1"/>
+                <w:szCs w:val="23"/>
+              </w:rPr>
+              <w:t>הצגה</w:t>
+            </w:r>
+          </w:p>
+        </w:tc>
+        <w:tc>
+          <w:tcPr>
+            <w:tcW w:type="dxa" w:w="4933"/>
+          </w:tcPr>
+          <w:p>
+            <w:pPr>
+              <w:spacing w:after="80" w:line="269" w:lineRule="auto"/>
+              <w:jc w:val="right"/>
+              <w:bidi w:val="1"/>
+            </w:pPr>
+            <w:r>
+              <w:rPr>
+                <w:rFonts w:ascii="David" w:hAnsi="David" w:eastAsia="David" w:cs="David"/>
+                <w:b w:val="0"/>
+                <w:color w:val="172337"/>
+                <w:sz w:val="23"/>
+                <w:rtl w:val="1"/>
+                <w:szCs w:val="23"/>
+              </w:rPr>
+              <w:t>הלקוח מנפיש את המהלך ואז מציג את תמונת השרת המעודכנת.</w:t>
+            </w:r>
+          </w:p>
+        </w:tc>
+      </w:tr>
+    </w:tbl>
+    <w:p>
+      <w:pPr>
+        <w:spacing w:after="40" w:line="40" w:lineRule="exact"/>
+      </w:pPr>
+    </w:p>
+    <w:p>
+      <w:pPr>
+        <w:spacing w:after="260" w:line="293" w:lineRule="auto" w:before="0"/>
+        <w:jc w:val="right"/>
+        <w:pStyle w:val="Heading1"/>
+        <w:keepNext/>
+        <w:pageBreakBefore/>
+        <w:bidi w:val="1"/>
+        <w:pBdr>
+          <w:bottom w:val="single" w:sz="18" w:color="D9E9F4"/>
+        </w:pBdr>
+      </w:pPr>
+      <w:r>
+        <w:rPr>
+          <w:rFonts w:ascii="Times New Roman" w:hAnsi="Times New Roman" w:eastAsia="Times New Roman" w:cs="Times New Roman"/>
+          <w:b/>
+          <w:color w:val="174C73"/>
+          <w:sz w:val="44"/>
+          <w:rtl w:val="0"/>
+          <w:szCs w:val="44"/>
+          <w:bCs w:val="1"/>
+        </w:rPr>
+        <w:t>4.</w:t>
+      </w:r>
+      <w:r>
+        <w:rPr>
+          <w:rFonts w:ascii="David" w:hAnsi="David" w:eastAsia="David" w:cs="David"/>
+          <w:b/>
+          <w:color w:val="174C73"/>
+          <w:sz w:val="44"/>
+          <w:rtl w:val="1"/>
+          <w:szCs w:val="44"/>
+          <w:bCs w:val="1"/>
+        </w:rPr>
+        <w:t xml:space="preserve"> תקשורת </w:t>
+      </w:r>
+      <w:r>
+        <w:rPr>
+          <w:rFonts w:ascii="Times New Roman" w:hAnsi="Times New Roman" w:eastAsia="Times New Roman" w:cs="Times New Roman"/>
+          <w:b/>
+          <w:color w:val="174C73"/>
+          <w:sz w:val="44"/>
+          <w:rtl w:val="0"/>
+          <w:szCs w:val="44"/>
+          <w:bCs w:val="1"/>
+        </w:rPr>
+        <w:t>TCP</w:t>
+      </w:r>
+      <w:r>
+        <w:rPr>
+          <w:rFonts w:ascii="David" w:hAnsi="David" w:eastAsia="David" w:cs="David"/>
+          <w:b/>
+          <w:color w:val="174C73"/>
+          <w:sz w:val="44"/>
+          <w:rtl w:val="1"/>
+          <w:szCs w:val="44"/>
+          <w:bCs w:val="1"/>
+        </w:rPr>
+        <w:t xml:space="preserve"> וניהול חדרים — המשך</w:t>
+      </w:r>
+    </w:p>
+    <w:p>
+      <w:pPr>
+        <w:spacing w:after="140" w:line="293" w:lineRule="auto" w:before="160"/>
+        <w:jc w:val="right"/>
+        <w:pStyle w:val="Heading2"/>
+        <w:keepNext/>
+        <w:bidi w:val="1"/>
+      </w:pPr>
+      <w:r>
+        <w:rPr>
+          <w:rFonts w:ascii="Times New Roman" w:hAnsi="Times New Roman" w:eastAsia="Times New Roman" w:cs="Times New Roman"/>
+          <w:b/>
+          <w:color w:val="174C73"/>
+          <w:sz w:val="32"/>
+          <w:rtl w:val="0"/>
+          <w:szCs w:val="32"/>
+          <w:bCs w:val="1"/>
+        </w:rPr>
+        <w:t>4.6</w:t>
+      </w:r>
+      <w:r>
+        <w:rPr>
+          <w:rFonts w:ascii="David" w:hAnsi="David" w:eastAsia="David" w:cs="David"/>
+          <w:b/>
+          <w:color w:val="174C73"/>
+          <w:sz w:val="32"/>
+          <w:rtl w:val="1"/>
+          <w:szCs w:val="32"/>
+          <w:bCs w:val="1"/>
+        </w:rPr>
+        <w:t xml:space="preserve"> מסלול המהלך</w:t>
       </w:r>
     </w:p>
     <w:p>
@@ -3890,7 +5087,7 @@
       <w:r>
         <w:drawing>
           <wp:inline xmlns:a="http://schemas.openxmlformats.org/drawingml/2006/main" xmlns:pic="http://schemas.openxmlformats.org/drawingml/2006/picture">
-            <wp:extent cx="6048000" cy="3597440"/>
+            <wp:extent cx="4539227" cy="2699999"/>
             <wp:docPr id="3" name="Picture 3"/>
             <wp:cNvGraphicFramePr>
               <a:graphicFrameLocks noChangeAspect="1"/>
@@ -3911,7 +5108,7 @@
                   <pic:spPr>
                     <a:xfrm>
                       <a:off x="0" y="0"/>
-                      <a:ext cx="6048000" cy="3597440"/>
+                      <a:ext cx="4539227" cy="2699999"/>
                     </a:xfrm>
                     <a:prstGeom prst="rect"/>
                   </pic:spPr>
@@ -3960,68 +5157,6 @@
           <w:szCs w:val="23"/>
         </w:rPr>
         <w:t xml:space="preserve"> — מסלול הבקשה והעדכון לשני הלקוחות.</w:t>
-      </w:r>
-    </w:p>
-    <w:p>
-      <w:pPr>
-        <w:spacing w:after="140" w:line="293" w:lineRule="auto"/>
-        <w:jc w:val="right"/>
-        <w:bidi w:val="1"/>
-      </w:pPr>
-      <w:r>
-        <w:rPr>
-          <w:rFonts w:ascii="David" w:hAnsi="David" w:eastAsia="David" w:cs="David"/>
-          <w:b w:val="0"/>
-          <w:color w:val="172337"/>
-          <w:sz w:val="26"/>
-          <w:rtl w:val="1"/>
-          <w:szCs w:val="26"/>
-        </w:rPr>
-        <w:t xml:space="preserve">המשתמש בוחר כלי ומשבצת יעד. הלקוח שולח בקשת </w:t>
-      </w:r>
-      <w:r>
-        <w:rPr>
-          <w:rFonts w:ascii="Times New Roman" w:hAnsi="Times New Roman" w:eastAsia="Times New Roman" w:cs="Times New Roman"/>
-          <w:b w:val="0"/>
-          <w:color w:val="172337"/>
-          <w:sz w:val="26"/>
-          <w:rtl w:val="0"/>
-          <w:szCs w:val="26"/>
-        </w:rPr>
-        <w:t>MOVE,</w:t>
-      </w:r>
-      <w:r>
-        <w:rPr>
-          <w:rFonts w:ascii="David" w:hAnsi="David" w:eastAsia="David" w:cs="David"/>
-          <w:b w:val="0"/>
-          <w:color w:val="172337"/>
-          <w:sz w:val="26"/>
-          <w:rtl w:val="1"/>
-          <w:szCs w:val="26"/>
-        </w:rPr>
-        <w:t xml:space="preserve"> והשרת בודק את המשתתף, התור וחוקיות המהלך באמצעות </w:t>
-      </w:r>
-      <w:r>
-        <w:rPr>
-          <w:rFonts w:ascii="Times New Roman" w:hAnsi="Times New Roman" w:eastAsia="Times New Roman" w:cs="Times New Roman"/>
-          <w:b w:val="0"/>
-          <w:color w:val="172337"/>
-          <w:sz w:val="26"/>
-          <w:rtl w:val="0"/>
-          <w:szCs w:val="26"/>
-        </w:rPr>
-        <w:t>Game.</w:t>
-      </w:r>
-      <w:r>
-        <w:rPr>
-          <w:rFonts w:ascii="David" w:hAnsi="David" w:eastAsia="David" w:cs="David"/>
-          <w:b w:val="0"/>
-          <w:color w:val="172337"/>
-          <w:sz w:val="26"/>
-          <w:rtl w:val="1"/>
-          <w:szCs w:val="26"/>
-        </w:rPr>
-        <w:t xml:space="preserve"> מהלך מאושר מעדכן את המשחק ונשלח לשני הלקוחות; בקשה לא חוקית משאירה את הלוח כפי שהיה.</w:t>
       </w:r>
     </w:p>
     <w:p>
@@ -4034,18 +5169,6 @@
       </w:pPr>
       <w:r>
         <w:rPr>
-          <w:rFonts w:ascii="Times New Roman" w:hAnsi="Times New Roman" w:eastAsia="Times New Roman" w:cs="Times New Roman"/>
-          <w:b/>
-          <w:color w:val="174C73"/>
-          <w:sz w:val="32"/>
-          <w:rtl w:val="0"/>
-          <w:szCs w:val="32"/>
-          <w:bCs w:val="1"/>
-        </w:rPr>
-        <w:t>4.5</w:t>
-      </w:r>
-      <w:r>
-        <w:rPr>
           <w:rFonts w:ascii="David" w:hAnsi="David" w:eastAsia="David" w:cs="David"/>
           <w:b/>
           <w:color w:val="174C73"/>
@@ -4054,7 +5177,7 @@
           <w:szCs w:val="32"/>
           <w:bCs w:val="1"/>
         </w:rPr>
-        <w:t xml:space="preserve"> תצוגה מסונכרנת</w:t>
+        <w:t>עבודה במקביל ועדכון הממשק</w:t>
       </w:r>
     </w:p>
     <w:p>
@@ -4065,6 +5188,17 @@
       </w:pPr>
       <w:r>
         <w:rPr>
+          <w:rFonts w:ascii="Times New Roman" w:hAnsi="Times New Roman" w:eastAsia="Times New Roman" w:cs="Times New Roman"/>
+          <w:b w:val="0"/>
+          <w:color w:val="172337"/>
+          <w:sz w:val="26"/>
+          <w:rtl w:val="0"/>
+          <w:szCs w:val="26"/>
+        </w:rPr>
+        <w:t>RoomConnection</w:t>
+      </w:r>
+      <w:r>
+        <w:rPr>
           <w:rFonts w:ascii="David" w:hAnsi="David" w:eastAsia="David" w:cs="David"/>
           <w:b w:val="0"/>
           <w:color w:val="172337"/>
@@ -4072,7 +5206,51 @@
           <w:rtl w:val="1"/>
           <w:szCs w:val="26"/>
         </w:rPr>
-        <w:t>שני הלקוחות מקבלים את פרטי המהלך, את הלוח המעודכן ואת התור הבא. תחילה מוצגת אנימציית התנועה, ואחריה תמונת הלוח החדשה. כך שני השחקנים רואים את אותה התקדמות במשחק.</w:t>
+        <w:t xml:space="preserve"> קוראת הודעות בחוט רקע ומשתמשת בעובד כתיבה יחיד כדי לשמור על סדר הפקודות. פעולות הרשת עשויות להמתין, ולכן הן מבוצעות מחוץ לחוט הממשק. </w:t>
+      </w:r>
+      <w:r>
+        <w:rPr>
+          <w:rFonts w:ascii="Times New Roman" w:hAnsi="Times New Roman" w:eastAsia="Times New Roman" w:cs="Times New Roman"/>
+          <w:b w:val="0"/>
+          <w:color w:val="172337"/>
+          <w:sz w:val="26"/>
+          <w:rtl w:val="0"/>
+          <w:szCs w:val="26"/>
+        </w:rPr>
+        <w:t>Platform.runLater</w:t>
+      </w:r>
+      <w:r>
+        <w:rPr>
+          <w:rFonts w:ascii="David" w:hAnsi="David" w:eastAsia="David" w:cs="David"/>
+          <w:b w:val="0"/>
+          <w:color w:val="172337"/>
+          <w:sz w:val="26"/>
+          <w:rtl w:val="1"/>
+          <w:szCs w:val="26"/>
+        </w:rPr>
+        <w:t xml:space="preserve"> מוסיפה את עדכון המסך לתור העבודה של </w:t>
+      </w:r>
+      <w:r>
+        <w:rPr>
+          <w:rFonts w:ascii="Times New Roman" w:hAnsi="Times New Roman" w:eastAsia="Times New Roman" w:cs="Times New Roman"/>
+          <w:b w:val="0"/>
+          <w:color w:val="172337"/>
+          <w:sz w:val="26"/>
+          <w:rtl w:val="0"/>
+          <w:szCs w:val="26"/>
+        </w:rPr>
+        <w:t>JavaFX.</w:t>
+      </w:r>
+      <w:r>
+        <w:rPr>
+          <w:rFonts w:ascii="David" w:hAnsi="David" w:eastAsia="David" w:cs="David"/>
+          <w:b w:val="0"/>
+          <w:color w:val="172337"/>
+          <w:sz w:val="26"/>
+          <w:rtl w:val="1"/>
+          <w:szCs w:val="26"/>
+        </w:rPr>
+        <w:t xml:space="preserve"> פעולות המשחק באותו חדר מסונכרנות, כדי שבדיקת מהלך, שינוי המצב ושליחת התוצאה יבוצעו כסדרה ולא יתערבבו עם מהלך נוסף.</w:t>
       </w:r>
     </w:p>
     <w:p>
@@ -4093,7 +5271,58 @@
           <w:szCs w:val="32"/>
           <w:bCs w:val="1"/>
         </w:rPr>
-        <w:t>4.6</w:t>
+        <w:t>4.7</w:t>
+      </w:r>
+      <w:r>
+        <w:rPr>
+          <w:rFonts w:ascii="David" w:hAnsi="David" w:eastAsia="David" w:cs="David"/>
+          <w:b/>
+          <w:color w:val="174C73"/>
+          <w:sz w:val="32"/>
+          <w:rtl w:val="1"/>
+          <w:szCs w:val="32"/>
+          <w:bCs w:val="1"/>
+        </w:rPr>
+        <w:t xml:space="preserve"> תצוגה מסונכרנת</w:t>
+      </w:r>
+    </w:p>
+    <w:p>
+      <w:pPr>
+        <w:spacing w:after="140" w:line="293" w:lineRule="auto"/>
+        <w:jc w:val="right"/>
+        <w:bidi w:val="1"/>
+      </w:pPr>
+      <w:r>
+        <w:rPr>
+          <w:rFonts w:ascii="David" w:hAnsi="David" w:eastAsia="David" w:cs="David"/>
+          <w:b w:val="0"/>
+          <w:color w:val="172337"/>
+          <w:sz w:val="26"/>
+          <w:rtl w:val="1"/>
+          <w:szCs w:val="26"/>
+        </w:rPr>
+        <w:t>שני הלקוחות מקבלים את פרטי המהלך, את הלוח המעודכן ואת התור הבא. תחילה מוצגת אנימציית התנועה, ואחריה תמונת הלוח החדשה. כך שני השחקנים רואים את אותה התקדמות במשחק.</w:t>
+      </w:r>
+    </w:p>
+    <w:p>
+      <w:pPr>
+        <w:spacing w:after="140" w:line="293" w:lineRule="auto" w:before="160"/>
+        <w:jc w:val="right"/>
+        <w:pStyle w:val="Heading2"/>
+        <w:keepNext/>
+        <w:bidi w:val="1"/>
+      </w:pPr>
+      <w:r>
+        <w:rPr>
+          <w:rFonts w:ascii="Times New Roman" w:hAnsi="Times New Roman" w:eastAsia="Times New Roman" w:cs="Times New Roman"/>
+          <w:b/>
+          <w:color w:val="174C73"/>
+          <w:sz w:val="32"/>
+          <w:rtl w:val="0"/>
+          <w:szCs w:val="32"/>
+          <w:bCs w:val="1"/>
+        </w:rPr>
+        <w:t>4.8</w:t>
       </w:r>
       <w:r>
         <w:rPr>
@@ -4195,7 +5424,7 @@
           <w:szCs w:val="32"/>
           <w:bCs w:val="1"/>
         </w:rPr>
-        <w:t>5.1</w:t>
+        <w:t>Minimax</w:t>
       </w:r>
       <w:r>
         <w:rPr>
@@ -4207,19 +5436,7 @@
           <w:szCs w:val="32"/>
           <w:bCs w:val="1"/>
         </w:rPr>
-        <w:t xml:space="preserve"> בחירת מהלך באמצעות </w:t>
-      </w:r>
-      <w:r>
-        <w:rPr>
-          <w:rFonts w:ascii="Times New Roman" w:hAnsi="Times New Roman" w:eastAsia="Times New Roman" w:cs="Times New Roman"/>
-          <w:b/>
-          <w:color w:val="174C73"/>
-          <w:sz w:val="32"/>
-          <w:rtl w:val="0"/>
-          <w:szCs w:val="32"/>
-          <w:bCs w:val="1"/>
-        </w:rPr>
-        <w:t>Minimax</w:t>
+        <w:t xml:space="preserve"> והעתקת מצב המשחק</w:t>
       </w:r>
     </w:p>
     <w:p>
@@ -4230,6 +5447,17 @@
       </w:pPr>
       <w:r>
         <w:rPr>
+          <w:rFonts w:ascii="David" w:hAnsi="David" w:eastAsia="David" w:cs="David"/>
+          <w:b w:val="0"/>
+          <w:color w:val="172337"/>
+          <w:sz w:val="26"/>
+          <w:rtl w:val="1"/>
+          <w:szCs w:val="26"/>
+        </w:rPr>
+        <w:t>ה־</w:t>
+      </w:r>
+      <w:r>
+        <w:rPr>
           <w:rFonts w:ascii="Times New Roman" w:hAnsi="Times New Roman" w:eastAsia="Times New Roman" w:cs="Times New Roman"/>
           <w:b w:val="0"/>
           <w:color w:val="172337"/>
@@ -4237,6 +5465,28 @@
           <w:rtl w:val="0"/>
           <w:szCs w:val="26"/>
         </w:rPr>
+        <w:t>BOT</w:t>
+      </w:r>
+      <w:r>
+        <w:rPr>
+          <w:rFonts w:ascii="David" w:hAnsi="David" w:eastAsia="David" w:cs="David"/>
+          <w:b w:val="0"/>
+          <w:color w:val="172337"/>
+          <w:sz w:val="26"/>
+          <w:rtl w:val="1"/>
+          <w:szCs w:val="26"/>
+        </w:rPr>
+        <w:t xml:space="preserve"> ממומש במחלקה </w:t>
+      </w:r>
+      <w:r>
+        <w:rPr>
+          <w:rFonts w:ascii="Times New Roman" w:hAnsi="Times New Roman" w:eastAsia="Times New Roman" w:cs="Times New Roman"/>
+          <w:b w:val="0"/>
+          <w:color w:val="172337"/>
+          <w:sz w:val="26"/>
+          <w:rtl w:val="0"/>
+          <w:szCs w:val="26"/>
+        </w:rPr>
         <w:t>BotPlayer</w:t>
       </w:r>
       <w:r>
@@ -4248,7 +5498,7 @@
           <w:rtl w:val="1"/>
           <w:szCs w:val="26"/>
         </w:rPr>
-        <w:t xml:space="preserve"> בוחנת מהלכים חוקיים ואת תגובות היריב בעזרת </w:t>
+        <w:t xml:space="preserve"> באמצעות </w:t>
       </w:r>
       <w:r>
         <w:rPr>
@@ -4259,7 +5509,7 @@
           <w:rtl w:val="0"/>
           <w:szCs w:val="26"/>
         </w:rPr>
-        <w:t>Minimax.</w:t>
+        <w:t>Minimax</w:t>
       </w:r>
       <w:r>
         <w:rPr>
@@ -4270,7 +5520,7 @@
           <w:rtl w:val="1"/>
           <w:szCs w:val="26"/>
         </w:rPr>
-        <w:t xml:space="preserve"> בתור </w:t>
+        <w:t xml:space="preserve"> עם גיזום </w:t>
       </w:r>
       <w:r>
         <w:rPr>
@@ -4281,6 +5531,177 @@
           <w:rtl w:val="0"/>
           <w:szCs w:val="26"/>
         </w:rPr>
+        <w:t>Alpha-Beta.</w:t>
+      </w:r>
+      <w:r>
+        <w:rPr>
+          <w:rFonts w:ascii="David" w:hAnsi="David" w:eastAsia="David" w:cs="David"/>
+          <w:b w:val="0"/>
+          <w:color w:val="172337"/>
+          <w:sz w:val="26"/>
+          <w:rtl w:val="1"/>
+          <w:szCs w:val="26"/>
+        </w:rPr>
+        <w:t xml:space="preserve"> החיפוש בוחן מהלכים אפשריים ותגובות של היריב. המהלכים החוקיים מתקבלים מ־</w:t>
+      </w:r>
+      <w:r>
+        <w:rPr>
+          <w:rFonts w:ascii="Times New Roman" w:hAnsi="Times New Roman" w:eastAsia="Times New Roman" w:cs="Times New Roman"/>
+          <w:b w:val="0"/>
+          <w:color w:val="172337"/>
+          <w:sz w:val="26"/>
+          <w:rtl w:val="0"/>
+          <w:szCs w:val="26"/>
+        </w:rPr>
+        <w:t>Game,</w:t>
+      </w:r>
+      <w:r>
+        <w:rPr>
+          <w:rFonts w:ascii="David" w:hAnsi="David" w:eastAsia="David" w:cs="David"/>
+          <w:b w:val="0"/>
+          <w:color w:val="172337"/>
+          <w:sz w:val="26"/>
+          <w:rtl w:val="1"/>
+          <w:szCs w:val="26"/>
+        </w:rPr>
+        <w:t xml:space="preserve"> ולכל אפשרות נוצר עותק עצמאי באמצעות </w:t>
+      </w:r>
+      <w:r>
+        <w:rPr>
+          <w:rFonts w:ascii="Times New Roman" w:hAnsi="Times New Roman" w:eastAsia="Times New Roman" w:cs="Times New Roman"/>
+          <w:b w:val="0"/>
+          <w:color w:val="172337"/>
+          <w:sz w:val="26"/>
+          <w:rtl w:val="0"/>
+          <w:szCs w:val="26"/>
+        </w:rPr>
+        <w:t>new Game(game).</w:t>
+      </w:r>
+      <w:r>
+        <w:rPr>
+          <w:rFonts w:ascii="David" w:hAnsi="David" w:eastAsia="David" w:cs="David"/>
+          <w:b w:val="0"/>
+          <w:color w:val="172337"/>
+          <w:sz w:val="26"/>
+          <w:rtl w:val="1"/>
+          <w:szCs w:val="26"/>
+        </w:rPr>
+        <w:t xml:space="preserve"> המהלך הנבדק מתבצע על העותק, ולכן החיפוש אינו משנה את המשחק הפעיל.</w:t>
+      </w:r>
+    </w:p>
+    <w:p>
+      <w:pPr>
+        <w:spacing w:after="140" w:line="293" w:lineRule="auto" w:before="160"/>
+        <w:jc w:val="right"/>
+        <w:pStyle w:val="Heading2"/>
+        <w:keepNext/>
+        <w:bidi w:val="1"/>
+      </w:pPr>
+      <w:r>
+        <w:rPr>
+          <w:rFonts w:ascii="David" w:hAnsi="David" w:eastAsia="David" w:cs="David"/>
+          <w:b/>
+          <w:color w:val="174C73"/>
+          <w:sz w:val="32"/>
+          <w:rtl w:val="1"/>
+          <w:szCs w:val="32"/>
+          <w:bCs w:val="1"/>
+        </w:rPr>
+        <w:t>הערכת הלוח ובחירה לפי התור</w:t>
+      </w:r>
+    </w:p>
+    <w:p>
+      <w:pPr>
+        <w:spacing w:after="140" w:line="293" w:lineRule="auto"/>
+        <w:jc w:val="right"/>
+        <w:bidi w:val="1"/>
+      </w:pPr>
+      <w:r>
+        <w:rPr>
+          <w:rFonts w:ascii="David" w:hAnsi="David" w:eastAsia="David" w:cs="David"/>
+          <w:b w:val="0"/>
+          <w:color w:val="172337"/>
+          <w:sz w:val="26"/>
+          <w:rtl w:val="1"/>
+          <w:szCs w:val="26"/>
+        </w:rPr>
+        <w:t>הציון מחושב מנקודת המבט של ה־</w:t>
+      </w:r>
+      <w:r>
+        <w:rPr>
+          <w:rFonts w:ascii="Times New Roman" w:hAnsi="Times New Roman" w:eastAsia="Times New Roman" w:cs="Times New Roman"/>
+          <w:b w:val="0"/>
+          <w:color w:val="172337"/>
+          <w:sz w:val="26"/>
+          <w:rtl w:val="0"/>
+          <w:szCs w:val="26"/>
+        </w:rPr>
+        <w:t>BOT:</w:t>
+      </w:r>
+      <w:r>
+        <w:rPr>
+          <w:rFonts w:ascii="David" w:hAnsi="David" w:eastAsia="David" w:cs="David"/>
+          <w:b w:val="0"/>
+          <w:color w:val="172337"/>
+          <w:sz w:val="26"/>
+          <w:rtl w:val="1"/>
+          <w:szCs w:val="26"/>
+        </w:rPr>
+        <w:t xml:space="preserve"> כלי רגיל שווה </w:t>
+      </w:r>
+      <w:r>
+        <w:rPr>
+          <w:rFonts w:ascii="Times New Roman" w:hAnsi="Times New Roman" w:eastAsia="Times New Roman" w:cs="Times New Roman"/>
+          <w:b w:val="0"/>
+          <w:color w:val="172337"/>
+          <w:sz w:val="26"/>
+          <w:rtl w:val="0"/>
+          <w:szCs w:val="26"/>
+        </w:rPr>
+        <w:t>3</w:t>
+      </w:r>
+      <w:r>
+        <w:rPr>
+          <w:rFonts w:ascii="David" w:hAnsi="David" w:eastAsia="David" w:cs="David"/>
+          <w:b w:val="0"/>
+          <w:color w:val="172337"/>
+          <w:sz w:val="26"/>
+          <w:rtl w:val="1"/>
+          <w:szCs w:val="26"/>
+        </w:rPr>
+        <w:t xml:space="preserve"> נקודות ומלך שווה </w:t>
+      </w:r>
+      <w:r>
+        <w:rPr>
+          <w:rFonts w:ascii="Times New Roman" w:hAnsi="Times New Roman" w:eastAsia="Times New Roman" w:cs="Times New Roman"/>
+          <w:b w:val="0"/>
+          <w:color w:val="172337"/>
+          <w:sz w:val="26"/>
+          <w:rtl w:val="0"/>
+          <w:szCs w:val="26"/>
+        </w:rPr>
+        <w:t>6.</w:t>
+      </w:r>
+      <w:r>
+        <w:rPr>
+          <w:rFonts w:ascii="David" w:hAnsi="David" w:eastAsia="David" w:cs="David"/>
+          <w:b w:val="0"/>
+          <w:color w:val="172337"/>
+          <w:sz w:val="26"/>
+          <w:rtl w:val="1"/>
+          <w:szCs w:val="26"/>
+        </w:rPr>
+        <w:t xml:space="preserve"> ההערכה מבוססת על ערך כלי ה־</w:t>
+      </w:r>
+      <w:r>
+        <w:rPr>
+          <w:rFonts w:ascii="Times New Roman" w:hAnsi="Times New Roman" w:eastAsia="Times New Roman" w:cs="Times New Roman"/>
+          <w:b w:val="0"/>
+          <w:color w:val="172337"/>
+          <w:sz w:val="26"/>
+          <w:rtl w:val="0"/>
+          <w:szCs w:val="26"/>
+        </w:rPr>
         <w:t>BOT</w:t>
       </w:r>
       <w:r>
@@ -4292,7 +5713,7 @@
           <w:rtl w:val="1"/>
           <w:szCs w:val="26"/>
         </w:rPr>
-        <w:t xml:space="preserve"> נבחר הציון הגבוה ביותר, ובתור היריב הציון הנמוך ביותר. הבדיקה נעשית על עותקי </w:t>
+        <w:t xml:space="preserve"> פחות ערך כלי היריב. ניצחון והפסד מקבלים ציונים מכריעים. בתור ה־</w:t>
       </w:r>
       <w:r>
         <w:rPr>
@@ -4303,7 +5724,7 @@
           <w:rtl w:val="0"/>
           <w:szCs w:val="26"/>
         </w:rPr>
-        <w:t>Game,</w:t>
+        <w:t>BOT</w:t>
       </w:r>
       <w:r>
         <w:rPr>
@@ -4314,7 +5735,25 @@
           <w:rtl w:val="1"/>
           <w:szCs w:val="26"/>
         </w:rPr>
-        <w:t xml:space="preserve"> ולכן אינה משנה את הלוח שמוצג. לאחר הבחירה מבוצע המהלך במשחק המקומי.</w:t>
+        <w:t xml:space="preserve"> נבחר הציון הגבוה ביותר; בתור היריב נבחר הנמוך ביותר, מתוך הנחה שהיריב יבחר את התגובה הטובה עבורו.</w:t>
+      </w:r>
+    </w:p>
+    <w:p>
+      <w:pPr>
+        <w:spacing w:after="140" w:line="293" w:lineRule="auto"/>
+        <w:jc w:val="right"/>
+        <w:bidi w:val="1"/>
+      </w:pPr>
+      <w:r>
+        <w:rPr>
+          <w:rFonts w:ascii="David" w:hAnsi="David" w:eastAsia="David" w:cs="David"/>
+          <w:b w:val="0"/>
+          <w:color w:val="172337"/>
+          <w:sz w:val="26"/>
+          <w:rtl w:val="1"/>
+          <w:szCs w:val="26"/>
+        </w:rPr>
+        <w:t>הבחירה בין הגדלת הציון להקטנתו נשענת על התור במצב המשחק הנבדק. באכילה מתמשכת אותו שחקן עשוי לקבל צעד נוסף, ולכן אין להחליף בין הצדדים באופן אוטומטי אחרי כל קפיצה.</w:t>
       </w:r>
     </w:p>
     <w:p>
@@ -4455,24 +5894,73 @@
     </w:p>
     <w:p>
       <w:pPr>
+        <w:spacing w:after="260" w:line="293" w:lineRule="auto" w:before="0"/>
+        <w:jc w:val="right"/>
+        <w:pStyle w:val="Heading1"/>
+        <w:keepNext/>
+        <w:pageBreakBefore/>
+        <w:bidi w:val="1"/>
+        <w:pBdr>
+          <w:bottom w:val="single" w:sz="18" w:color="D9E9F4"/>
+        </w:pBdr>
+      </w:pPr>
+      <w:r>
+        <w:rPr>
+          <w:rFonts w:ascii="Times New Roman" w:hAnsi="Times New Roman" w:eastAsia="Times New Roman" w:cs="Times New Roman"/>
+          <w:b/>
+          <w:color w:val="174C73"/>
+          <w:sz w:val="44"/>
+          <w:rtl w:val="0"/>
+          <w:szCs w:val="44"/>
+          <w:bCs w:val="1"/>
+        </w:rPr>
+        <w:t>5.</w:t>
+      </w:r>
+      <w:r>
+        <w:rPr>
+          <w:rFonts w:ascii="David" w:hAnsi="David" w:eastAsia="David" w:cs="David"/>
+          <w:b/>
+          <w:color w:val="174C73"/>
+          <w:sz w:val="44"/>
+          <w:rtl w:val="1"/>
+          <w:szCs w:val="44"/>
+          <w:bCs w:val="1"/>
+        </w:rPr>
+        <w:t xml:space="preserve"> השחקן הממוחשב — </w:t>
+      </w:r>
+      <w:r>
+        <w:rPr>
+          <w:rFonts w:ascii="Times New Roman" w:hAnsi="Times New Roman" w:eastAsia="Times New Roman" w:cs="Times New Roman"/>
+          <w:b/>
+          <w:color w:val="174C73"/>
+          <w:sz w:val="44"/>
+          <w:rtl w:val="0"/>
+          <w:szCs w:val="44"/>
+          <w:bCs w:val="1"/>
+        </w:rPr>
+        <w:t>BOT</w:t>
+      </w:r>
+      <w:r>
+        <w:rPr>
+          <w:rFonts w:ascii="David" w:hAnsi="David" w:eastAsia="David" w:cs="David"/>
+          <w:b/>
+          <w:color w:val="174C73"/>
+          <w:sz w:val="44"/>
+          <w:rtl w:val="1"/>
+          <w:szCs w:val="44"/>
+          <w:bCs w:val="1"/>
+        </w:rPr>
+        <w:t xml:space="preserve"> — המשך</w:t>
+      </w:r>
+    </w:p>
+    <w:p>
+      <w:pPr>
         <w:spacing w:after="140" w:line="293" w:lineRule="auto" w:before="160"/>
         <w:jc w:val="right"/>
         <w:pStyle w:val="Heading2"/>
         <w:keepNext/>
         <w:bidi w:val="1"/>
       </w:pPr>
-      <w:r>
-        <w:rPr>
-          <w:rFonts w:ascii="Times New Roman" w:hAnsi="Times New Roman" w:eastAsia="Times New Roman" w:cs="Times New Roman"/>
-          <w:b/>
-          <w:color w:val="174C73"/>
-          <w:sz w:val="32"/>
-          <w:rtl w:val="0"/>
-          <w:szCs w:val="32"/>
-          <w:bCs w:val="1"/>
-        </w:rPr>
-        <w:t>5.2</w:t>
-      </w:r>
       <w:r>
         <w:rPr>
           <w:rFonts w:ascii="David" w:hAnsi="David" w:eastAsia="David" w:cs="David"/>
@@ -4483,7 +5971,7 @@
           <w:szCs w:val="32"/>
           <w:bCs w:val="1"/>
         </w:rPr>
-        <w:t xml:space="preserve"> רמות קושי</w:t>
+        <w:t>עומק החיפוש ורמות הקושי</w:t>
       </w:r>
     </w:p>
     <w:tbl>
@@ -4502,9 +5990,9 @@
         </w:tblBorders>
       </w:tblPr>
       <w:tblGrid>
-        <w:gridCol w:w="2565"/>
-        <w:gridCol w:w="1480"/>
-        <w:gridCol w:w="5820"/>
+        <w:gridCol w:w="3255"/>
+        <w:gridCol w:w="1973"/>
+        <w:gridCol w:w="4636"/>
       </w:tblGrid>
       <w:tr>
         <w:tc>
@@ -4578,7 +6066,7 @@
                 <w:szCs w:val="23"/>
                 <w:bCs w:val="1"/>
               </w:rPr>
-              <w:t>השפעה</w:t>
+              <w:t>משמעות</w:t>
             </w:r>
           </w:p>
         </w:tc>
@@ -4649,7 +6137,7 @@
                 <w:rtl w:val="1"/>
                 <w:szCs w:val="23"/>
               </w:rPr>
-              <w:t>בודקת את תוצאת המהלך המועמד.</w:t>
+              <w:t>בחינת צעד אחד קדימה והערכת המצב שהתקבל.</w:t>
             </w:r>
           </w:p>
         </w:tc>
@@ -4720,7 +6208,7 @@
                 <w:rtl w:val="1"/>
                 <w:szCs w:val="23"/>
               </w:rPr>
-              <w:t>בודקת שכבה נוספת של מהלכים.</w:t>
+              <w:t>בחינת שני צעדים בעץ החיפוש.</w:t>
             </w:r>
           </w:p>
         </w:tc>
@@ -4791,7 +6279,7 @@
                 <w:rtl w:val="1"/>
                 <w:szCs w:val="23"/>
               </w:rPr>
-              <w:t>בודקת יותר אפשרויות, עם יותר עבודה.</w:t>
+              <w:t>בחינת שלושה צעדים בעץ החיפוש.</w:t>
             </w:r>
           </w:p>
         </w:tc>
@@ -4817,29 +6305,7 @@
           <w:rtl w:val="1"/>
           <w:szCs w:val="26"/>
         </w:rPr>
-        <w:t>בכל הרמות פועל אותו אלגוריתם. ההבדל הוא מספר שכבות המהלכים שה־</w:t>
-      </w:r>
-      <w:r>
-        <w:rPr>
-          <w:rFonts w:ascii="Times New Roman" w:hAnsi="Times New Roman" w:eastAsia="Times New Roman" w:cs="Times New Roman"/>
-          <w:b w:val="0"/>
-          <w:color w:val="172337"/>
-          <w:sz w:val="26"/>
-          <w:rtl w:val="0"/>
-          <w:szCs w:val="26"/>
-        </w:rPr>
-        <w:t>BOT</w:t>
-      </w:r>
-      <w:r>
-        <w:rPr>
-          <w:rFonts w:ascii="David" w:hAnsi="David" w:eastAsia="David" w:cs="David"/>
-          <w:b w:val="0"/>
-          <w:color w:val="172337"/>
-          <w:sz w:val="26"/>
-          <w:rtl w:val="1"/>
-          <w:szCs w:val="26"/>
-        </w:rPr>
-        <w:t xml:space="preserve"> בוחנת.</w:t>
+        <w:t>העומק נספר לפי צעד או קפיצה בודדת, ולא בהכרח לפי תור מלא. עומק גדול יותר בוחן המשכים נוספים ודורש יותר חישוב. הבחירה מבוססת על המצבים שנבדקו ועל פונקציית ההערכה.</w:t>
       </w:r>
     </w:p>
     <w:p>
@@ -4852,6 +6318,18 @@
       </w:pPr>
       <w:r>
         <w:rPr>
+          <w:rFonts w:ascii="David" w:hAnsi="David" w:eastAsia="David" w:cs="David"/>
+          <w:b/>
+          <w:color w:val="174C73"/>
+          <w:sz w:val="32"/>
+          <w:rtl w:val="1"/>
+          <w:szCs w:val="32"/>
+          <w:bCs w:val="1"/>
+        </w:rPr>
+        <w:t xml:space="preserve">דוגמה מספרית להחלטת </w:t>
+      </w:r>
+      <w:r>
+        <w:rPr>
           <w:rFonts w:ascii="Times New Roman" w:hAnsi="Times New Roman" w:eastAsia="Times New Roman" w:cs="Times New Roman"/>
           <w:b/>
           <w:color w:val="174C73"/>
@@ -4860,8 +6338,391 @@
           <w:szCs w:val="32"/>
           <w:bCs w:val="1"/>
         </w:rPr>
-        <w:t>5.3</w:t>
-      </w:r>
+        <w:t>Minimax</w:t>
+      </w:r>
+    </w:p>
+    <w:tbl>
+      <w:tblPr>
+        <w:tblW w:type="auto" w:w="0"/>
+        <w:tblLayout w:type="autofit"/>
+        <w:tblLook w:firstColumn="1" w:firstRow="1" w:lastColumn="0" w:lastRow="0" w:noHBand="0" w:noVBand="1" w:val="04A0"/>
+        <w:bidiVisual w:val="1"/>
+        <w:tblBorders>
+          <w:top w:val="single" w:sz="4" w:color="B6D0DF"/>
+          <w:left w:val="single" w:sz="4" w:color="B6D0DF"/>
+          <w:bottom w:val="single" w:sz="4" w:color="B6D0DF"/>
+          <w:right w:val="single" w:sz="4" w:color="B6D0DF"/>
+          <w:insideH w:val="single" w:sz="4" w:color="B6D0DF"/>
+          <w:insideV w:val="single" w:sz="4" w:color="B6D0DF"/>
+        </w:tblBorders>
+      </w:tblPr>
+      <w:tblGrid>
+        <w:gridCol w:w="3255"/>
+        <w:gridCol w:w="1973"/>
+        <w:gridCol w:w="4636"/>
+      </w:tblGrid>
+      <w:tr>
+        <w:tc>
+          <w:tcPr>
+            <w:tcW w:type="dxa" w:w="3289"/>
+            <w:shd w:fill="d9e9f4"/>
+          </w:tcPr>
+          <w:p>
+            <w:pPr>
+              <w:spacing w:after="80" w:line="269" w:lineRule="auto"/>
+              <w:jc w:val="right"/>
+              <w:bidi w:val="1"/>
+            </w:pPr>
+            <w:r>
+              <w:rPr>
+                <w:rFonts w:ascii="David" w:hAnsi="David" w:eastAsia="David" w:cs="David"/>
+                <w:b/>
+                <w:color w:val="174C73"/>
+                <w:sz w:val="23"/>
+                <w:rtl w:val="1"/>
+                <w:szCs w:val="23"/>
+                <w:bCs w:val="1"/>
+              </w:rPr>
+              <w:t>אפשרות של ה־</w:t>
+            </w:r>
+            <w:r>
+              <w:rPr>
+                <w:rFonts w:ascii="Times New Roman" w:hAnsi="Times New Roman" w:eastAsia="Times New Roman" w:cs="Times New Roman"/>
+                <w:b/>
+                <w:color w:val="174C73"/>
+                <w:sz w:val="23"/>
+                <w:rtl w:val="0"/>
+                <w:szCs w:val="23"/>
+                <w:bCs w:val="1"/>
+              </w:rPr>
+              <w:t>BOT</w:t>
+            </w:r>
+          </w:p>
+        </w:tc>
+        <w:tc>
+          <w:tcPr>
+            <w:tcW w:type="dxa" w:w="3289"/>
+            <w:shd w:fill="d9e9f4"/>
+          </w:tcPr>
+          <w:p>
+            <w:pPr>
+              <w:spacing w:after="80" w:line="269" w:lineRule="auto"/>
+              <w:jc w:val="right"/>
+              <w:bidi w:val="1"/>
+            </w:pPr>
+            <w:r>
+              <w:rPr>
+                <w:rFonts w:ascii="David" w:hAnsi="David" w:eastAsia="David" w:cs="David"/>
+                <w:b/>
+                <w:color w:val="174C73"/>
+                <w:sz w:val="23"/>
+                <w:rtl w:val="1"/>
+                <w:szCs w:val="23"/>
+                <w:bCs w:val="1"/>
+              </w:rPr>
+              <w:t>ציוני תגובות היריב</w:t>
+            </w:r>
+          </w:p>
+        </w:tc>
+        <w:tc>
+          <w:tcPr>
+            <w:tcW w:type="dxa" w:w="3289"/>
+            <w:shd w:fill="d9e9f4"/>
+          </w:tcPr>
+          <w:p>
+            <w:pPr>
+              <w:spacing w:after="80" w:line="269" w:lineRule="auto"/>
+              <w:jc w:val="right"/>
+              <w:bidi w:val="1"/>
+            </w:pPr>
+            <w:r>
+              <w:rPr>
+                <w:rFonts w:ascii="David" w:hAnsi="David" w:eastAsia="David" w:cs="David"/>
+                <w:b/>
+                <w:color w:val="174C73"/>
+                <w:sz w:val="23"/>
+                <w:rtl w:val="1"/>
+                <w:szCs w:val="23"/>
+                <w:bCs w:val="1"/>
+              </w:rPr>
+              <w:t>הציון שהיריב יכפה</w:t>
+            </w:r>
+          </w:p>
+        </w:tc>
+      </w:tr>
+      <w:tr>
+        <w:tc>
+          <w:tcPr>
+            <w:tcW w:type="dxa" w:w="3289"/>
+          </w:tcPr>
+          <w:p>
+            <w:pPr>
+              <w:spacing w:after="80" w:line="269" w:lineRule="auto"/>
+              <w:jc w:val="right"/>
+              <w:bidi w:val="1"/>
+            </w:pPr>
+            <w:r>
+              <w:rPr>
+                <w:rFonts w:ascii="David" w:hAnsi="David" w:eastAsia="David" w:cs="David"/>
+                <w:b w:val="0"/>
+                <w:color w:val="172337"/>
+                <w:sz w:val="23"/>
+                <w:rtl w:val="1"/>
+                <w:szCs w:val="23"/>
+              </w:rPr>
+              <w:t>א׳</w:t>
+            </w:r>
+          </w:p>
+        </w:tc>
+        <w:tc>
+          <w:tcPr>
+            <w:tcW w:type="dxa" w:w="3289"/>
+          </w:tcPr>
+          <w:p>
+            <w:pPr>
+              <w:spacing w:after="80" w:line="269" w:lineRule="auto"/>
+              <w:jc w:val="right"/>
+              <w:bidi w:val="1"/>
+            </w:pPr>
+            <w:r>
+              <w:rPr>
+                <w:rFonts w:ascii="Times New Roman" w:hAnsi="Times New Roman" w:eastAsia="Times New Roman" w:cs="Times New Roman"/>
+                <w:b w:val="0"/>
+                <w:color w:val="172337"/>
+                <w:sz w:val="23"/>
+                <w:rtl w:val="0"/>
+                <w:szCs w:val="23"/>
+              </w:rPr>
+              <w:t>3,</w:t>
+            </w:r>
+            <w:r>
+              <w:rPr>
+                <w:rFonts w:ascii="David" w:hAnsi="David" w:eastAsia="David" w:cs="David"/>
+                <w:b w:val="0"/>
+                <w:color w:val="172337"/>
+                <w:sz w:val="23"/>
+                <w:rtl w:val="1"/>
+                <w:szCs w:val="23"/>
+              </w:rPr>
+              <w:t xml:space="preserve"> −</w:t>
+            </w:r>
+            <w:r>
+              <w:rPr>
+                <w:rFonts w:ascii="Times New Roman" w:hAnsi="Times New Roman" w:eastAsia="Times New Roman" w:cs="Times New Roman"/>
+                <w:b w:val="0"/>
+                <w:color w:val="172337"/>
+                <w:sz w:val="23"/>
+                <w:rtl w:val="0"/>
+                <w:szCs w:val="23"/>
+              </w:rPr>
+              <w:t>3</w:t>
+            </w:r>
+          </w:p>
+        </w:tc>
+        <w:tc>
+          <w:tcPr>
+            <w:tcW w:type="dxa" w:w="3289"/>
+          </w:tcPr>
+          <w:p>
+            <w:pPr>
+              <w:spacing w:after="80" w:line="269" w:lineRule="auto"/>
+              <w:jc w:val="right"/>
+              <w:bidi w:val="1"/>
+            </w:pPr>
+            <w:r>
+              <w:rPr>
+                <w:rFonts w:ascii="David" w:hAnsi="David" w:eastAsia="David" w:cs="David"/>
+                <w:b w:val="0"/>
+                <w:color w:val="172337"/>
+                <w:sz w:val="23"/>
+                <w:rtl w:val="1"/>
+                <w:szCs w:val="23"/>
+              </w:rPr>
+              <w:t>−</w:t>
+            </w:r>
+            <w:r>
+              <w:rPr>
+                <w:rFonts w:ascii="Times New Roman" w:hAnsi="Times New Roman" w:eastAsia="Times New Roman" w:cs="Times New Roman"/>
+                <w:b w:val="0"/>
+                <w:color w:val="172337"/>
+                <w:sz w:val="23"/>
+                <w:rtl w:val="0"/>
+                <w:szCs w:val="23"/>
+              </w:rPr>
+              <w:t>3</w:t>
+            </w:r>
+          </w:p>
+        </w:tc>
+      </w:tr>
+      <w:tr>
+        <w:tc>
+          <w:tcPr>
+            <w:tcW w:type="dxa" w:w="3289"/>
+          </w:tcPr>
+          <w:p>
+            <w:pPr>
+              <w:spacing w:after="80" w:line="269" w:lineRule="auto"/>
+              <w:jc w:val="right"/>
+              <w:bidi w:val="1"/>
+            </w:pPr>
+            <w:r>
+              <w:rPr>
+                <w:rFonts w:ascii="David" w:hAnsi="David" w:eastAsia="David" w:cs="David"/>
+                <w:b w:val="0"/>
+                <w:color w:val="172337"/>
+                <w:sz w:val="23"/>
+                <w:rtl w:val="1"/>
+                <w:szCs w:val="23"/>
+              </w:rPr>
+              <w:t>ב׳</w:t>
+            </w:r>
+          </w:p>
+        </w:tc>
+        <w:tc>
+          <w:tcPr>
+            <w:tcW w:type="dxa" w:w="3289"/>
+          </w:tcPr>
+          <w:p>
+            <w:pPr>
+              <w:spacing w:after="80" w:line="269" w:lineRule="auto"/>
+              <w:jc w:val="right"/>
+              <w:bidi w:val="1"/>
+            </w:pPr>
+            <w:r>
+              <w:rPr>
+                <w:rFonts w:ascii="Times New Roman" w:hAnsi="Times New Roman" w:eastAsia="Times New Roman" w:cs="Times New Roman"/>
+                <w:b w:val="0"/>
+                <w:color w:val="172337"/>
+                <w:sz w:val="23"/>
+                <w:rtl w:val="0"/>
+                <w:szCs w:val="23"/>
+              </w:rPr>
+              <w:t>0, 3</w:t>
+            </w:r>
+          </w:p>
+        </w:tc>
+        <w:tc>
+          <w:tcPr>
+            <w:tcW w:type="dxa" w:w="3289"/>
+          </w:tcPr>
+          <w:p>
+            <w:pPr>
+              <w:spacing w:after="80" w:line="269" w:lineRule="auto"/>
+              <w:jc w:val="right"/>
+              <w:bidi w:val="1"/>
+            </w:pPr>
+            <w:r>
+              <w:rPr>
+                <w:rFonts w:ascii="Times New Roman" w:hAnsi="Times New Roman" w:eastAsia="Times New Roman" w:cs="Times New Roman"/>
+                <w:b w:val="0"/>
+                <w:color w:val="172337"/>
+                <w:sz w:val="23"/>
+                <w:rtl w:val="0"/>
+                <w:szCs w:val="23"/>
+              </w:rPr>
+              <w:t>0</w:t>
+            </w:r>
+          </w:p>
+        </w:tc>
+      </w:tr>
+    </w:tbl>
+    <w:p>
+      <w:pPr>
+        <w:spacing w:after="40" w:line="40" w:lineRule="exact"/>
+      </w:pPr>
+    </w:p>
+    <w:p>
+      <w:pPr>
+        <w:spacing w:after="140" w:line="293" w:lineRule="auto"/>
+        <w:jc w:val="right"/>
+        <w:bidi w:val="1"/>
+      </w:pPr>
+      <w:r>
+        <w:rPr>
+          <w:rFonts w:ascii="David" w:hAnsi="David" w:eastAsia="David" w:cs="David"/>
+          <w:b w:val="0"/>
+          <w:color w:val="172337"/>
+          <w:sz w:val="26"/>
+          <w:rtl w:val="1"/>
+          <w:szCs w:val="26"/>
+        </w:rPr>
+        <w:t>בדוגמה זו התור עובר ליריב לאחר בחירת האפשרות. היריב יבחר את הציון הנמוך בכל ענף, ולכן ה־</w:t>
+      </w:r>
+      <w:r>
+        <w:rPr>
+          <w:rFonts w:ascii="Times New Roman" w:hAnsi="Times New Roman" w:eastAsia="Times New Roman" w:cs="Times New Roman"/>
+          <w:b w:val="0"/>
+          <w:color w:val="172337"/>
+          <w:sz w:val="26"/>
+          <w:rtl w:val="0"/>
+          <w:szCs w:val="26"/>
+        </w:rPr>
+        <w:t>BOT</w:t>
+      </w:r>
+      <w:r>
+        <w:rPr>
+          <w:rFonts w:ascii="David" w:hAnsi="David" w:eastAsia="David" w:cs="David"/>
+          <w:b w:val="0"/>
+          <w:color w:val="172337"/>
+          <w:sz w:val="26"/>
+          <w:rtl w:val="1"/>
+          <w:szCs w:val="26"/>
+        </w:rPr>
+        <w:t xml:space="preserve"> יעדיף את ב׳: הציון </w:t>
+      </w:r>
+      <w:r>
+        <w:rPr>
+          <w:rFonts w:ascii="Times New Roman" w:hAnsi="Times New Roman" w:eastAsia="Times New Roman" w:cs="Times New Roman"/>
+          <w:b w:val="0"/>
+          <w:color w:val="172337"/>
+          <w:sz w:val="26"/>
+          <w:rtl w:val="0"/>
+          <w:szCs w:val="26"/>
+        </w:rPr>
+        <w:t>0</w:t>
+      </w:r>
+      <w:r>
+        <w:rPr>
+          <w:rFonts w:ascii="David" w:hAnsi="David" w:eastAsia="David" w:cs="David"/>
+          <w:b w:val="0"/>
+          <w:color w:val="172337"/>
+          <w:sz w:val="26"/>
+          <w:rtl w:val="1"/>
+          <w:szCs w:val="26"/>
+        </w:rPr>
+        <w:t xml:space="preserve"> גבוה מ־−</w:t>
+      </w:r>
+      <w:r>
+        <w:rPr>
+          <w:rFonts w:ascii="Times New Roman" w:hAnsi="Times New Roman" w:eastAsia="Times New Roman" w:cs="Times New Roman"/>
+          <w:b w:val="0"/>
+          <w:color w:val="172337"/>
+          <w:sz w:val="26"/>
+          <w:rtl w:val="0"/>
+          <w:szCs w:val="26"/>
+        </w:rPr>
+        <w:t>3.</w:t>
+      </w:r>
+      <w:r>
+        <w:rPr>
+          <w:rFonts w:ascii="David" w:hAnsi="David" w:eastAsia="David" w:cs="David"/>
+          <w:b w:val="0"/>
+          <w:color w:val="172337"/>
+          <w:sz w:val="26"/>
+          <w:rtl w:val="1"/>
+          <w:szCs w:val="26"/>
+        </w:rPr>
+        <w:t xml:space="preserve"> הדוגמה המספרית ממחישה כיצד תגובת היריב משפיעה על הבחירה.</w:t>
+      </w:r>
+    </w:p>
+    <w:p>
+      <w:pPr>
+        <w:spacing w:after="140" w:line="293" w:lineRule="auto" w:before="160"/>
+        <w:jc w:val="right"/>
+        <w:pStyle w:val="Heading2"/>
+        <w:keepNext/>
+        <w:bidi w:val="1"/>
+      </w:pPr>
       <w:r>
         <w:rPr>
           <w:rFonts w:ascii="David" w:hAnsi="David" w:eastAsia="David" w:cs="David"/>
@@ -4872,7 +6733,19 @@
           <w:szCs w:val="32"/>
           <w:bCs w:val="1"/>
         </w:rPr>
-        <w:t xml:space="preserve"> הערכת מצב הלוח</w:t>
+        <w:t xml:space="preserve">גיזום </w:t>
+      </w:r>
+      <w:r>
+        <w:rPr>
+          <w:rFonts w:ascii="Times New Roman" w:hAnsi="Times New Roman" w:eastAsia="Times New Roman" w:cs="Times New Roman"/>
+          <w:b/>
+          <w:color w:val="174C73"/>
+          <w:sz w:val="32"/>
+          <w:rtl w:val="0"/>
+          <w:szCs w:val="32"/>
+          <w:bCs w:val="1"/>
+        </w:rPr>
+        <w:t>Alpha-Beta</w:t>
       </w:r>
     </w:p>
     <w:p>
@@ -4883,6 +6756,17 @@
       </w:pPr>
       <w:r>
         <w:rPr>
+          <w:rFonts w:ascii="Times New Roman" w:hAnsi="Times New Roman" w:eastAsia="Times New Roman" w:cs="Times New Roman"/>
+          <w:b w:val="0"/>
+          <w:color w:val="172337"/>
+          <w:sz w:val="26"/>
+          <w:rtl w:val="0"/>
+          <w:szCs w:val="26"/>
+        </w:rPr>
+        <w:t>Alpha-Beta</w:t>
+      </w:r>
+      <w:r>
+        <w:rPr>
           <w:rFonts w:ascii="David" w:hAnsi="David" w:eastAsia="David" w:cs="David"/>
           <w:b w:val="0"/>
           <w:color w:val="172337"/>
@@ -4890,7 +6774,7 @@
           <w:rtl w:val="1"/>
           <w:szCs w:val="26"/>
         </w:rPr>
-        <w:t xml:space="preserve">כלי רגיל מקבל </w:t>
+        <w:t xml:space="preserve"> שומרת גבולות לציונים שכבר נמצאו בחיפוש. כאשר המשך של ענף אינו יכול לשפר את הבחירה, החיפוש בענף נעצר. לדוגמה, אם כבר נמצא ענף שמבטיח ציון </w:t>
       </w:r>
       <w:r>
         <w:rPr>
@@ -4901,7 +6785,7 @@
           <w:rtl w:val="0"/>
           <w:szCs w:val="26"/>
         </w:rPr>
-        <w:t>3</w:t>
+        <w:t>0</w:t>
       </w:r>
       <w:r>
         <w:rPr>
@@ -4912,7 +6796,7 @@
           <w:rtl w:val="1"/>
           <w:szCs w:val="26"/>
         </w:rPr>
-        <w:t xml:space="preserve"> נקודות ומלך </w:t>
+        <w:t xml:space="preserve"> וענף אחר מאפשר ליריב לכפות −</w:t>
       </w:r>
       <w:r>
         <w:rPr>
@@ -4923,7 +6807,7 @@
           <w:rtl w:val="0"/>
           <w:szCs w:val="26"/>
         </w:rPr>
-        <w:t>6,</w:t>
+        <w:t>3,</w:t>
       </w:r>
       <w:r>
         <w:rPr>
@@ -4934,7 +6818,7 @@
           <w:rtl w:val="1"/>
           <w:szCs w:val="26"/>
         </w:rPr>
-        <w:t xml:space="preserve"> משום שמלך יכול לנוע ולאכול לשני הכיוונים. ההערכה משווה את הכלים של </w:t>
+        <w:t xml:space="preserve"> אין צורך לבדוק את יתר תגובותיו כדי להעדיף את הענף הראשון. הגיזום מצמצם את מספר המצבים שנבדקים ושומר על ערך החלטת </w:t>
       </w:r>
       <w:r>
         <w:rPr>
@@ -4945,7 +6829,7 @@
           <w:rtl w:val="0"/>
           <w:szCs w:val="26"/>
         </w:rPr>
-        <w:t>BOT</w:t>
+        <w:t>Minimax</w:t>
       </w:r>
       <w:r>
         <w:rPr>
@@ -4956,95 +6840,7 @@
           <w:rtl w:val="1"/>
           <w:szCs w:val="26"/>
         </w:rPr>
-        <w:t xml:space="preserve"> לכלי היריב. האדם משחק </w:t>
-      </w:r>
-      <w:r>
-        <w:rPr>
-          <w:rFonts w:ascii="Times New Roman" w:hAnsi="Times New Roman" w:eastAsia="Times New Roman" w:cs="Times New Roman"/>
-          <w:b w:val="0"/>
-          <w:color w:val="172337"/>
-          <w:sz w:val="26"/>
-          <w:rtl w:val="0"/>
-          <w:szCs w:val="26"/>
-        </w:rPr>
-        <w:t>X</w:t>
-      </w:r>
-      <w:r>
-        <w:rPr>
-          <w:rFonts w:ascii="David" w:hAnsi="David" w:eastAsia="David" w:cs="David"/>
-          <w:b w:val="0"/>
-          <w:color w:val="172337"/>
-          <w:sz w:val="26"/>
-          <w:rtl w:val="1"/>
-          <w:szCs w:val="26"/>
-        </w:rPr>
-        <w:t xml:space="preserve"> וה־</w:t>
-      </w:r>
-      <w:r>
-        <w:rPr>
-          <w:rFonts w:ascii="Times New Roman" w:hAnsi="Times New Roman" w:eastAsia="Times New Roman" w:cs="Times New Roman"/>
-          <w:b w:val="0"/>
-          <w:color w:val="172337"/>
-          <w:sz w:val="26"/>
-          <w:rtl w:val="0"/>
-          <w:szCs w:val="26"/>
-        </w:rPr>
-        <w:t>BOT</w:t>
-      </w:r>
-      <w:r>
-        <w:rPr>
-          <w:rFonts w:ascii="David" w:hAnsi="David" w:eastAsia="David" w:cs="David"/>
-          <w:b w:val="0"/>
-          <w:color w:val="172337"/>
-          <w:sz w:val="26"/>
-          <w:rtl w:val="1"/>
-          <w:szCs w:val="26"/>
-        </w:rPr>
-        <w:t xml:space="preserve"> משחק </w:t>
-      </w:r>
-      <w:r>
-        <w:rPr>
-          <w:rFonts w:ascii="Times New Roman" w:hAnsi="Times New Roman" w:eastAsia="Times New Roman" w:cs="Times New Roman"/>
-          <w:b w:val="0"/>
-          <w:color w:val="172337"/>
-          <w:sz w:val="26"/>
-          <w:rtl w:val="0"/>
-          <w:szCs w:val="26"/>
-        </w:rPr>
-        <w:t>O;</w:t>
-      </w:r>
-      <w:r>
-        <w:rPr>
-          <w:rFonts w:ascii="David" w:hAnsi="David" w:eastAsia="David" w:cs="David"/>
-          <w:b w:val="0"/>
-          <w:color w:val="172337"/>
-          <w:sz w:val="26"/>
-          <w:rtl w:val="1"/>
-          <w:szCs w:val="26"/>
-        </w:rPr>
-        <w:t xml:space="preserve"> שני הצדדים מבצעים מהלכים לפי אותם כללי </w:t>
-      </w:r>
-      <w:r>
-        <w:rPr>
-          <w:rFonts w:ascii="Times New Roman" w:hAnsi="Times New Roman" w:eastAsia="Times New Roman" w:cs="Times New Roman"/>
-          <w:b w:val="0"/>
-          <w:color w:val="172337"/>
-          <w:sz w:val="26"/>
-          <w:rtl w:val="0"/>
-          <w:szCs w:val="26"/>
-        </w:rPr>
-        <w:t>Game,</w:t>
-      </w:r>
-      <w:r>
-        <w:rPr>
-          <w:rFonts w:ascii="David" w:hAnsi="David" w:eastAsia="David" w:cs="David"/>
-          <w:b w:val="0"/>
-          <w:color w:val="172337"/>
-          <w:sz w:val="26"/>
-          <w:rtl w:val="1"/>
-          <w:szCs w:val="26"/>
-        </w:rPr>
-        <w:t xml:space="preserve"> כולל המשך אכילה עם אותו כלי.</w:t>
+        <w:t xml:space="preserve"> בעומק הנתון.</w:t>
       </w:r>
     </w:p>
     <w:p>
@@ -7864,18 +9660,6 @@
       </w:pPr>
       <w:r>
         <w:rPr>
-          <w:rFonts w:ascii="Times New Roman" w:hAnsi="Times New Roman" w:eastAsia="Times New Roman" w:cs="Times New Roman"/>
-          <w:b/>
-          <w:color w:val="174C73"/>
-          <w:sz w:val="32"/>
-          <w:rtl w:val="0"/>
-          <w:szCs w:val="32"/>
-          <w:bCs w:val="1"/>
-        </w:rPr>
-        <w:t>8.1</w:t>
-      </w:r>
-      <w:r>
-        <w:rPr>
           <w:rFonts w:ascii="David" w:hAnsi="David" w:eastAsia="David" w:cs="David"/>
           <w:b/>
           <w:color w:val="174C73"/>
@@ -7884,7 +9668,7 @@
           <w:szCs w:val="32"/>
           <w:bCs w:val="1"/>
         </w:rPr>
-        <w:t xml:space="preserve"> בדיקות אוטומטיות</w:t>
+        <w:t>תחומי הבדיקה</w:t>
       </w:r>
     </w:p>
     <w:p>
@@ -7902,7 +9686,7 @@
           <w:rtl w:val="1"/>
           <w:szCs w:val="26"/>
         </w:rPr>
-        <w:t>הבדיקות האוטומטיות משתמשות ב־</w:t>
+        <w:t xml:space="preserve">בדיקות </w:t>
       </w:r>
       <w:r>
         <w:rPr>
@@ -7924,7 +9708,7 @@
           <w:rtl w:val="1"/>
           <w:szCs w:val="26"/>
         </w:rPr>
-        <w:t xml:space="preserve"> ומכסות את כללי המשחק, תקשורת </w:t>
+        <w:t xml:space="preserve"> בוחנות את מנוע המשחק, את התקשורת ואת שמירת הנתונים. בדיקות </w:t>
       </w:r>
       <w:r>
         <w:rPr>
@@ -7935,7 +9719,7 @@
           <w:rtl w:val="0"/>
           <w:szCs w:val="26"/>
         </w:rPr>
-        <w:t>TCP,</w:t>
+        <w:t>Game</w:t>
       </w:r>
       <w:r>
         <w:rPr>
@@ -7946,7 +9730,73 @@
           <w:rtl w:val="1"/>
           <w:szCs w:val="26"/>
         </w:rPr>
-        <w:t xml:space="preserve"> החשבונות ושמירת הנתונים. הטבלה מרכזת את תחומי הבדיקה:</w:t>
+        <w:t xml:space="preserve"> פועלות ישירות על המודל. בדיקות החדרים וההזדהות משתמשות בחיבורי </w:t>
+      </w:r>
+      <w:r>
+        <w:rPr>
+          <w:rFonts w:ascii="Times New Roman" w:hAnsi="Times New Roman" w:eastAsia="Times New Roman" w:cs="Times New Roman"/>
+          <w:b w:val="0"/>
+          <w:color w:val="172337"/>
+          <w:sz w:val="26"/>
+          <w:rtl w:val="0"/>
+          <w:szCs w:val="26"/>
+        </w:rPr>
+        <w:t>TCP</w:t>
+      </w:r>
+      <w:r>
+        <w:rPr>
+          <w:rFonts w:ascii="David" w:hAnsi="David" w:eastAsia="David" w:cs="David"/>
+          <w:b w:val="0"/>
+          <w:color w:val="172337"/>
+          <w:sz w:val="26"/>
+          <w:rtl w:val="1"/>
+          <w:szCs w:val="26"/>
+        </w:rPr>
+        <w:t xml:space="preserve"> לכתובת </w:t>
+      </w:r>
+      <w:r>
+        <w:rPr>
+          <w:rFonts w:ascii="Times New Roman" w:hAnsi="Times New Roman" w:eastAsia="Times New Roman" w:cs="Times New Roman"/>
+          <w:b w:val="0"/>
+          <w:color w:val="172337"/>
+          <w:sz w:val="26"/>
+          <w:rtl w:val="0"/>
+          <w:szCs w:val="26"/>
+        </w:rPr>
+        <w:t>loopback,</w:t>
+      </w:r>
+      <w:r>
+        <w:rPr>
+          <w:rFonts w:ascii="David" w:hAnsi="David" w:eastAsia="David" w:cs="David"/>
+          <w:b w:val="0"/>
+          <w:color w:val="172337"/>
+          <w:sz w:val="26"/>
+          <w:rtl w:val="1"/>
+          <w:szCs w:val="26"/>
+        </w:rPr>
+        <w:t xml:space="preserve"> ובדיקות הנתונים משתמשות במסדי </w:t>
+      </w:r>
+      <w:r>
+        <w:rPr>
+          <w:rFonts w:ascii="Times New Roman" w:hAnsi="Times New Roman" w:eastAsia="Times New Roman" w:cs="Times New Roman"/>
+          <w:b w:val="0"/>
+          <w:color w:val="172337"/>
+          <w:sz w:val="26"/>
+          <w:rtl w:val="0"/>
+          <w:szCs w:val="26"/>
+        </w:rPr>
+        <w:t>SQLite</w:t>
+      </w:r>
+      <w:r>
+        <w:rPr>
+          <w:rFonts w:ascii="David" w:hAnsi="David" w:eastAsia="David" w:cs="David"/>
+          <w:b w:val="0"/>
+          <w:color w:val="172337"/>
+          <w:sz w:val="26"/>
+          <w:rtl w:val="1"/>
+          <w:szCs w:val="26"/>
+        </w:rPr>
+        <w:t xml:space="preserve"> זמניים. כך אפשר לחזור על הבדיקות בלי לשנות חשבונות ותוצאות של משתמשים.</w:t>
       </w:r>
     </w:p>
     <w:tbl>
@@ -7966,8 +9816,8 @@
       </w:tblPr>
       <w:tblGrid>
         <w:gridCol w:w="3255"/>
-        <w:gridCol w:w="1282"/>
-        <w:gridCol w:w="5327"/>
+        <w:gridCol w:w="1973"/>
+        <w:gridCol w:w="4636"/>
       </w:tblGrid>
       <w:tr>
         <w:tc>
@@ -7991,7 +9841,7 @@
                 <w:szCs w:val="23"/>
                 <w:bCs w:val="1"/>
               </w:rPr>
-              <w:t>מחלקה</w:t>
+              <w:t>מחלקת בדיקה</w:t>
             </w:r>
           </w:p>
         </w:tc>
@@ -8016,7 +9866,7 @@
                 <w:szCs w:val="23"/>
                 <w:bCs w:val="1"/>
               </w:rPr>
-              <w:t>בדיקות</w:t>
+              <w:t>מספר בדיקות בהרצה המתועדת</w:t>
             </w:r>
           </w:p>
         </w:tc>
@@ -8041,7 +9891,7 @@
                 <w:szCs w:val="23"/>
                 <w:bCs w:val="1"/>
               </w:rPr>
-              <w:t>מה נבדק</w:t>
+              <w:t>תחום</w:t>
             </w:r>
           </w:p>
         </w:tc>
@@ -8112,7 +9962,7 @@
                 <w:rtl w:val="1"/>
                 <w:szCs w:val="23"/>
               </w:rPr>
-              <w:t>תנועה, אכילה מחייבת ורצף, הכתרה, העתקה וניצחון.</w:t>
+              <w:t>חוקי משחק, רצף אכילות, הכתרה, העתקה וניצחון.</w:t>
             </w:r>
           </w:p>
         </w:tc>
@@ -8183,7 +10033,7 @@
                 <w:rtl w:val="1"/>
                 <w:szCs w:val="23"/>
               </w:rPr>
-              <w:t>מהלכים, סנכרון, הצטרפות מתחרה, סיום ושמירת תוצאה.</w:t>
+              <w:t>תורות, מהלכים, הודעות, הצטרפות וסיום חדר.</w:t>
             </w:r>
           </w:p>
         </w:tc>
@@ -8254,7 +10104,7 @@
                 <w:rtl w:val="1"/>
                 <w:szCs w:val="23"/>
               </w:rPr>
-              <w:t>התחברות, סדר הודעות, תגובות וסגירה.</w:t>
+              <w:t>חיבור הלקוח, סדר הודעות וסגירה.</w:t>
             </w:r>
           </w:p>
         </w:tc>
@@ -8325,7 +10175,7 @@
                 <w:rtl w:val="1"/>
                 <w:szCs w:val="23"/>
               </w:rPr>
-              <w:t xml:space="preserve">הרשמה, כניסה, זהות, חדרים, פרופיל ושמירת </w:t>
+              <w:t xml:space="preserve">הרשמה, כניסה, זהות, פרופיל ושמירת </w:t>
             </w:r>
             <w:r>
               <w:rPr>
@@ -8384,7 +10234,7 @@
                 <w:rtl w:val="0"/>
                 <w:szCs w:val="23"/>
               </w:rPr>
-              <w:t>7</w:t>
+              <w:t>8</w:t>
             </w:r>
           </w:p>
         </w:tc>
@@ -8407,7 +10257,7 @@
                 <w:rtl w:val="1"/>
                 <w:szCs w:val="23"/>
               </w:rPr>
-              <w:t>התמדה, סיסמאות, תוצאות ללא כפילות והיסטוריה.</w:t>
+              <w:t>חשבונות, התמדה, שמירת תוצאות ונתוני פרופיל.</w:t>
             </w:r>
           </w:p>
         </w:tc>
@@ -8428,18 +10278,6 @@
       </w:pPr>
       <w:r>
         <w:rPr>
-          <w:rFonts w:ascii="Times New Roman" w:hAnsi="Times New Roman" w:eastAsia="Times New Roman" w:cs="Times New Roman"/>
-          <w:b/>
-          <w:color w:val="174C73"/>
-          <w:sz w:val="32"/>
-          <w:rtl w:val="0"/>
-          <w:szCs w:val="32"/>
-          <w:bCs w:val="1"/>
-        </w:rPr>
-        <w:t>8.2</w:t>
-      </w:r>
-      <w:r>
-        <w:rPr>
           <w:rFonts w:ascii="David" w:hAnsi="David" w:eastAsia="David" w:cs="David"/>
           <w:b/>
           <w:color w:val="174C73"/>
@@ -8448,7 +10286,7 @@
           <w:szCs w:val="32"/>
           <w:bCs w:val="1"/>
         </w:rPr>
-        <w:t xml:space="preserve"> תוצאות</w:t>
+        <w:t>תוצאות ובדיקת הממשק</w:t>
       </w:r>
     </w:p>
     <w:p>
@@ -8477,7 +10315,7 @@
           <w:rtl w:val="0"/>
           <w:szCs w:val="26"/>
         </w:rPr>
-        <w:t>11.10.2026</w:t>
+        <w:t>12.10.2026</w:t>
       </w:r>
       <w:r>
         <w:rPr>
@@ -8499,7 +10337,7 @@
           <w:rtl w:val="0"/>
           <w:szCs w:val="26"/>
         </w:rPr>
-        <w:t>47</w:t>
+        <w:t>48</w:t>
       </w:r>
       <w:r>
         <w:rPr>
@@ -8512,6 +10350,781 @@
         </w:rPr>
         <w:t xml:space="preserve"> הבדיקות והבנייה הסתיימה בהצלחה. נבדקו בין היתר אכילה מחייבת, רצף אכילות, הכתרה, תורות, הרשמה, כניסה ושמירת תוצאות ללא כפילות.</w:t>
       </w:r>
+    </w:p>
+    <w:p>
+      <w:pPr>
+        <w:spacing w:after="140" w:line="293" w:lineRule="auto"/>
+        <w:jc w:val="right"/>
+        <w:bidi w:val="1"/>
+      </w:pPr>
+      <w:r>
+        <w:rPr>
+          <w:rFonts w:ascii="David" w:hAnsi="David" w:eastAsia="David" w:cs="David"/>
+          <w:b w:val="0"/>
+          <w:color w:val="172337"/>
+          <w:sz w:val="26"/>
+          <w:rtl w:val="1"/>
+          <w:szCs w:val="26"/>
+        </w:rPr>
+        <w:t>בנוסף לבדיקות האוטומטיות, הממשק נבחן ידנית ב־</w:t>
+      </w:r>
+      <w:r>
+        <w:rPr>
+          <w:rFonts w:ascii="Times New Roman" w:hAnsi="Times New Roman" w:eastAsia="Times New Roman" w:cs="Times New Roman"/>
+          <w:b w:val="0"/>
+          <w:color w:val="172337"/>
+          <w:sz w:val="26"/>
+          <w:rtl w:val="0"/>
+          <w:szCs w:val="26"/>
+        </w:rPr>
+        <w:t>Windows</w:t>
+      </w:r>
+      <w:r>
+        <w:rPr>
+          <w:rFonts w:ascii="David" w:hAnsi="David" w:eastAsia="David" w:cs="David"/>
+          <w:b w:val="0"/>
+          <w:color w:val="172337"/>
+          <w:sz w:val="26"/>
+          <w:rtl w:val="1"/>
+          <w:szCs w:val="26"/>
+        </w:rPr>
+        <w:t xml:space="preserve"> באמצעות שרת ושני חלונות לקוח. התרחישים כללו יצירה והצטרפות לחדר, ביצוע מהלכים, הצגת הודעות ופתיחת פרופיל. המראה, התאמת החלון והאנימציה נבחנים בתוך </w:t>
+      </w:r>
+      <w:r>
+        <w:rPr>
+          <w:rFonts w:ascii="Times New Roman" w:hAnsi="Times New Roman" w:eastAsia="Times New Roman" w:cs="Times New Roman"/>
+          <w:b w:val="0"/>
+          <w:color w:val="172337"/>
+          <w:sz w:val="26"/>
+          <w:rtl w:val="0"/>
+          <w:szCs w:val="26"/>
+        </w:rPr>
+        <w:t>JavaFX</w:t>
+      </w:r>
+      <w:r>
+        <w:rPr>
+          <w:rFonts w:ascii="David" w:hAnsi="David" w:eastAsia="David" w:cs="David"/>
+          <w:b w:val="0"/>
+          <w:color w:val="172337"/>
+          <w:sz w:val="26"/>
+          <w:rtl w:val="1"/>
+          <w:szCs w:val="26"/>
+        </w:rPr>
+        <w:t xml:space="preserve"> לצד בדיקות המודל והתקשורת.</w:t>
+      </w:r>
+    </w:p>
+    <w:p>
+      <w:pPr>
+        <w:spacing w:after="260" w:line="293" w:lineRule="auto" w:before="0"/>
+        <w:jc w:val="right"/>
+        <w:pStyle w:val="Heading1"/>
+        <w:keepNext/>
+        <w:pageBreakBefore/>
+        <w:bidi w:val="1"/>
+        <w:pBdr>
+          <w:bottom w:val="single" w:sz="18" w:color="D9E9F4"/>
+        </w:pBdr>
+      </w:pPr>
+      <w:r>
+        <w:rPr>
+          <w:rFonts w:ascii="Times New Roman" w:hAnsi="Times New Roman" w:eastAsia="Times New Roman" w:cs="Times New Roman"/>
+          <w:b/>
+          <w:color w:val="174C73"/>
+          <w:sz w:val="44"/>
+          <w:rtl w:val="0"/>
+          <w:szCs w:val="44"/>
+          <w:bCs w:val="1"/>
+        </w:rPr>
+        <w:t>8.</w:t>
+      </w:r>
+      <w:r>
+        <w:rPr>
+          <w:rFonts w:ascii="David" w:hAnsi="David" w:eastAsia="David" w:cs="David"/>
+          <w:b/>
+          <w:color w:val="174C73"/>
+          <w:sz w:val="44"/>
+          <w:rtl w:val="1"/>
+          <w:szCs w:val="44"/>
+          <w:bCs w:val="1"/>
+        </w:rPr>
+        <w:t xml:space="preserve"> בדיקות ואימות המערכת — המשך</w:t>
+      </w:r>
+    </w:p>
+    <w:p>
+      <w:pPr>
+        <w:spacing w:after="140" w:line="293" w:lineRule="auto" w:before="160"/>
+        <w:jc w:val="right"/>
+        <w:pStyle w:val="Heading2"/>
+        <w:keepNext/>
+        <w:bidi w:val="1"/>
+      </w:pPr>
+      <w:r>
+        <w:rPr>
+          <w:rFonts w:ascii="David" w:hAnsi="David" w:eastAsia="David" w:cs="David"/>
+          <w:b/>
+          <w:color w:val="174C73"/>
+          <w:sz w:val="32"/>
+          <w:rtl w:val="1"/>
+          <w:szCs w:val="32"/>
+          <w:bCs w:val="1"/>
+        </w:rPr>
+        <w:t>תרחישים משמעותיים</w:t>
+      </w:r>
+    </w:p>
+    <w:tbl>
+      <w:tblPr>
+        <w:tblW w:type="auto" w:w="0"/>
+        <w:tblLayout w:type="autofit"/>
+        <w:tblLook w:firstColumn="1" w:firstRow="1" w:lastColumn="0" w:lastRow="0" w:noHBand="0" w:noVBand="1" w:val="04A0"/>
+        <w:bidiVisual w:val="1"/>
+        <w:tblBorders>
+          <w:top w:val="single" w:sz="4" w:color="B6D0DF"/>
+          <w:left w:val="single" w:sz="4" w:color="B6D0DF"/>
+          <w:bottom w:val="single" w:sz="4" w:color="B6D0DF"/>
+          <w:right w:val="single" w:sz="4" w:color="B6D0DF"/>
+          <w:insideH w:val="single" w:sz="4" w:color="B6D0DF"/>
+          <w:insideV w:val="single" w:sz="4" w:color="B6D0DF"/>
+        </w:tblBorders>
+      </w:tblPr>
+      <w:tblGrid>
+        <w:gridCol w:w="3255"/>
+        <w:gridCol w:w="1973"/>
+        <w:gridCol w:w="4636"/>
+      </w:tblGrid>
+      <w:tr>
+        <w:tc>
+          <w:tcPr>
+            <w:tcW w:type="dxa" w:w="3289"/>
+            <w:shd w:fill="d9e9f4"/>
+          </w:tcPr>
+          <w:p>
+            <w:pPr>
+              <w:spacing w:after="80" w:line="269" w:lineRule="auto"/>
+              <w:jc w:val="right"/>
+              <w:bidi w:val="1"/>
+            </w:pPr>
+            <w:r>
+              <w:rPr>
+                <w:rFonts w:ascii="David" w:hAnsi="David" w:eastAsia="David" w:cs="David"/>
+                <w:b/>
+                <w:color w:val="174C73"/>
+                <w:sz w:val="23"/>
+                <w:rtl w:val="1"/>
+                <w:szCs w:val="23"/>
+                <w:bCs w:val="1"/>
+              </w:rPr>
+              <w:t>תרחיש</w:t>
+            </w:r>
+          </w:p>
+        </w:tc>
+        <w:tc>
+          <w:tcPr>
+            <w:tcW w:type="dxa" w:w="3289"/>
+            <w:shd w:fill="d9e9f4"/>
+          </w:tcPr>
+          <w:p>
+            <w:pPr>
+              <w:spacing w:after="80" w:line="269" w:lineRule="auto"/>
+              <w:jc w:val="right"/>
+              <w:bidi w:val="1"/>
+            </w:pPr>
+            <w:r>
+              <w:rPr>
+                <w:rFonts w:ascii="David" w:hAnsi="David" w:eastAsia="David" w:cs="David"/>
+                <w:b/>
+                <w:color w:val="174C73"/>
+                <w:sz w:val="23"/>
+                <w:rtl w:val="1"/>
+                <w:szCs w:val="23"/>
+                <w:bCs w:val="1"/>
+              </w:rPr>
+              <w:t>תוצאה צפויה</w:t>
+            </w:r>
+          </w:p>
+        </w:tc>
+        <w:tc>
+          <w:tcPr>
+            <w:tcW w:type="dxa" w:w="3289"/>
+            <w:shd w:fill="d9e9f4"/>
+          </w:tcPr>
+          <w:p>
+            <w:pPr>
+              <w:spacing w:after="80" w:line="269" w:lineRule="auto"/>
+              <w:jc w:val="right"/>
+              <w:bidi w:val="1"/>
+            </w:pPr>
+            <w:r>
+              <w:rPr>
+                <w:rFonts w:ascii="David" w:hAnsi="David" w:eastAsia="David" w:cs="David"/>
+                <w:b/>
+                <w:color w:val="174C73"/>
+                <w:sz w:val="23"/>
+                <w:rtl w:val="1"/>
+                <w:szCs w:val="23"/>
+                <w:bCs w:val="1"/>
+              </w:rPr>
+              <w:t>אופן בדיקה</w:t>
+            </w:r>
+          </w:p>
+        </w:tc>
+      </w:tr>
+      <w:tr>
+        <w:tc>
+          <w:tcPr>
+            <w:tcW w:type="dxa" w:w="3289"/>
+          </w:tcPr>
+          <w:p>
+            <w:pPr>
+              <w:spacing w:after="80" w:line="269" w:lineRule="auto"/>
+              <w:jc w:val="right"/>
+              <w:bidi w:val="1"/>
+            </w:pPr>
+            <w:r>
+              <w:rPr>
+                <w:rFonts w:ascii="David" w:hAnsi="David" w:eastAsia="David" w:cs="David"/>
+                <w:b w:val="0"/>
+                <w:color w:val="172337"/>
+                <w:sz w:val="23"/>
+                <w:rtl w:val="1"/>
+                <w:szCs w:val="23"/>
+              </w:rPr>
+              <w:t>מהלך חוקי</w:t>
+            </w:r>
+          </w:p>
+        </w:tc>
+        <w:tc>
+          <w:tcPr>
+            <w:tcW w:type="dxa" w:w="3289"/>
+          </w:tcPr>
+          <w:p>
+            <w:pPr>
+              <w:spacing w:after="80" w:line="269" w:lineRule="auto"/>
+              <w:jc w:val="right"/>
+              <w:bidi w:val="1"/>
+            </w:pPr>
+            <w:r>
+              <w:rPr>
+                <w:rFonts w:ascii="David" w:hAnsi="David" w:eastAsia="David" w:cs="David"/>
+                <w:b w:val="0"/>
+                <w:color w:val="172337"/>
+                <w:sz w:val="23"/>
+                <w:rtl w:val="1"/>
+                <w:szCs w:val="23"/>
+              </w:rPr>
+              <w:t xml:space="preserve">אותו </w:t>
+            </w:r>
+            <w:r>
+              <w:rPr>
+                <w:rFonts w:ascii="Times New Roman" w:hAnsi="Times New Roman" w:eastAsia="Times New Roman" w:cs="Times New Roman"/>
+                <w:b w:val="0"/>
+                <w:color w:val="172337"/>
+                <w:sz w:val="23"/>
+                <w:rtl w:val="0"/>
+                <w:szCs w:val="23"/>
+              </w:rPr>
+              <w:t>BOARD</w:t>
+            </w:r>
+            <w:r>
+              <w:rPr>
+                <w:rFonts w:ascii="David" w:hAnsi="David" w:eastAsia="David" w:cs="David"/>
+                <w:b w:val="0"/>
+                <w:color w:val="172337"/>
+                <w:sz w:val="23"/>
+                <w:rtl w:val="1"/>
+                <w:szCs w:val="23"/>
+              </w:rPr>
+              <w:t xml:space="preserve"> ותור מעודכן אצל שני הלקוחות.</w:t>
+            </w:r>
+          </w:p>
+        </w:tc>
+        <w:tc>
+          <w:tcPr>
+            <w:tcW w:type="dxa" w:w="3289"/>
+          </w:tcPr>
+          <w:p>
+            <w:pPr>
+              <w:spacing w:after="80" w:line="269" w:lineRule="auto"/>
+              <w:jc w:val="right"/>
+              <w:bidi w:val="1"/>
+            </w:pPr>
+            <w:r>
+              <w:rPr>
+                <w:rFonts w:ascii="David" w:hAnsi="David" w:eastAsia="David" w:cs="David"/>
+                <w:b w:val="0"/>
+                <w:color w:val="172337"/>
+                <w:sz w:val="23"/>
+                <w:rtl w:val="1"/>
+                <w:szCs w:val="23"/>
+              </w:rPr>
+              <w:t xml:space="preserve">בדיקת פרוטוקול עם שני חיבורי </w:t>
+            </w:r>
+            <w:r>
+              <w:rPr>
+                <w:rFonts w:ascii="Times New Roman" w:hAnsi="Times New Roman" w:eastAsia="Times New Roman" w:cs="Times New Roman"/>
+                <w:b w:val="0"/>
+                <w:color w:val="172337"/>
+                <w:sz w:val="23"/>
+                <w:rtl w:val="0"/>
+                <w:szCs w:val="23"/>
+              </w:rPr>
+              <w:t>TCP.</w:t>
+            </w:r>
+          </w:p>
+        </w:tc>
+      </w:tr>
+      <w:tr>
+        <w:tc>
+          <w:tcPr>
+            <w:tcW w:type="dxa" w:w="3289"/>
+          </w:tcPr>
+          <w:p>
+            <w:pPr>
+              <w:spacing w:after="80" w:line="269" w:lineRule="auto"/>
+              <w:jc w:val="right"/>
+              <w:bidi w:val="1"/>
+            </w:pPr>
+            <w:r>
+              <w:rPr>
+                <w:rFonts w:ascii="David" w:hAnsi="David" w:eastAsia="David" w:cs="David"/>
+                <w:b w:val="0"/>
+                <w:color w:val="172337"/>
+                <w:sz w:val="23"/>
+                <w:rtl w:val="1"/>
+                <w:szCs w:val="23"/>
+              </w:rPr>
+              <w:t>מהלך מחוץ לתור או מהלך לא חוקי</w:t>
+            </w:r>
+          </w:p>
+        </w:tc>
+        <w:tc>
+          <w:tcPr>
+            <w:tcW w:type="dxa" w:w="3289"/>
+          </w:tcPr>
+          <w:p>
+            <w:pPr>
+              <w:spacing w:after="80" w:line="269" w:lineRule="auto"/>
+              <w:jc w:val="right"/>
+              <w:bidi w:val="1"/>
+            </w:pPr>
+            <w:r>
+              <w:rPr>
+                <w:rFonts w:ascii="Times New Roman" w:hAnsi="Times New Roman" w:eastAsia="Times New Roman" w:cs="Times New Roman"/>
+                <w:b w:val="0"/>
+                <w:color w:val="172337"/>
+                <w:sz w:val="23"/>
+                <w:rtl w:val="0"/>
+                <w:szCs w:val="23"/>
+              </w:rPr>
+              <w:t>ERROR</w:t>
+            </w:r>
+            <w:r>
+              <w:rPr>
+                <w:rFonts w:ascii="David" w:hAnsi="David" w:eastAsia="David" w:cs="David"/>
+                <w:b w:val="0"/>
+                <w:color w:val="172337"/>
+                <w:sz w:val="23"/>
+                <w:rtl w:val="1"/>
+                <w:szCs w:val="23"/>
+              </w:rPr>
+              <w:t xml:space="preserve"> למבקש ללא שינוי הלוח.</w:t>
+            </w:r>
+          </w:p>
+        </w:tc>
+        <w:tc>
+          <w:tcPr>
+            <w:tcW w:type="dxa" w:w="3289"/>
+          </w:tcPr>
+          <w:p>
+            <w:pPr>
+              <w:spacing w:after="80" w:line="269" w:lineRule="auto"/>
+              <w:jc w:val="right"/>
+              <w:bidi w:val="1"/>
+            </w:pPr>
+            <w:r>
+              <w:rPr>
+                <w:rFonts w:ascii="David" w:hAnsi="David" w:eastAsia="David" w:cs="David"/>
+                <w:b w:val="0"/>
+                <w:color w:val="172337"/>
+                <w:sz w:val="23"/>
+                <w:rtl w:val="1"/>
+                <w:szCs w:val="23"/>
+              </w:rPr>
+              <w:t>השוואת המצב לפני הבקשה ואחריה.</w:t>
+            </w:r>
+          </w:p>
+        </w:tc>
+      </w:tr>
+      <w:tr>
+        <w:tc>
+          <w:tcPr>
+            <w:tcW w:type="dxa" w:w="3289"/>
+          </w:tcPr>
+          <w:p>
+            <w:pPr>
+              <w:spacing w:after="80" w:line="269" w:lineRule="auto"/>
+              <w:jc w:val="right"/>
+              <w:bidi w:val="1"/>
+            </w:pPr>
+            <w:r>
+              <w:rPr>
+                <w:rFonts w:ascii="David" w:hAnsi="David" w:eastAsia="David" w:cs="David"/>
+                <w:b w:val="0"/>
+                <w:color w:val="172337"/>
+                <w:sz w:val="23"/>
+                <w:rtl w:val="1"/>
+                <w:szCs w:val="23"/>
+              </w:rPr>
+              <w:t>רצף אכילות</w:t>
+            </w:r>
+          </w:p>
+        </w:tc>
+        <w:tc>
+          <w:tcPr>
+            <w:tcW w:type="dxa" w:w="3289"/>
+          </w:tcPr>
+          <w:p>
+            <w:pPr>
+              <w:spacing w:after="80" w:line="269" w:lineRule="auto"/>
+              <w:jc w:val="right"/>
+              <w:bidi w:val="1"/>
+            </w:pPr>
+            <w:r>
+              <w:rPr>
+                <w:rFonts w:ascii="David" w:hAnsi="David" w:eastAsia="David" w:cs="David"/>
+                <w:b w:val="0"/>
+                <w:color w:val="172337"/>
+                <w:sz w:val="23"/>
+                <w:rtl w:val="1"/>
+                <w:szCs w:val="23"/>
+              </w:rPr>
+              <w:t>אותה חתיכה חייבת להמשיך והתור נשאר אצלה.</w:t>
+            </w:r>
+          </w:p>
+        </w:tc>
+        <w:tc>
+          <w:tcPr>
+            <w:tcW w:type="dxa" w:w="3289"/>
+          </w:tcPr>
+          <w:p>
+            <w:pPr>
+              <w:spacing w:after="80" w:line="269" w:lineRule="auto"/>
+              <w:jc w:val="right"/>
+              <w:bidi w:val="1"/>
+            </w:pPr>
+            <w:r>
+              <w:rPr>
+                <w:rFonts w:ascii="David" w:hAnsi="David" w:eastAsia="David" w:cs="David"/>
+                <w:b w:val="0"/>
+                <w:color w:val="172337"/>
+                <w:sz w:val="23"/>
+                <w:rtl w:val="1"/>
+                <w:szCs w:val="23"/>
+              </w:rPr>
+              <w:t>בדיקות כללים ופרוטוקול.</w:t>
+            </w:r>
+          </w:p>
+        </w:tc>
+      </w:tr>
+      <w:tr>
+        <w:tc>
+          <w:tcPr>
+            <w:tcW w:type="dxa" w:w="3289"/>
+          </w:tcPr>
+          <w:p>
+            <w:pPr>
+              <w:spacing w:after="80" w:line="269" w:lineRule="auto"/>
+              <w:jc w:val="right"/>
+              <w:bidi w:val="1"/>
+            </w:pPr>
+            <w:r>
+              <w:rPr>
+                <w:rFonts w:ascii="David" w:hAnsi="David" w:eastAsia="David" w:cs="David"/>
+                <w:b w:val="0"/>
+                <w:color w:val="172337"/>
+                <w:sz w:val="23"/>
+                <w:rtl w:val="1"/>
+                <w:szCs w:val="23"/>
+              </w:rPr>
+              <w:t>סיסמה שגויה</w:t>
+            </w:r>
+          </w:p>
+        </w:tc>
+        <w:tc>
+          <w:tcPr>
+            <w:tcW w:type="dxa" w:w="3289"/>
+          </w:tcPr>
+          <w:p>
+            <w:pPr>
+              <w:spacing w:after="80" w:line="269" w:lineRule="auto"/>
+              <w:jc w:val="right"/>
+              <w:bidi w:val="1"/>
+            </w:pPr>
+            <w:r>
+              <w:rPr>
+                <w:rFonts w:ascii="David" w:hAnsi="David" w:eastAsia="David" w:cs="David"/>
+                <w:b w:val="0"/>
+                <w:color w:val="172337"/>
+                <w:sz w:val="23"/>
+                <w:rtl w:val="1"/>
+                <w:szCs w:val="23"/>
+              </w:rPr>
+              <w:t>הכניסה נדחית.</w:t>
+            </w:r>
+          </w:p>
+        </w:tc>
+        <w:tc>
+          <w:tcPr>
+            <w:tcW w:type="dxa" w:w="3289"/>
+          </w:tcPr>
+          <w:p>
+            <w:pPr>
+              <w:spacing w:after="80" w:line="269" w:lineRule="auto"/>
+              <w:jc w:val="right"/>
+              <w:bidi w:val="1"/>
+            </w:pPr>
+            <w:r>
+              <w:rPr>
+                <w:rFonts w:ascii="David" w:hAnsi="David" w:eastAsia="David" w:cs="David"/>
+                <w:b w:val="0"/>
+                <w:color w:val="172337"/>
+                <w:sz w:val="23"/>
+                <w:rtl w:val="1"/>
+                <w:szCs w:val="23"/>
+              </w:rPr>
+              <w:t>בדיקות הזדהות.</w:t>
+            </w:r>
+          </w:p>
+        </w:tc>
+      </w:tr>
+      <w:tr>
+        <w:tc>
+          <w:tcPr>
+            <w:tcW w:type="dxa" w:w="3289"/>
+          </w:tcPr>
+          <w:p>
+            <w:pPr>
+              <w:spacing w:after="80" w:line="269" w:lineRule="auto"/>
+              <w:jc w:val="right"/>
+              <w:bidi w:val="1"/>
+            </w:pPr>
+            <w:r>
+              <w:rPr>
+                <w:rFonts w:ascii="David" w:hAnsi="David" w:eastAsia="David" w:cs="David"/>
+                <w:b w:val="0"/>
+                <w:color w:val="172337"/>
+                <w:sz w:val="23"/>
+                <w:rtl w:val="1"/>
+                <w:szCs w:val="23"/>
+              </w:rPr>
+              <w:t>חשבון אחד בשני מקומות בחדר</w:t>
+            </w:r>
+          </w:p>
+        </w:tc>
+        <w:tc>
+          <w:tcPr>
+            <w:tcW w:type="dxa" w:w="3289"/>
+          </w:tcPr>
+          <w:p>
+            <w:pPr>
+              <w:spacing w:after="80" w:line="269" w:lineRule="auto"/>
+              <w:jc w:val="right"/>
+              <w:bidi w:val="1"/>
+            </w:pPr>
+            <w:r>
+              <w:rPr>
+                <w:rFonts w:ascii="David" w:hAnsi="David" w:eastAsia="David" w:cs="David"/>
+                <w:b w:val="0"/>
+                <w:color w:val="172337"/>
+                <w:sz w:val="23"/>
+                <w:rtl w:val="1"/>
+                <w:szCs w:val="23"/>
+              </w:rPr>
+              <w:t>הצטרפות למקום השני נדחית.</w:t>
+            </w:r>
+          </w:p>
+        </w:tc>
+        <w:tc>
+          <w:tcPr>
+            <w:tcW w:type="dxa" w:w="3289"/>
+          </w:tcPr>
+          <w:p>
+            <w:pPr>
+              <w:spacing w:after="80" w:line="269" w:lineRule="auto"/>
+              <w:jc w:val="right"/>
+              <w:bidi w:val="1"/>
+            </w:pPr>
+            <w:r>
+              <w:rPr>
+                <w:rFonts w:ascii="David" w:hAnsi="David" w:eastAsia="David" w:cs="David"/>
+                <w:b w:val="0"/>
+                <w:color w:val="172337"/>
+                <w:sz w:val="23"/>
+                <w:rtl w:val="1"/>
+                <w:szCs w:val="23"/>
+              </w:rPr>
+              <w:t>בדיקת זהות המשתתפים.</w:t>
+            </w:r>
+          </w:p>
+        </w:tc>
+      </w:tr>
+      <w:tr>
+        <w:tc>
+          <w:tcPr>
+            <w:tcW w:type="dxa" w:w="3289"/>
+          </w:tcPr>
+          <w:p>
+            <w:pPr>
+              <w:spacing w:after="80" w:line="269" w:lineRule="auto"/>
+              <w:jc w:val="right"/>
+              <w:bidi w:val="1"/>
+            </w:pPr>
+            <w:r>
+              <w:rPr>
+                <w:rFonts w:ascii="David" w:hAnsi="David" w:eastAsia="David" w:cs="David"/>
+                <w:b w:val="0"/>
+                <w:color w:val="172337"/>
+                <w:sz w:val="23"/>
+                <w:rtl w:val="1"/>
+                <w:szCs w:val="23"/>
+              </w:rPr>
+              <w:t>שליחת אותה תוצאה שוב</w:t>
+            </w:r>
+          </w:p>
+        </w:tc>
+        <w:tc>
+          <w:tcPr>
+            <w:tcW w:type="dxa" w:w="3289"/>
+          </w:tcPr>
+          <w:p>
+            <w:pPr>
+              <w:spacing w:after="80" w:line="269" w:lineRule="auto"/>
+              <w:jc w:val="right"/>
+              <w:bidi w:val="1"/>
+            </w:pPr>
+            <w:r>
+              <w:rPr>
+                <w:rFonts w:ascii="David" w:hAnsi="David" w:eastAsia="David" w:cs="David"/>
+                <w:b w:val="0"/>
+                <w:color w:val="172337"/>
+                <w:sz w:val="23"/>
+                <w:rtl w:val="1"/>
+                <w:szCs w:val="23"/>
+              </w:rPr>
+              <w:t>מספר המשחקים אינו גדל פעמיים.</w:t>
+            </w:r>
+          </w:p>
+        </w:tc>
+        <w:tc>
+          <w:tcPr>
+            <w:tcW w:type="dxa" w:w="3289"/>
+          </w:tcPr>
+          <w:p>
+            <w:pPr>
+              <w:spacing w:after="80" w:line="269" w:lineRule="auto"/>
+              <w:jc w:val="right"/>
+              <w:bidi w:val="1"/>
+            </w:pPr>
+            <w:r>
+              <w:rPr>
+                <w:rFonts w:ascii="David" w:hAnsi="David" w:eastAsia="David" w:cs="David"/>
+                <w:b w:val="0"/>
+                <w:color w:val="172337"/>
+                <w:sz w:val="23"/>
+                <w:rtl w:val="1"/>
+                <w:szCs w:val="23"/>
+              </w:rPr>
+              <w:t>בדיקת מזהה תוצאה וסטטיסטיקה.</w:t>
+            </w:r>
+          </w:p>
+        </w:tc>
+      </w:tr>
+      <w:tr>
+        <w:tc>
+          <w:tcPr>
+            <w:tcW w:type="dxa" w:w="3289"/>
+          </w:tcPr>
+          <w:p>
+            <w:pPr>
+              <w:spacing w:after="80" w:line="269" w:lineRule="auto"/>
+              <w:jc w:val="right"/>
+              <w:bidi w:val="1"/>
+            </w:pPr>
+            <w:r>
+              <w:rPr>
+                <w:rFonts w:ascii="David" w:hAnsi="David" w:eastAsia="David" w:cs="David"/>
+                <w:b w:val="0"/>
+                <w:color w:val="172337"/>
+                <w:sz w:val="23"/>
+                <w:rtl w:val="1"/>
+                <w:szCs w:val="23"/>
+              </w:rPr>
+              <w:t>פתיחה מחדש של המסד</w:t>
+            </w:r>
+          </w:p>
+        </w:tc>
+        <w:tc>
+          <w:tcPr>
+            <w:tcW w:type="dxa" w:w="3289"/>
+          </w:tcPr>
+          <w:p>
+            <w:pPr>
+              <w:spacing w:after="80" w:line="269" w:lineRule="auto"/>
+              <w:jc w:val="right"/>
+              <w:bidi w:val="1"/>
+            </w:pPr>
+            <w:r>
+              <w:rPr>
+                <w:rFonts w:ascii="David" w:hAnsi="David" w:eastAsia="David" w:cs="David"/>
+                <w:b w:val="0"/>
+                <w:color w:val="172337"/>
+                <w:sz w:val="23"/>
+                <w:rtl w:val="1"/>
+                <w:szCs w:val="23"/>
+              </w:rPr>
+              <w:t>החשבון והתוצאות עדיין קיימים.</w:t>
+            </w:r>
+          </w:p>
+        </w:tc>
+        <w:tc>
+          <w:tcPr>
+            <w:tcW w:type="dxa" w:w="3289"/>
+          </w:tcPr>
+          <w:p>
+            <w:pPr>
+              <w:spacing w:after="80" w:line="269" w:lineRule="auto"/>
+              <w:jc w:val="right"/>
+              <w:bidi w:val="1"/>
+            </w:pPr>
+            <w:r>
+              <w:rPr>
+                <w:rFonts w:ascii="David" w:hAnsi="David" w:eastAsia="David" w:cs="David"/>
+                <w:b w:val="0"/>
+                <w:color w:val="172337"/>
+                <w:sz w:val="23"/>
+                <w:rtl w:val="1"/>
+                <w:szCs w:val="23"/>
+              </w:rPr>
+              <w:t>בדיקות התמדה ב־</w:t>
+            </w:r>
+            <w:r>
+              <w:rPr>
+                <w:rFonts w:ascii="Times New Roman" w:hAnsi="Times New Roman" w:eastAsia="Times New Roman" w:cs="Times New Roman"/>
+                <w:b w:val="0"/>
+                <w:color w:val="172337"/>
+                <w:sz w:val="23"/>
+                <w:rtl w:val="0"/>
+                <w:szCs w:val="23"/>
+              </w:rPr>
+              <w:t>SQLite.</w:t>
+            </w:r>
+          </w:p>
+        </w:tc>
+      </w:tr>
+    </w:tbl>
+    <w:p>
+      <w:pPr>
+        <w:spacing w:after="40" w:line="40" w:lineRule="exact"/>
+      </w:pPr>
     </w:p>
     <w:p>
       <w:pPr>
@@ -9212,7 +11825,7 @@
           <w:rtl w:val="1"/>
           <w:szCs w:val="26"/>
         </w:rPr>
-        <w:t>נעשה שימוש נרחב ב־</w:t>
+        <w:t>בפרויקט נעשה שימוש נרחב ב־</w:t>
       </w:r>
       <w:r>
         <w:rPr>
@@ -9256,7 +11869,7 @@
           <w:rtl w:val="1"/>
           <w:szCs w:val="26"/>
         </w:rPr>
-        <w:t xml:space="preserve"> ללמידה, תכנון, יצירת קוד, עיצוב, בדיקות ותיעוד. הסיוע כלל מימוש תקשורת </w:t>
+        <w:t xml:space="preserve"> ללמידה, לתכנון, ליצירת קוד ולשינויו, לעיצוב הממשק ולהכנת בדיקות ותיעוד. הסיוע כלל תקשורת </w:t>
       </w:r>
       <w:r>
         <w:rPr>
@@ -9322,7 +11935,7 @@
           <w:rtl w:val="1"/>
           <w:szCs w:val="26"/>
         </w:rPr>
-        <w:t xml:space="preserve"> והפרופיל.</w:t>
+        <w:t xml:space="preserve"> ופרופילים. הכלים שימשו גם להסברים על מושגים ועל זרימת הקוד.</w:t>
       </w:r>
     </w:p>
     <w:p>
@@ -9355,7 +11968,7 @@
           <w:szCs w:val="32"/>
           <w:bCs w:val="1"/>
         </w:rPr>
-        <w:t xml:space="preserve"> תרומה אישית בתהליך</w:t>
+        <w:t xml:space="preserve"> תהליך העבודה</w:t>
       </w:r>
     </w:p>
     <w:p>
@@ -9373,7 +11986,7 @@
           <w:rtl w:val="1"/>
           <w:szCs w:val="26"/>
         </w:rPr>
-        <w:t>מותנא הגדיר דרישות וקיבל החלטות על התנהגות המערכת, הוביל את הפיתוח בעזרת הכלים ובדק את היישום ב־</w:t>
+        <w:t xml:space="preserve">תהליך העבודה כלל הגדרת דרישה, קבלת הצעה מכלי </w:t>
       </w:r>
       <w:r>
         <w:rPr>
@@ -9384,7 +11997,7 @@
           <w:rtl w:val="0"/>
           <w:szCs w:val="26"/>
         </w:rPr>
-        <w:t>Windows.</w:t>
+        <w:t>AI,</w:t>
       </w:r>
       <w:r>
         <w:rPr>
@@ -9395,7 +12008,7 @@
           <w:rtl w:val="1"/>
           <w:szCs w:val="26"/>
         </w:rPr>
-        <w:t xml:space="preserve"> הוא נעזר בהסברים על </w:t>
+        <w:t xml:space="preserve"> קריאת הקוד וההסברים, הרצה ובדיקות והתאמות. מותנא קיבל החלטות על התנהגות המערכת וביקש להתקדם בצעדים שניתן לקרוא ולהבין. הוא בדק את היישום ב־</w:t>
       </w:r>
       <w:r>
         <w:rPr>
@@ -9406,7 +12019,7 @@
           <w:rtl w:val="0"/>
           <w:szCs w:val="26"/>
         </w:rPr>
-        <w:t>Socket</w:t>
+        <w:t>Windows</w:t>
       </w:r>
       <w:r>
         <w:rPr>
@@ -9417,7 +12030,90 @@
           <w:rtl w:val="1"/>
           <w:szCs w:val="26"/>
         </w:rPr>
-        <w:t xml:space="preserve"> וזרימת ההודעות, קרא את הקוד ובחן את התאמת ההצעות לדרישות. התהליך כלל הבנת הקשרים בין המחלקות ובדיקת פעולות המשתמש.</w:t>
+        <w:t xml:space="preserve"> ונתן משוב על התקשורת, פעולות המשתמש והממשק. כלי ה־</w:t>
+      </w:r>
+      <w:r>
+        <w:rPr>
+          <w:rFonts w:ascii="Times New Roman" w:hAnsi="Times New Roman" w:eastAsia="Times New Roman" w:cs="Times New Roman"/>
+          <w:b w:val="0"/>
+          <w:color w:val="172337"/>
+          <w:sz w:val="26"/>
+          <w:rtl w:val="0"/>
+          <w:szCs w:val="26"/>
+        </w:rPr>
+        <w:t>AI</w:t>
+      </w:r>
+      <w:r>
+        <w:rPr>
+          <w:rFonts w:ascii="David" w:hAnsi="David" w:eastAsia="David" w:cs="David"/>
+          <w:b w:val="0"/>
+          <w:color w:val="172337"/>
+          <w:sz w:val="26"/>
+          <w:rtl w:val="1"/>
+          <w:szCs w:val="26"/>
+        </w:rPr>
+        <w:t xml:space="preserve"> סייעו במימוש ובבדיקות האוטומטיות.</w:t>
+      </w:r>
+    </w:p>
+    <w:p>
+      <w:pPr>
+        <w:spacing w:after="260" w:line="293" w:lineRule="auto" w:before="0"/>
+        <w:jc w:val="right"/>
+        <w:pStyle w:val="Heading1"/>
+        <w:keepNext/>
+        <w:pageBreakBefore/>
+        <w:bidi w:val="1"/>
+        <w:pBdr>
+          <w:bottom w:val="single" w:sz="18" w:color="D9E9F4"/>
+        </w:pBdr>
+      </w:pPr>
+      <w:r>
+        <w:rPr>
+          <w:rFonts w:ascii="Times New Roman" w:hAnsi="Times New Roman" w:eastAsia="Times New Roman" w:cs="Times New Roman"/>
+          <w:b/>
+          <w:color w:val="174C73"/>
+          <w:sz w:val="44"/>
+          <w:rtl w:val="0"/>
+          <w:szCs w:val="44"/>
+          <w:bCs w:val="1"/>
+        </w:rPr>
+        <w:t>10.</w:t>
+      </w:r>
+      <w:r>
+        <w:rPr>
+          <w:rFonts w:ascii="David" w:hAnsi="David" w:eastAsia="David" w:cs="David"/>
+          <w:b/>
+          <w:color w:val="174C73"/>
+          <w:sz w:val="44"/>
+          <w:rtl w:val="1"/>
+          <w:szCs w:val="44"/>
+          <w:bCs w:val="1"/>
+        </w:rPr>
+        <w:t xml:space="preserve"> שימוש בכלי </w:t>
+      </w:r>
+      <w:r>
+        <w:rPr>
+          <w:rFonts w:ascii="Times New Roman" w:hAnsi="Times New Roman" w:eastAsia="Times New Roman" w:cs="Times New Roman"/>
+          <w:b/>
+          <w:color w:val="174C73"/>
+          <w:sz w:val="44"/>
+          <w:rtl w:val="0"/>
+          <w:szCs w:val="44"/>
+          <w:bCs w:val="1"/>
+        </w:rPr>
+        <w:t>AI</w:t>
+      </w:r>
+      <w:r>
+        <w:rPr>
+          <w:rFonts w:ascii="David" w:hAnsi="David" w:eastAsia="David" w:cs="David"/>
+          <w:b/>
+          <w:color w:val="174C73"/>
+          <w:sz w:val="44"/>
+          <w:rtl w:val="1"/>
+          <w:szCs w:val="44"/>
+          <w:bCs w:val="1"/>
+        </w:rPr>
+        <w:t xml:space="preserve"> והתרומה האישית — המשך</w:t>
       </w:r>
     </w:p>
     <w:p>
@@ -9450,8 +12146,163 @@
           <w:szCs w:val="32"/>
           <w:bCs w:val="1"/>
         </w:rPr>
-        <w:t xml:space="preserve"> דוגמה מעשית לעבודה עם </w:t>
-      </w:r>
+        <w:t xml:space="preserve"> דוגמאות מעשיות</w:t>
+      </w:r>
+    </w:p>
+    <w:p>
+      <w:pPr>
+        <w:spacing w:after="140" w:line="293" w:lineRule="auto"/>
+        <w:jc w:val="right"/>
+        <w:bidi w:val="1"/>
+      </w:pPr>
+      <w:r>
+        <w:rPr>
+          <w:rFonts w:ascii="David" w:hAnsi="David" w:eastAsia="David" w:cs="David"/>
+          <w:b w:val="0"/>
+          <w:color w:val="172337"/>
+          <w:sz w:val="26"/>
+          <w:rtl w:val="1"/>
+          <w:szCs w:val="26"/>
+        </w:rPr>
+        <w:t>דוגמה אחת הייתה ריכוז חוקי המשחק: מותנא זיהה בדיקות הקשורות לכללים בכמה מחלקות וביקש לרכז את האחריות ב־</w:t>
+      </w:r>
+      <w:r>
+        <w:rPr>
+          <w:rFonts w:ascii="Times New Roman" w:hAnsi="Times New Roman" w:eastAsia="Times New Roman" w:cs="Times New Roman"/>
+          <w:b w:val="0"/>
+          <w:color w:val="172337"/>
+          <w:sz w:val="26"/>
+          <w:rtl w:val="0"/>
+          <w:szCs w:val="26"/>
+        </w:rPr>
+        <w:t>Game.</w:t>
+      </w:r>
+      <w:r>
+        <w:rPr>
+          <w:rFonts w:ascii="David" w:hAnsi="David" w:eastAsia="David" w:cs="David"/>
+          <w:b w:val="0"/>
+          <w:color w:val="172337"/>
+          <w:sz w:val="26"/>
+          <w:rtl w:val="1"/>
+          <w:szCs w:val="26"/>
+        </w:rPr>
+        <w:t xml:space="preserve"> כלי ה־</w:t>
+      </w:r>
+      <w:r>
+        <w:rPr>
+          <w:rFonts w:ascii="Times New Roman" w:hAnsi="Times New Roman" w:eastAsia="Times New Roman" w:cs="Times New Roman"/>
+          <w:b w:val="0"/>
+          <w:color w:val="172337"/>
+          <w:sz w:val="26"/>
+          <w:rtl w:val="0"/>
+          <w:szCs w:val="26"/>
+        </w:rPr>
+        <w:t>AI</w:t>
+      </w:r>
+      <w:r>
+        <w:rPr>
+          <w:rFonts w:ascii="David" w:hAnsi="David" w:eastAsia="David" w:cs="David"/>
+          <w:b w:val="0"/>
+          <w:color w:val="172337"/>
+          <w:sz w:val="26"/>
+          <w:rtl w:val="1"/>
+          <w:szCs w:val="26"/>
+        </w:rPr>
+        <w:t xml:space="preserve"> סייעו בשינוי המימוש ובהסרת כפילויות. השרת והמשחק המקומי משתמשים באותו מנגנון לחוקיות המהלכים.</w:t>
+      </w:r>
+    </w:p>
+    <w:p>
+      <w:pPr>
+        <w:spacing w:after="140" w:line="293" w:lineRule="auto"/>
+        <w:jc w:val="right"/>
+        <w:bidi w:val="1"/>
+      </w:pPr>
+      <w:r>
+        <w:rPr>
+          <w:rFonts w:ascii="David" w:hAnsi="David" w:eastAsia="David" w:cs="David"/>
+          <w:b w:val="0"/>
+          <w:color w:val="172337"/>
+          <w:sz w:val="26"/>
+          <w:rtl w:val="1"/>
+          <w:szCs w:val="26"/>
+        </w:rPr>
+        <w:t xml:space="preserve">דוגמה נוספת הייתה חיבור </w:t>
+      </w:r>
+      <w:r>
+        <w:rPr>
+          <w:rFonts w:ascii="Times New Roman" w:hAnsi="Times New Roman" w:eastAsia="Times New Roman" w:cs="Times New Roman"/>
+          <w:b w:val="0"/>
+          <w:color w:val="172337"/>
+          <w:sz w:val="26"/>
+          <w:rtl w:val="0"/>
+          <w:szCs w:val="26"/>
+        </w:rPr>
+        <w:t>JavaFX</w:t>
+      </w:r>
+      <w:r>
+        <w:rPr>
+          <w:rFonts w:ascii="David" w:hAnsi="David" w:eastAsia="David" w:cs="David"/>
+          <w:b w:val="0"/>
+          <w:color w:val="172337"/>
+          <w:sz w:val="26"/>
+          <w:rtl w:val="1"/>
+          <w:szCs w:val="26"/>
+        </w:rPr>
+        <w:t xml:space="preserve"> לשרת: פעולות החיבור וקריאת ההודעות עשויות להמתין, ולכן נדרש לבצען ברקע ולעדכן את המסך באמצעות </w:t>
+      </w:r>
+      <w:r>
+        <w:rPr>
+          <w:rFonts w:ascii="Times New Roman" w:hAnsi="Times New Roman" w:eastAsia="Times New Roman" w:cs="Times New Roman"/>
+          <w:b w:val="0"/>
+          <w:color w:val="172337"/>
+          <w:sz w:val="26"/>
+          <w:rtl w:val="0"/>
+          <w:szCs w:val="26"/>
+        </w:rPr>
+        <w:t>Platform.runLater.</w:t>
+      </w:r>
+      <w:r>
+        <w:rPr>
+          <w:rFonts w:ascii="David" w:hAnsi="David" w:eastAsia="David" w:cs="David"/>
+          <w:b w:val="0"/>
+          <w:color w:val="172337"/>
+          <w:sz w:val="26"/>
+          <w:rtl w:val="1"/>
+          <w:szCs w:val="26"/>
+        </w:rPr>
+        <w:t xml:space="preserve"> כלי ה־</w:t>
+      </w:r>
+      <w:r>
+        <w:rPr>
+          <w:rFonts w:ascii="Times New Roman" w:hAnsi="Times New Roman" w:eastAsia="Times New Roman" w:cs="Times New Roman"/>
+          <w:b w:val="0"/>
+          <w:color w:val="172337"/>
+          <w:sz w:val="26"/>
+          <w:rtl w:val="0"/>
+          <w:szCs w:val="26"/>
+        </w:rPr>
+        <w:t>AI</w:t>
+      </w:r>
+      <w:r>
+        <w:rPr>
+          <w:rFonts w:ascii="David" w:hAnsi="David" w:eastAsia="David" w:cs="David"/>
+          <w:b w:val="0"/>
+          <w:color w:val="172337"/>
+          <w:sz w:val="26"/>
+          <w:rtl w:val="1"/>
+          <w:szCs w:val="26"/>
+        </w:rPr>
+        <w:t xml:space="preserve"> סייעו בקוד ובהסברים, ומותנא בחן את החיבור ואת פעולות המשתמש ביישום.</w:t>
+      </w:r>
+    </w:p>
+    <w:p>
+      <w:pPr>
+        <w:spacing w:after="140" w:line="293" w:lineRule="auto" w:before="160"/>
+        <w:jc w:val="right"/>
+        <w:pStyle w:val="Heading2"/>
+        <w:keepNext/>
+        <w:bidi w:val="1"/>
+      </w:pPr>
       <w:r>
         <w:rPr>
           <w:rFonts w:ascii="Times New Roman" w:hAnsi="Times New Roman" w:eastAsia="Times New Roman" w:cs="Times New Roman"/>
@@ -9462,7 +12313,19 @@
           <w:szCs w:val="32"/>
           <w:bCs w:val="1"/>
         </w:rPr>
-        <w:t>AI</w:t>
+        <w:t>10.4</w:t>
+      </w:r>
+      <w:r>
+        <w:rPr>
+          <w:rFonts w:ascii="David" w:hAnsi="David" w:eastAsia="David" w:cs="David"/>
+          <w:b/>
+          <w:color w:val="174C73"/>
+          <w:sz w:val="32"/>
+          <w:rtl w:val="1"/>
+          <w:szCs w:val="32"/>
+          <w:bCs w:val="1"/>
+        </w:rPr>
+        <w:t xml:space="preserve"> חלוקת תחומי האחריות</w:t>
       </w:r>
     </w:p>
     <w:p>
@@ -9480,7 +12343,7 @@
           <w:rtl w:val="1"/>
           <w:szCs w:val="26"/>
         </w:rPr>
-        <w:t xml:space="preserve">בעת עיצוב המשוב למשתמש, מותנא הגדיר שהודעות שגיאה יוצגו בצורה ברורה בלי לשנות את גודל הלוח. בעזרת </w:t>
+        <w:t xml:space="preserve">לפי חלוקת תחומי האחריות שנמסרה, רביע התמקד בלוגיקת המשחק ובכללים של הגרסה המקומית. מותנא התמקד בהרחבת המערכת לשרת </w:t>
       </w:r>
       <w:r>
         <w:rPr>
@@ -9491,7 +12354,7 @@
           <w:rtl w:val="0"/>
           <w:szCs w:val="26"/>
         </w:rPr>
-        <w:t>AI</w:t>
+        <w:t>TCP,</w:t>
       </w:r>
       <w:r>
         <w:rPr>
@@ -9502,7 +12365,7 @@
           <w:rtl w:val="1"/>
           <w:szCs w:val="26"/>
         </w:rPr>
-        <w:t xml:space="preserve"> מומש כרטיס הודעה צף. מותנא בחן את אופן הצגתו בזמן המשחק וביקש התאמות לעיצוב ולנוחות השימוש. התהליך כלל הגדרת דרישה, שימוש בכלי לסיוע במימוש ובחינת התוצאה ביישום.</w:t>
+        <w:t xml:space="preserve"> בניהול חדרים, בחשבונות ובפרופילים, ובשילוב הרכיבים לגרסה הסופית העובדת.</w:t>
       </w:r>
     </w:p>
     <w:p>

</xml_diff>

<commit_message>
Separate AI use from individual project responsibilities
</commit_message>
<xml_diff>
--- a/docs/project-book/Damka_Project_Book_TCP_Profile.docx
+++ b/docs/project-book/Damka_Project_Book_TCP_Profile.docx
@@ -880,29 +880,7 @@
           <w:rtl w:val="1"/>
           <w:szCs w:val="24"/>
         </w:rPr>
-        <w:t xml:space="preserve"> שימוש בכלי </w:t>
-      </w:r>
-      <w:r>
-        <w:rPr>
-          <w:rFonts w:ascii="Times New Roman" w:hAnsi="Times New Roman" w:eastAsia="Times New Roman" w:cs="Times New Roman"/>
-          <w:b w:val="0"/>
-          <w:color w:val="172337"/>
-          <w:sz w:val="24"/>
-          <w:rtl w:val="0"/>
-          <w:szCs w:val="24"/>
-        </w:rPr>
-        <w:t>AI</w:t>
-      </w:r>
-      <w:r>
-        <w:rPr>
-          <w:rFonts w:ascii="David" w:hAnsi="David" w:eastAsia="David" w:cs="David"/>
-          <w:b w:val="0"/>
-          <w:color w:val="172337"/>
-          <w:sz w:val="24"/>
-          <w:rtl w:val="1"/>
-          <w:szCs w:val="24"/>
-        </w:rPr>
-        <w:t xml:space="preserve"> והתרומה האישית  ..................................  </w:t>
+        <w:t xml:space="preserve"> שימוש בבינה מלאכותית  ..................................  </w:t>
       </w:r>
       <w:fldSimple w:instr="PAGEREF chapter_10 \h">
         <w:r>
@@ -944,9 +922,51 @@
           <w:rtl w:val="1"/>
           <w:szCs w:val="24"/>
         </w:rPr>
+        <w:t xml:space="preserve"> תרומה אישית  ..................................  </w:t>
+      </w:r>
+      <w:fldSimple w:instr="PAGEREF chapter_11 \h">
+        <w:r>
+          <w:rPr>
+            <w:rFonts w:ascii="Times New Roman" w:hAnsi="Times New Roman" w:eastAsia="Times New Roman" w:cs="Times New Roman"/>
+            <w:b w:val="0"/>
+            <w:color w:val="172337"/>
+            <w:sz w:val="24"/>
+            <w:rtl w:val="0"/>
+            <w:szCs w:val="24"/>
+          </w:rPr>
+          <w:t>21</w:t>
+        </w:r>
+      </w:fldSimple>
+    </w:p>
+    <w:p>
+      <w:pPr>
+        <w:spacing w:after="120" w:line="293" w:lineRule="auto"/>
+        <w:jc w:val="right"/>
+        <w:bidi w:val="1"/>
+      </w:pPr>
+      <w:r>
+        <w:rPr>
+          <w:rFonts w:ascii="Times New Roman" w:hAnsi="Times New Roman" w:eastAsia="Times New Roman" w:cs="Times New Roman"/>
+          <w:b w:val="0"/>
+          <w:color w:val="172337"/>
+          <w:sz w:val="24"/>
+          <w:rtl w:val="0"/>
+          <w:szCs w:val="24"/>
+        </w:rPr>
+        <w:t>12.</w:t>
+      </w:r>
+      <w:r>
+        <w:rPr>
+          <w:rFonts w:ascii="David" w:hAnsi="David" w:eastAsia="David" w:cs="David"/>
+          <w:b w:val="0"/>
+          <w:color w:val="172337"/>
+          <w:sz w:val="24"/>
+          <w:rtl w:val="1"/>
+          <w:szCs w:val="24"/>
+        </w:rPr>
         <w:t xml:space="preserve"> סיכום, אתגרים ומקורות  ..................................  </w:t>
       </w:r>
-      <w:fldSimple w:instr="PAGEREF chapter_11 \h">
+      <w:fldSimple w:instr="PAGEREF chapter_12 \h">
         <w:r>
           <w:rPr>
             <w:rFonts w:ascii="Times New Roman" w:hAnsi="Times New Roman" w:eastAsia="Times New Roman" w:cs="Times New Roman"/>
@@ -11749,66 +11769,9 @@
           <w:szCs w:val="44"/>
           <w:bCs w:val="1"/>
         </w:rPr>
-        <w:t xml:space="preserve"> שימוש בכלי </w:t>
-      </w:r>
-      <w:r>
-        <w:rPr>
-          <w:rFonts w:ascii="Times New Roman" w:hAnsi="Times New Roman" w:eastAsia="Times New Roman" w:cs="Times New Roman"/>
-          <w:b/>
-          <w:color w:val="174C73"/>
-          <w:sz w:val="44"/>
-          <w:rtl w:val="0"/>
-          <w:szCs w:val="44"/>
-          <w:bCs w:val="1"/>
-        </w:rPr>
-        <w:t>AI</w:t>
-      </w:r>
-      <w:r>
-        <w:rPr>
-          <w:rFonts w:ascii="David" w:hAnsi="David" w:eastAsia="David" w:cs="David"/>
-          <w:b/>
-          <w:color w:val="174C73"/>
-          <w:sz w:val="44"/>
-          <w:rtl w:val="1"/>
-          <w:szCs w:val="44"/>
-          <w:bCs w:val="1"/>
-        </w:rPr>
-        <w:t xml:space="preserve"> והתרומה האישית</w:t>
+        <w:t xml:space="preserve"> שימוש בבינה מלאכותית</w:t>
       </w:r>
       <w:bookmarkEnd w:id="10"/>
-    </w:p>
-    <w:p>
-      <w:pPr>
-        <w:spacing w:after="140" w:line="293" w:lineRule="auto" w:before="160"/>
-        <w:jc w:val="right"/>
-        <w:pStyle w:val="Heading2"/>
-        <w:keepNext/>
-        <w:bidi w:val="1"/>
-      </w:pPr>
-      <w:r>
-        <w:rPr>
-          <w:rFonts w:ascii="Times New Roman" w:hAnsi="Times New Roman" w:eastAsia="Times New Roman" w:cs="Times New Roman"/>
-          <w:b/>
-          <w:color w:val="174C73"/>
-          <w:sz w:val="32"/>
-          <w:rtl w:val="0"/>
-          <w:szCs w:val="32"/>
-          <w:bCs w:val="1"/>
-        </w:rPr>
-        <w:t>10.1</w:t>
-      </w:r>
-      <w:r>
-        <w:rPr>
-          <w:rFonts w:ascii="David" w:hAnsi="David" w:eastAsia="David" w:cs="David"/>
-          <w:b/>
-          <w:color w:val="174C73"/>
-          <w:sz w:val="32"/>
-          <w:rtl w:val="1"/>
-          <w:szCs w:val="32"/>
-          <w:bCs w:val="1"/>
-        </w:rPr>
-        <w:t xml:space="preserve"> היקף ואופן השימוש</w:t>
-      </w:r>
     </w:p>
     <w:p>
       <w:pPr>
@@ -11869,106 +11832,7 @@
           <w:rtl w:val="1"/>
           <w:szCs w:val="26"/>
         </w:rPr>
-        <w:t xml:space="preserve"> ללמידה, לתכנון, ליצירת קוד ולשינויו, לעיצוב הממשק ולהכנת בדיקות ותיעוד. הסיוע כלל תקשורת </w:t>
-      </w:r>
-      <w:r>
-        <w:rPr>
-          <w:rFonts w:ascii="Times New Roman" w:hAnsi="Times New Roman" w:eastAsia="Times New Roman" w:cs="Times New Roman"/>
-          <w:b w:val="0"/>
-          <w:color w:val="172337"/>
-          <w:sz w:val="26"/>
-          <w:rtl w:val="0"/>
-          <w:szCs w:val="26"/>
-        </w:rPr>
-        <w:t>TCP,</w:t>
-      </w:r>
-      <w:r>
-        <w:rPr>
-          <w:rFonts w:ascii="David" w:hAnsi="David" w:eastAsia="David" w:cs="David"/>
-          <w:b w:val="0"/>
-          <w:color w:val="172337"/>
-          <w:sz w:val="26"/>
-          <w:rtl w:val="1"/>
-          <w:szCs w:val="26"/>
-        </w:rPr>
-        <w:t xml:space="preserve"> חיבור </w:t>
-      </w:r>
-      <w:r>
-        <w:rPr>
-          <w:rFonts w:ascii="Times New Roman" w:hAnsi="Times New Roman" w:eastAsia="Times New Roman" w:cs="Times New Roman"/>
-          <w:b w:val="0"/>
-          <w:color w:val="172337"/>
-          <w:sz w:val="26"/>
-          <w:rtl w:val="0"/>
-          <w:szCs w:val="26"/>
-        </w:rPr>
-        <w:t>JavaFX</w:t>
-      </w:r>
-      <w:r>
-        <w:rPr>
-          <w:rFonts w:ascii="David" w:hAnsi="David" w:eastAsia="David" w:cs="David"/>
-          <w:b w:val="0"/>
-          <w:color w:val="172337"/>
-          <w:sz w:val="26"/>
-          <w:rtl w:val="1"/>
-          <w:szCs w:val="26"/>
-        </w:rPr>
-        <w:t xml:space="preserve"> לשרת, ניהול חדרים, חשבונות, </w:t>
-      </w:r>
-      <w:r>
-        <w:rPr>
-          <w:rFonts w:ascii="Times New Roman" w:hAnsi="Times New Roman" w:eastAsia="Times New Roman" w:cs="Times New Roman"/>
-          <w:b w:val="0"/>
-          <w:color w:val="172337"/>
-          <w:sz w:val="26"/>
-          <w:rtl w:val="0"/>
-          <w:szCs w:val="26"/>
-        </w:rPr>
-        <w:t>SQLite</w:t>
-      </w:r>
-      <w:r>
-        <w:rPr>
-          <w:rFonts w:ascii="David" w:hAnsi="David" w:eastAsia="David" w:cs="David"/>
-          <w:b w:val="0"/>
-          <w:color w:val="172337"/>
-          <w:sz w:val="26"/>
-          <w:rtl w:val="1"/>
-          <w:szCs w:val="26"/>
-        </w:rPr>
-        <w:t xml:space="preserve"> ופרופילים. הכלים שימשו גם להסברים על מושגים ועל זרימת הקוד.</w:t>
-      </w:r>
-    </w:p>
-    <w:p>
-      <w:pPr>
-        <w:spacing w:after="140" w:line="293" w:lineRule="auto" w:before="160"/>
-        <w:jc w:val="right"/>
-        <w:pStyle w:val="Heading2"/>
-        <w:keepNext/>
-        <w:bidi w:val="1"/>
-      </w:pPr>
-      <w:r>
-        <w:rPr>
-          <w:rFonts w:ascii="Times New Roman" w:hAnsi="Times New Roman" w:eastAsia="Times New Roman" w:cs="Times New Roman"/>
-          <w:b/>
-          <w:color w:val="174C73"/>
-          <w:sz w:val="32"/>
-          <w:rtl w:val="0"/>
-          <w:szCs w:val="32"/>
-          <w:bCs w:val="1"/>
-        </w:rPr>
-        <w:t>10.2</w:t>
-      </w:r>
-      <w:r>
-        <w:rPr>
-          <w:rFonts w:ascii="David" w:hAnsi="David" w:eastAsia="David" w:cs="David"/>
-          <w:b/>
-          <w:color w:val="174C73"/>
-          <w:sz w:val="32"/>
-          <w:rtl w:val="1"/>
-          <w:szCs w:val="32"/>
-          <w:bCs w:val="1"/>
-        </w:rPr>
-        <w:t xml:space="preserve"> תהליך העבודה</w:t>
+        <w:t xml:space="preserve"> ללמידה ולתכנון, לכתיבת הקוד ולשינויו, לעיצוב הממשק ולהכנת בדיקות ותיעוד. הכלים סייעו בהסבר מושגים ובהבנת הקשר בין רכיבי המערכת.</w:t>
       </w:r>
     </w:p>
     <w:p>
@@ -11986,7 +11850,7 @@
           <w:rtl w:val="1"/>
           <w:szCs w:val="26"/>
         </w:rPr>
-        <w:t xml:space="preserve">תהליך העבודה כלל הגדרת דרישה, קבלת הצעה מכלי </w:t>
+        <w:t>תהליך העבודה כלל הגדרת דרישות, קבלת הצעות מכלי ה־</w:t>
       </w:r>
       <w:r>
         <w:rPr>
@@ -12008,364 +11872,7 @@
           <w:rtl w:val="1"/>
           <w:szCs w:val="26"/>
         </w:rPr>
-        <w:t xml:space="preserve"> קריאת הקוד וההסברים, הרצה ובדיקות והתאמות. מותנא קיבל החלטות על התנהגות המערכת וביקש להתקדם בצעדים שניתן לקרוא ולהבין. הוא בדק את היישום ב־</w:t>
-      </w:r>
-      <w:r>
-        <w:rPr>
-          <w:rFonts w:ascii="Times New Roman" w:hAnsi="Times New Roman" w:eastAsia="Times New Roman" w:cs="Times New Roman"/>
-          <w:b w:val="0"/>
-          <w:color w:val="172337"/>
-          <w:sz w:val="26"/>
-          <w:rtl w:val="0"/>
-          <w:szCs w:val="26"/>
-        </w:rPr>
-        <w:t>Windows</w:t>
-      </w:r>
-      <w:r>
-        <w:rPr>
-          <w:rFonts w:ascii="David" w:hAnsi="David" w:eastAsia="David" w:cs="David"/>
-          <w:b w:val="0"/>
-          <w:color w:val="172337"/>
-          <w:sz w:val="26"/>
-          <w:rtl w:val="1"/>
-          <w:szCs w:val="26"/>
-        </w:rPr>
-        <w:t xml:space="preserve"> ונתן משוב על התקשורת, פעולות המשתמש והממשק. כלי ה־</w:t>
-      </w:r>
-      <w:r>
-        <w:rPr>
-          <w:rFonts w:ascii="Times New Roman" w:hAnsi="Times New Roman" w:eastAsia="Times New Roman" w:cs="Times New Roman"/>
-          <w:b w:val="0"/>
-          <w:color w:val="172337"/>
-          <w:sz w:val="26"/>
-          <w:rtl w:val="0"/>
-          <w:szCs w:val="26"/>
-        </w:rPr>
-        <w:t>AI</w:t>
-      </w:r>
-      <w:r>
-        <w:rPr>
-          <w:rFonts w:ascii="David" w:hAnsi="David" w:eastAsia="David" w:cs="David"/>
-          <w:b w:val="0"/>
-          <w:color w:val="172337"/>
-          <w:sz w:val="26"/>
-          <w:rtl w:val="1"/>
-          <w:szCs w:val="26"/>
-        </w:rPr>
-        <w:t xml:space="preserve"> סייעו במימוש ובבדיקות האוטומטיות.</w:t>
-      </w:r>
-    </w:p>
-    <w:p>
-      <w:pPr>
-        <w:spacing w:after="260" w:line="293" w:lineRule="auto" w:before="0"/>
-        <w:jc w:val="right"/>
-        <w:pStyle w:val="Heading1"/>
-        <w:keepNext/>
-        <w:pageBreakBefore/>
-        <w:bidi w:val="1"/>
-        <w:pBdr>
-          <w:bottom w:val="single" w:sz="18" w:color="D9E9F4"/>
-        </w:pBdr>
-      </w:pPr>
-      <w:r>
-        <w:rPr>
-          <w:rFonts w:ascii="Times New Roman" w:hAnsi="Times New Roman" w:eastAsia="Times New Roman" w:cs="Times New Roman"/>
-          <w:b/>
-          <w:color w:val="174C73"/>
-          <w:sz w:val="44"/>
-          <w:rtl w:val="0"/>
-          <w:szCs w:val="44"/>
-          <w:bCs w:val="1"/>
-        </w:rPr>
-        <w:t>10.</w:t>
-      </w:r>
-      <w:r>
-        <w:rPr>
-          <w:rFonts w:ascii="David" w:hAnsi="David" w:eastAsia="David" w:cs="David"/>
-          <w:b/>
-          <w:color w:val="174C73"/>
-          <w:sz w:val="44"/>
-          <w:rtl w:val="1"/>
-          <w:szCs w:val="44"/>
-          <w:bCs w:val="1"/>
-        </w:rPr>
-        <w:t xml:space="preserve"> שימוש בכלי </w:t>
-      </w:r>
-      <w:r>
-        <w:rPr>
-          <w:rFonts w:ascii="Times New Roman" w:hAnsi="Times New Roman" w:eastAsia="Times New Roman" w:cs="Times New Roman"/>
-          <w:b/>
-          <w:color w:val="174C73"/>
-          <w:sz w:val="44"/>
-          <w:rtl w:val="0"/>
-          <w:szCs w:val="44"/>
-          <w:bCs w:val="1"/>
-        </w:rPr>
-        <w:t>AI</w:t>
-      </w:r>
-      <w:r>
-        <w:rPr>
-          <w:rFonts w:ascii="David" w:hAnsi="David" w:eastAsia="David" w:cs="David"/>
-          <w:b/>
-          <w:color w:val="174C73"/>
-          <w:sz w:val="44"/>
-          <w:rtl w:val="1"/>
-          <w:szCs w:val="44"/>
-          <w:bCs w:val="1"/>
-        </w:rPr>
-        <w:t xml:space="preserve"> והתרומה האישית — המשך</w:t>
-      </w:r>
-    </w:p>
-    <w:p>
-      <w:pPr>
-        <w:spacing w:after="140" w:line="293" w:lineRule="auto" w:before="160"/>
-        <w:jc w:val="right"/>
-        <w:pStyle w:val="Heading2"/>
-        <w:keepNext/>
-        <w:bidi w:val="1"/>
-      </w:pPr>
-      <w:r>
-        <w:rPr>
-          <w:rFonts w:ascii="Times New Roman" w:hAnsi="Times New Roman" w:eastAsia="Times New Roman" w:cs="Times New Roman"/>
-          <w:b/>
-          <w:color w:val="174C73"/>
-          <w:sz w:val="32"/>
-          <w:rtl w:val="0"/>
-          <w:szCs w:val="32"/>
-          <w:bCs w:val="1"/>
-        </w:rPr>
-        <w:t>10.3</w:t>
-      </w:r>
-      <w:r>
-        <w:rPr>
-          <w:rFonts w:ascii="David" w:hAnsi="David" w:eastAsia="David" w:cs="David"/>
-          <w:b/>
-          <w:color w:val="174C73"/>
-          <w:sz w:val="32"/>
-          <w:rtl w:val="1"/>
-          <w:szCs w:val="32"/>
-          <w:bCs w:val="1"/>
-        </w:rPr>
-        <w:t xml:space="preserve"> דוגמאות מעשיות</w:t>
-      </w:r>
-    </w:p>
-    <w:p>
-      <w:pPr>
-        <w:spacing w:after="140" w:line="293" w:lineRule="auto"/>
-        <w:jc w:val="right"/>
-        <w:bidi w:val="1"/>
-      </w:pPr>
-      <w:r>
-        <w:rPr>
-          <w:rFonts w:ascii="David" w:hAnsi="David" w:eastAsia="David" w:cs="David"/>
-          <w:b w:val="0"/>
-          <w:color w:val="172337"/>
-          <w:sz w:val="26"/>
-          <w:rtl w:val="1"/>
-          <w:szCs w:val="26"/>
-        </w:rPr>
-        <w:t>דוגמה אחת הייתה ריכוז חוקי המשחק: מותנא זיהה בדיקות הקשורות לכללים בכמה מחלקות וביקש לרכז את האחריות ב־</w:t>
-      </w:r>
-      <w:r>
-        <w:rPr>
-          <w:rFonts w:ascii="Times New Roman" w:hAnsi="Times New Roman" w:eastAsia="Times New Roman" w:cs="Times New Roman"/>
-          <w:b w:val="0"/>
-          <w:color w:val="172337"/>
-          <w:sz w:val="26"/>
-          <w:rtl w:val="0"/>
-          <w:szCs w:val="26"/>
-        </w:rPr>
-        <w:t>Game.</w:t>
-      </w:r>
-      <w:r>
-        <w:rPr>
-          <w:rFonts w:ascii="David" w:hAnsi="David" w:eastAsia="David" w:cs="David"/>
-          <w:b w:val="0"/>
-          <w:color w:val="172337"/>
-          <w:sz w:val="26"/>
-          <w:rtl w:val="1"/>
-          <w:szCs w:val="26"/>
-        </w:rPr>
-        <w:t xml:space="preserve"> כלי ה־</w:t>
-      </w:r>
-      <w:r>
-        <w:rPr>
-          <w:rFonts w:ascii="Times New Roman" w:hAnsi="Times New Roman" w:eastAsia="Times New Roman" w:cs="Times New Roman"/>
-          <w:b w:val="0"/>
-          <w:color w:val="172337"/>
-          <w:sz w:val="26"/>
-          <w:rtl w:val="0"/>
-          <w:szCs w:val="26"/>
-        </w:rPr>
-        <w:t>AI</w:t>
-      </w:r>
-      <w:r>
-        <w:rPr>
-          <w:rFonts w:ascii="David" w:hAnsi="David" w:eastAsia="David" w:cs="David"/>
-          <w:b w:val="0"/>
-          <w:color w:val="172337"/>
-          <w:sz w:val="26"/>
-          <w:rtl w:val="1"/>
-          <w:szCs w:val="26"/>
-        </w:rPr>
-        <w:t xml:space="preserve"> סייעו בשינוי המימוש ובהסרת כפילויות. השרת והמשחק המקומי משתמשים באותו מנגנון לחוקיות המהלכים.</w:t>
-      </w:r>
-    </w:p>
-    <w:p>
-      <w:pPr>
-        <w:spacing w:after="140" w:line="293" w:lineRule="auto"/>
-        <w:jc w:val="right"/>
-        <w:bidi w:val="1"/>
-      </w:pPr>
-      <w:r>
-        <w:rPr>
-          <w:rFonts w:ascii="David" w:hAnsi="David" w:eastAsia="David" w:cs="David"/>
-          <w:b w:val="0"/>
-          <w:color w:val="172337"/>
-          <w:sz w:val="26"/>
-          <w:rtl w:val="1"/>
-          <w:szCs w:val="26"/>
-        </w:rPr>
-        <w:t xml:space="preserve">דוגמה נוספת הייתה חיבור </w:t>
-      </w:r>
-      <w:r>
-        <w:rPr>
-          <w:rFonts w:ascii="Times New Roman" w:hAnsi="Times New Roman" w:eastAsia="Times New Roman" w:cs="Times New Roman"/>
-          <w:b w:val="0"/>
-          <w:color w:val="172337"/>
-          <w:sz w:val="26"/>
-          <w:rtl w:val="0"/>
-          <w:szCs w:val="26"/>
-        </w:rPr>
-        <w:t>JavaFX</w:t>
-      </w:r>
-      <w:r>
-        <w:rPr>
-          <w:rFonts w:ascii="David" w:hAnsi="David" w:eastAsia="David" w:cs="David"/>
-          <w:b w:val="0"/>
-          <w:color w:val="172337"/>
-          <w:sz w:val="26"/>
-          <w:rtl w:val="1"/>
-          <w:szCs w:val="26"/>
-        </w:rPr>
-        <w:t xml:space="preserve"> לשרת: פעולות החיבור וקריאת ההודעות עשויות להמתין, ולכן נדרש לבצען ברקע ולעדכן את המסך באמצעות </w:t>
-      </w:r>
-      <w:r>
-        <w:rPr>
-          <w:rFonts w:ascii="Times New Roman" w:hAnsi="Times New Roman" w:eastAsia="Times New Roman" w:cs="Times New Roman"/>
-          <w:b w:val="0"/>
-          <w:color w:val="172337"/>
-          <w:sz w:val="26"/>
-          <w:rtl w:val="0"/>
-          <w:szCs w:val="26"/>
-        </w:rPr>
-        <w:t>Platform.runLater.</w:t>
-      </w:r>
-      <w:r>
-        <w:rPr>
-          <w:rFonts w:ascii="David" w:hAnsi="David" w:eastAsia="David" w:cs="David"/>
-          <w:b w:val="0"/>
-          <w:color w:val="172337"/>
-          <w:sz w:val="26"/>
-          <w:rtl w:val="1"/>
-          <w:szCs w:val="26"/>
-        </w:rPr>
-        <w:t xml:space="preserve"> כלי ה־</w:t>
-      </w:r>
-      <w:r>
-        <w:rPr>
-          <w:rFonts w:ascii="Times New Roman" w:hAnsi="Times New Roman" w:eastAsia="Times New Roman" w:cs="Times New Roman"/>
-          <w:b w:val="0"/>
-          <w:color w:val="172337"/>
-          <w:sz w:val="26"/>
-          <w:rtl w:val="0"/>
-          <w:szCs w:val="26"/>
-        </w:rPr>
-        <w:t>AI</w:t>
-      </w:r>
-      <w:r>
-        <w:rPr>
-          <w:rFonts w:ascii="David" w:hAnsi="David" w:eastAsia="David" w:cs="David"/>
-          <w:b w:val="0"/>
-          <w:color w:val="172337"/>
-          <w:sz w:val="26"/>
-          <w:rtl w:val="1"/>
-          <w:szCs w:val="26"/>
-        </w:rPr>
-        <w:t xml:space="preserve"> סייעו בקוד ובהסברים, ומותנא בחן את החיבור ואת פעולות המשתמש ביישום.</w:t>
-      </w:r>
-    </w:p>
-    <w:p>
-      <w:pPr>
-        <w:spacing w:after="140" w:line="293" w:lineRule="auto" w:before="160"/>
-        <w:jc w:val="right"/>
-        <w:pStyle w:val="Heading2"/>
-        <w:keepNext/>
-        <w:bidi w:val="1"/>
-      </w:pPr>
-      <w:r>
-        <w:rPr>
-          <w:rFonts w:ascii="Times New Roman" w:hAnsi="Times New Roman" w:eastAsia="Times New Roman" w:cs="Times New Roman"/>
-          <w:b/>
-          <w:color w:val="174C73"/>
-          <w:sz w:val="32"/>
-          <w:rtl w:val="0"/>
-          <w:szCs w:val="32"/>
-          <w:bCs w:val="1"/>
-        </w:rPr>
-        <w:t>10.4</w:t>
-      </w:r>
-      <w:r>
-        <w:rPr>
-          <w:rFonts w:ascii="David" w:hAnsi="David" w:eastAsia="David" w:cs="David"/>
-          <w:b/>
-          <w:color w:val="174C73"/>
-          <w:sz w:val="32"/>
-          <w:rtl w:val="1"/>
-          <w:szCs w:val="32"/>
-          <w:bCs w:val="1"/>
-        </w:rPr>
-        <w:t xml:space="preserve"> חלוקת תחומי האחריות</w:t>
-      </w:r>
-    </w:p>
-    <w:p>
-      <w:pPr>
-        <w:spacing w:after="140" w:line="293" w:lineRule="auto"/>
-        <w:jc w:val="right"/>
-        <w:bidi w:val="1"/>
-      </w:pPr>
-      <w:r>
-        <w:rPr>
-          <w:rFonts w:ascii="David" w:hAnsi="David" w:eastAsia="David" w:cs="David"/>
-          <w:b w:val="0"/>
-          <w:color w:val="172337"/>
-          <w:sz w:val="26"/>
-          <w:rtl w:val="1"/>
-          <w:szCs w:val="26"/>
-        </w:rPr>
-        <w:t xml:space="preserve">לפי חלוקת תחומי האחריות שנמסרה, רביע התמקד בלוגיקת המשחק ובכללים של הגרסה המקומית. מותנא התמקד בהרחבת המערכת לשרת </w:t>
-      </w:r>
-      <w:r>
-        <w:rPr>
-          <w:rFonts w:ascii="Times New Roman" w:hAnsi="Times New Roman" w:eastAsia="Times New Roman" w:cs="Times New Roman"/>
-          <w:b w:val="0"/>
-          <w:color w:val="172337"/>
-          <w:sz w:val="26"/>
-          <w:rtl w:val="0"/>
-          <w:szCs w:val="26"/>
-        </w:rPr>
-        <w:t>TCP,</w:t>
-      </w:r>
-      <w:r>
-        <w:rPr>
-          <w:rFonts w:ascii="David" w:hAnsi="David" w:eastAsia="David" w:cs="David"/>
-          <w:b w:val="0"/>
-          <w:color w:val="172337"/>
-          <w:sz w:val="26"/>
-          <w:rtl w:val="1"/>
-          <w:szCs w:val="26"/>
-        </w:rPr>
-        <w:t xml:space="preserve"> בניהול חדרים, בחשבונות ובפרופילים, ובשילוב הרכיבים לגרסה הסופית העובדת.</w:t>
+        <w:t xml:space="preserve"> קריאת הקוד וההסברים, הרצה ובדיקות וביצוע התאמות בהתאם לתוצאות. הסיוע שימש הן לקידום המימוש והן ללמידה ולהבנת הפרויקט.</w:t>
       </w:r>
     </w:p>
     <w:p>
@@ -12403,9 +11910,272 @@
           <w:szCs w:val="44"/>
           <w:bCs w:val="1"/>
         </w:rPr>
+        <w:t xml:space="preserve"> תרומה אישית</w:t>
+      </w:r>
+      <w:bookmarkEnd w:id="11"/>
+    </w:p>
+    <w:p>
+      <w:pPr>
+        <w:spacing w:after="140" w:line="293" w:lineRule="auto"/>
+        <w:jc w:val="right"/>
+        <w:bidi w:val="1"/>
+      </w:pPr>
+      <w:r>
+        <w:rPr>
+          <w:rFonts w:ascii="David" w:hAnsi="David" w:eastAsia="David" w:cs="David"/>
+          <w:b w:val="0"/>
+          <w:color w:val="172337"/>
+          <w:sz w:val="26"/>
+          <w:rtl w:val="1"/>
+          <w:szCs w:val="26"/>
+        </w:rPr>
+        <w:t>תחומי האחריות שהוגדרו בפרויקט:</w:t>
+      </w:r>
+    </w:p>
+    <w:tbl>
+      <w:tblPr>
+        <w:tblW w:type="auto" w:w="0"/>
+        <w:tblLayout w:type="autofit"/>
+        <w:tblLook w:firstColumn="1" w:firstRow="1" w:lastColumn="0" w:lastRow="0" w:noHBand="0" w:noVBand="1" w:val="04A0"/>
+        <w:bidiVisual w:val="1"/>
+        <w:tblBorders>
+          <w:top w:val="single" w:sz="4" w:color="B6D0DF"/>
+          <w:left w:val="single" w:sz="4" w:color="B6D0DF"/>
+          <w:bottom w:val="single" w:sz="4" w:color="B6D0DF"/>
+          <w:right w:val="single" w:sz="4" w:color="B6D0DF"/>
+          <w:insideH w:val="single" w:sz="4" w:color="B6D0DF"/>
+          <w:insideV w:val="single" w:sz="4" w:color="B6D0DF"/>
+        </w:tblBorders>
+      </w:tblPr>
+      <w:tblGrid>
+        <w:gridCol w:w="3453"/>
+        <w:gridCol w:w="6412"/>
+      </w:tblGrid>
+      <w:tr>
+        <w:tc>
+          <w:tcPr>
+            <w:tcW w:type="dxa" w:w="4933"/>
+            <w:shd w:fill="d9e9f4"/>
+          </w:tcPr>
+          <w:p>
+            <w:pPr>
+              <w:spacing w:after="80" w:line="269" w:lineRule="auto"/>
+              <w:jc w:val="right"/>
+              <w:bidi w:val="1"/>
+            </w:pPr>
+            <w:r>
+              <w:rPr>
+                <w:rFonts w:ascii="David" w:hAnsi="David" w:eastAsia="David" w:cs="David"/>
+                <w:b/>
+                <w:color w:val="174C73"/>
+                <w:sz w:val="23"/>
+                <w:rtl w:val="1"/>
+                <w:szCs w:val="23"/>
+                <w:bCs w:val="1"/>
+              </w:rPr>
+              <w:t>סטודנט</w:t>
+            </w:r>
+          </w:p>
+        </w:tc>
+        <w:tc>
+          <w:tcPr>
+            <w:tcW w:type="dxa" w:w="4933"/>
+            <w:shd w:fill="d9e9f4"/>
+          </w:tcPr>
+          <w:p>
+            <w:pPr>
+              <w:spacing w:after="80" w:line="269" w:lineRule="auto"/>
+              <w:jc w:val="right"/>
+              <w:bidi w:val="1"/>
+            </w:pPr>
+            <w:r>
+              <w:rPr>
+                <w:rFonts w:ascii="David" w:hAnsi="David" w:eastAsia="David" w:cs="David"/>
+                <w:b/>
+                <w:color w:val="174C73"/>
+                <w:sz w:val="23"/>
+                <w:rtl w:val="1"/>
+                <w:szCs w:val="23"/>
+                <w:bCs w:val="1"/>
+              </w:rPr>
+              <w:t>תחום אחריות</w:t>
+            </w:r>
+          </w:p>
+        </w:tc>
+      </w:tr>
+      <w:tr>
+        <w:tc>
+          <w:tcPr>
+            <w:tcW w:type="dxa" w:w="4933"/>
+          </w:tcPr>
+          <w:p>
+            <w:pPr>
+              <w:spacing w:after="80" w:line="269" w:lineRule="auto"/>
+              <w:jc w:val="right"/>
+              <w:bidi w:val="1"/>
+            </w:pPr>
+            <w:r>
+              <w:rPr>
+                <w:rFonts w:ascii="David" w:hAnsi="David" w:eastAsia="David" w:cs="David"/>
+                <w:b w:val="0"/>
+                <w:color w:val="172337"/>
+                <w:sz w:val="23"/>
+                <w:rtl w:val="1"/>
+                <w:szCs w:val="23"/>
+              </w:rPr>
+              <w:t>רביע אבו עאד</w:t>
+            </w:r>
+          </w:p>
+        </w:tc>
+        <w:tc>
+          <w:tcPr>
+            <w:tcW w:type="dxa" w:w="4933"/>
+          </w:tcPr>
+          <w:p>
+            <w:pPr>
+              <w:spacing w:after="80" w:line="269" w:lineRule="auto"/>
+              <w:jc w:val="right"/>
+              <w:bidi w:val="1"/>
+            </w:pPr>
+            <w:r>
+              <w:rPr>
+                <w:rFonts w:ascii="David" w:hAnsi="David" w:eastAsia="David" w:cs="David"/>
+                <w:b w:val="0"/>
+                <w:color w:val="172337"/>
+                <w:sz w:val="23"/>
+                <w:rtl w:val="1"/>
+                <w:szCs w:val="23"/>
+              </w:rPr>
+              <w:t xml:space="preserve">לוגיקת המשחק </w:t>
+            </w:r>
+            <w:r>
+              <w:rPr>
+                <w:rFonts w:ascii="Times New Roman" w:hAnsi="Times New Roman" w:eastAsia="Times New Roman" w:cs="Times New Roman"/>
+                <w:b w:val="0"/>
+                <w:color w:val="172337"/>
+                <w:sz w:val="23"/>
+                <w:rtl w:val="0"/>
+                <w:szCs w:val="23"/>
+              </w:rPr>
+              <w:t>(Game Logic).</w:t>
+            </w:r>
+          </w:p>
+        </w:tc>
+      </w:tr>
+      <w:tr>
+        <w:tc>
+          <w:tcPr>
+            <w:tcW w:type="dxa" w:w="4933"/>
+          </w:tcPr>
+          <w:p>
+            <w:pPr>
+              <w:spacing w:after="80" w:line="269" w:lineRule="auto"/>
+              <w:jc w:val="right"/>
+              <w:bidi w:val="1"/>
+            </w:pPr>
+            <w:r>
+              <w:rPr>
+                <w:rFonts w:ascii="David" w:hAnsi="David" w:eastAsia="David" w:cs="David"/>
+                <w:b w:val="0"/>
+                <w:color w:val="172337"/>
+                <w:sz w:val="23"/>
+                <w:rtl w:val="1"/>
+                <w:szCs w:val="23"/>
+              </w:rPr>
+              <w:t>מותנא פרחאת</w:t>
+            </w:r>
+          </w:p>
+        </w:tc>
+        <w:tc>
+          <w:tcPr>
+            <w:tcW w:type="dxa" w:w="4933"/>
+          </w:tcPr>
+          <w:p>
+            <w:pPr>
+              <w:spacing w:after="80" w:line="269" w:lineRule="auto"/>
+              <w:jc w:val="right"/>
+              <w:bidi w:val="1"/>
+            </w:pPr>
+            <w:r>
+              <w:rPr>
+                <w:rFonts w:ascii="David" w:hAnsi="David" w:eastAsia="David" w:cs="David"/>
+                <w:b w:val="0"/>
+                <w:color w:val="172337"/>
+                <w:sz w:val="23"/>
+                <w:rtl w:val="1"/>
+                <w:szCs w:val="23"/>
+              </w:rPr>
+              <w:t xml:space="preserve">חיבור </w:t>
+            </w:r>
+            <w:r>
+              <w:rPr>
+                <w:rFonts w:ascii="Times New Roman" w:hAnsi="Times New Roman" w:eastAsia="Times New Roman" w:cs="Times New Roman"/>
+                <w:b w:val="0"/>
+                <w:color w:val="172337"/>
+                <w:sz w:val="23"/>
+                <w:rtl w:val="0"/>
+                <w:szCs w:val="23"/>
+              </w:rPr>
+              <w:t>TCP</w:t>
+            </w:r>
+            <w:r>
+              <w:rPr>
+                <w:rFonts w:ascii="David" w:hAnsi="David" w:eastAsia="David" w:cs="David"/>
+                <w:b w:val="0"/>
+                <w:color w:val="172337"/>
+                <w:sz w:val="23"/>
+                <w:rtl w:val="1"/>
+                <w:szCs w:val="23"/>
+              </w:rPr>
+              <w:t xml:space="preserve"> בין הלקוחות לשרת.</w:t>
+            </w:r>
+          </w:p>
+        </w:tc>
+      </w:tr>
+    </w:tbl>
+    <w:p>
+      <w:pPr>
+        <w:spacing w:after="40" w:line="40" w:lineRule="exact"/>
+      </w:pPr>
+    </w:p>
+    <w:p>
+      <w:pPr>
+        <w:spacing w:after="260" w:line="293" w:lineRule="auto" w:before="0"/>
+        <w:jc w:val="right"/>
+        <w:pStyle w:val="Heading1"/>
+        <w:keepNext/>
+        <w:pageBreakBefore/>
+        <w:bidi w:val="1"/>
+        <w:pBdr>
+          <w:bottom w:val="single" w:sz="18" w:color="D9E9F4"/>
+        </w:pBdr>
+      </w:pPr>
+      <w:bookmarkStart w:id="12" w:name="chapter_12"/>
+      <w:r>
+        <w:rPr>
+          <w:rFonts w:ascii="Times New Roman" w:hAnsi="Times New Roman" w:eastAsia="Times New Roman" w:cs="Times New Roman"/>
+          <w:b/>
+          <w:color w:val="174C73"/>
+          <w:sz w:val="44"/>
+          <w:rtl w:val="0"/>
+          <w:szCs w:val="44"/>
+          <w:bCs w:val="1"/>
+        </w:rPr>
+        <w:t>12.</w:t>
+      </w:r>
+      <w:r>
+        <w:rPr>
+          <w:rFonts w:ascii="David" w:hAnsi="David" w:eastAsia="David" w:cs="David"/>
+          <w:b/>
+          <w:color w:val="174C73"/>
+          <w:sz w:val="44"/>
+          <w:rtl w:val="1"/>
+          <w:szCs w:val="44"/>
+          <w:bCs w:val="1"/>
+        </w:rPr>
         <w:t xml:space="preserve"> סיכום, אתגרים ומקורות</w:t>
       </w:r>
-      <w:bookmarkEnd w:id="11"/>
+      <w:bookmarkEnd w:id="12"/>
     </w:p>
     <w:p>
       <w:pPr>
@@ -12425,7 +12195,7 @@
           <w:szCs w:val="32"/>
           <w:bCs w:val="1"/>
         </w:rPr>
-        <w:t>11.1</w:t>
+        <w:t>12.1</w:t>
       </w:r>
       <w:r>
         <w:rPr>
@@ -12520,7 +12290,7 @@
           <w:szCs w:val="32"/>
           <w:bCs w:val="1"/>
         </w:rPr>
-        <w:t>11.2</w:t>
+        <w:t>12.2</w:t>
       </w:r>
       <w:r>
         <w:rPr>
@@ -12761,7 +12531,7 @@
           <w:szCs w:val="32"/>
           <w:bCs w:val="1"/>
         </w:rPr>
-        <w:t>11.3</w:t>
+        <w:t>12.3</w:t>
       </w:r>
       <w:r>
         <w:rPr>
@@ -12834,7 +12604,7 @@
           <w:szCs w:val="32"/>
           <w:bCs w:val="1"/>
         </w:rPr>
-        <w:t>11.4</w:t>
+        <w:t>12.4</w:t>
       </w:r>
       <w:r>
         <w:rPr>

</xml_diff>

<commit_message>
Describe individual contributions in short paragraphs
</commit_message>
<xml_diff>
--- a/docs/project-book/Damka_Project_Book_TCP_Profile.docx
+++ b/docs/project-book/Damka_Project_Book_TCP_Profile.docx
@@ -11916,6 +11916,27 @@
     </w:p>
     <w:p>
       <w:pPr>
+        <w:spacing w:after="140" w:line="293" w:lineRule="auto" w:before="160"/>
+        <w:jc w:val="right"/>
+        <w:pStyle w:val="Heading2"/>
+        <w:keepNext/>
+        <w:bidi w:val="1"/>
+      </w:pPr>
+      <w:r>
+        <w:rPr>
+          <w:rFonts w:ascii="David" w:hAnsi="David" w:eastAsia="David" w:cs="David"/>
+          <w:b/>
+          <w:color w:val="174C73"/>
+          <w:sz w:val="32"/>
+          <w:rtl w:val="1"/>
+          <w:szCs w:val="32"/>
+          <w:bCs w:val="1"/>
+        </w:rPr>
+        <w:t>רביע אבו עאד</w:t>
+      </w:r>
+    </w:p>
+    <w:p>
+      <w:pPr>
         <w:spacing w:after="140" w:line="293" w:lineRule="auto"/>
         <w:jc w:val="right"/>
         <w:bidi w:val="1"/>
@@ -11929,214 +11950,113 @@
           <w:rtl w:val="1"/>
           <w:szCs w:val="26"/>
         </w:rPr>
-        <w:t>תחומי האחריות שהוגדרו בפרויקט:</w:t>
+        <w:t xml:space="preserve">תחום האחריות של רביע בפרויקט היה לוגיקת המשחק </w:t>
+      </w:r>
+      <w:r>
+        <w:rPr>
+          <w:rFonts w:ascii="Times New Roman" w:hAnsi="Times New Roman" w:eastAsia="Times New Roman" w:cs="Times New Roman"/>
+          <w:b w:val="0"/>
+          <w:color w:val="172337"/>
+          <w:sz w:val="26"/>
+          <w:rtl w:val="0"/>
+          <w:szCs w:val="26"/>
+        </w:rPr>
+        <w:t>(Game Logic).</w:t>
+      </w:r>
+      <w:r>
+        <w:rPr>
+          <w:rFonts w:ascii="David" w:hAnsi="David" w:eastAsia="David" w:cs="David"/>
+          <w:b w:val="0"/>
+          <w:color w:val="172337"/>
+          <w:sz w:val="26"/>
+          <w:rtl w:val="1"/>
+          <w:szCs w:val="26"/>
+        </w:rPr>
+        <w:t xml:space="preserve"> תחום זה כולל את כללי התנועה והאכילה, ניהול התורות וההכתרה, וקביעת סיום המשחק והמנצח.</w:t>
       </w:r>
     </w:p>
-    <w:tbl>
-      <w:tblPr>
-        <w:tblW w:type="auto" w:w="0"/>
-        <w:tblLayout w:type="autofit"/>
-        <w:tblLook w:firstColumn="1" w:firstRow="1" w:lastColumn="0" w:lastRow="0" w:noHBand="0" w:noVBand="1" w:val="04A0"/>
-        <w:bidiVisual w:val="1"/>
-        <w:tblBorders>
-          <w:top w:val="single" w:sz="4" w:color="B6D0DF"/>
-          <w:left w:val="single" w:sz="4" w:color="B6D0DF"/>
-          <w:bottom w:val="single" w:sz="4" w:color="B6D0DF"/>
-          <w:right w:val="single" w:sz="4" w:color="B6D0DF"/>
-          <w:insideH w:val="single" w:sz="4" w:color="B6D0DF"/>
-          <w:insideV w:val="single" w:sz="4" w:color="B6D0DF"/>
-        </w:tblBorders>
-      </w:tblPr>
-      <w:tblGrid>
-        <w:gridCol w:w="3453"/>
-        <w:gridCol w:w="6412"/>
-      </w:tblGrid>
-      <w:tr>
-        <w:tc>
-          <w:tcPr>
-            <w:tcW w:type="dxa" w:w="4933"/>
-            <w:shd w:fill="d9e9f4"/>
-          </w:tcPr>
-          <w:p>
-            <w:pPr>
-              <w:spacing w:after="80" w:line="269" w:lineRule="auto"/>
-              <w:jc w:val="right"/>
-              <w:bidi w:val="1"/>
-            </w:pPr>
-            <w:r>
-              <w:rPr>
-                <w:rFonts w:ascii="David" w:hAnsi="David" w:eastAsia="David" w:cs="David"/>
-                <w:b/>
-                <w:color w:val="174C73"/>
-                <w:sz w:val="23"/>
-                <w:rtl w:val="1"/>
-                <w:szCs w:val="23"/>
-                <w:bCs w:val="1"/>
-              </w:rPr>
-              <w:t>סטודנט</w:t>
-            </w:r>
-          </w:p>
-        </w:tc>
-        <w:tc>
-          <w:tcPr>
-            <w:tcW w:type="dxa" w:w="4933"/>
-            <w:shd w:fill="d9e9f4"/>
-          </w:tcPr>
-          <w:p>
-            <w:pPr>
-              <w:spacing w:after="80" w:line="269" w:lineRule="auto"/>
-              <w:jc w:val="right"/>
-              <w:bidi w:val="1"/>
-            </w:pPr>
-            <w:r>
-              <w:rPr>
-                <w:rFonts w:ascii="David" w:hAnsi="David" w:eastAsia="David" w:cs="David"/>
-                <w:b/>
-                <w:color w:val="174C73"/>
-                <w:sz w:val="23"/>
-                <w:rtl w:val="1"/>
-                <w:szCs w:val="23"/>
-                <w:bCs w:val="1"/>
-              </w:rPr>
-              <w:t>תחום אחריות</w:t>
-            </w:r>
-          </w:p>
-        </w:tc>
-      </w:tr>
-      <w:tr>
-        <w:tc>
-          <w:tcPr>
-            <w:tcW w:type="dxa" w:w="4933"/>
-          </w:tcPr>
-          <w:p>
-            <w:pPr>
-              <w:spacing w:after="80" w:line="269" w:lineRule="auto"/>
-              <w:jc w:val="right"/>
-              <w:bidi w:val="1"/>
-            </w:pPr>
-            <w:r>
-              <w:rPr>
-                <w:rFonts w:ascii="David" w:hAnsi="David" w:eastAsia="David" w:cs="David"/>
-                <w:b w:val="0"/>
-                <w:color w:val="172337"/>
-                <w:sz w:val="23"/>
-                <w:rtl w:val="1"/>
-                <w:szCs w:val="23"/>
-              </w:rPr>
-              <w:t>רביע אבו עאד</w:t>
-            </w:r>
-          </w:p>
-        </w:tc>
-        <w:tc>
-          <w:tcPr>
-            <w:tcW w:type="dxa" w:w="4933"/>
-          </w:tcPr>
-          <w:p>
-            <w:pPr>
-              <w:spacing w:after="80" w:line="269" w:lineRule="auto"/>
-              <w:jc w:val="right"/>
-              <w:bidi w:val="1"/>
-            </w:pPr>
-            <w:r>
-              <w:rPr>
-                <w:rFonts w:ascii="David" w:hAnsi="David" w:eastAsia="David" w:cs="David"/>
-                <w:b w:val="0"/>
-                <w:color w:val="172337"/>
-                <w:sz w:val="23"/>
-                <w:rtl w:val="1"/>
-                <w:szCs w:val="23"/>
-              </w:rPr>
-              <w:t xml:space="preserve">לוגיקת המשחק </w:t>
-            </w:r>
-            <w:r>
-              <w:rPr>
-                <w:rFonts w:ascii="Times New Roman" w:hAnsi="Times New Roman" w:eastAsia="Times New Roman" w:cs="Times New Roman"/>
-                <w:b w:val="0"/>
-                <w:color w:val="172337"/>
-                <w:sz w:val="23"/>
-                <w:rtl w:val="0"/>
-                <w:szCs w:val="23"/>
-              </w:rPr>
-              <w:t>(Game Logic).</w:t>
-            </w:r>
-          </w:p>
-        </w:tc>
-      </w:tr>
-      <w:tr>
-        <w:tc>
-          <w:tcPr>
-            <w:tcW w:type="dxa" w:w="4933"/>
-          </w:tcPr>
-          <w:p>
-            <w:pPr>
-              <w:spacing w:after="80" w:line="269" w:lineRule="auto"/>
-              <w:jc w:val="right"/>
-              <w:bidi w:val="1"/>
-            </w:pPr>
-            <w:r>
-              <w:rPr>
-                <w:rFonts w:ascii="David" w:hAnsi="David" w:eastAsia="David" w:cs="David"/>
-                <w:b w:val="0"/>
-                <w:color w:val="172337"/>
-                <w:sz w:val="23"/>
-                <w:rtl w:val="1"/>
-                <w:szCs w:val="23"/>
-              </w:rPr>
-              <w:t>מותנא פרחאת</w:t>
-            </w:r>
-          </w:p>
-        </w:tc>
-        <w:tc>
-          <w:tcPr>
-            <w:tcW w:type="dxa" w:w="4933"/>
-          </w:tcPr>
-          <w:p>
-            <w:pPr>
-              <w:spacing w:after="80" w:line="269" w:lineRule="auto"/>
-              <w:jc w:val="right"/>
-              <w:bidi w:val="1"/>
-            </w:pPr>
-            <w:r>
-              <w:rPr>
-                <w:rFonts w:ascii="David" w:hAnsi="David" w:eastAsia="David" w:cs="David"/>
-                <w:b w:val="0"/>
-                <w:color w:val="172337"/>
-                <w:sz w:val="23"/>
-                <w:rtl w:val="1"/>
-                <w:szCs w:val="23"/>
-              </w:rPr>
-              <w:t xml:space="preserve">חיבור </w:t>
-            </w:r>
-            <w:r>
-              <w:rPr>
-                <w:rFonts w:ascii="Times New Roman" w:hAnsi="Times New Roman" w:eastAsia="Times New Roman" w:cs="Times New Roman"/>
-                <w:b w:val="0"/>
-                <w:color w:val="172337"/>
-                <w:sz w:val="23"/>
-                <w:rtl w:val="0"/>
-                <w:szCs w:val="23"/>
-              </w:rPr>
-              <w:t>TCP</w:t>
-            </w:r>
-            <w:r>
-              <w:rPr>
-                <w:rFonts w:ascii="David" w:hAnsi="David" w:eastAsia="David" w:cs="David"/>
-                <w:b w:val="0"/>
-                <w:color w:val="172337"/>
-                <w:sz w:val="23"/>
-                <w:rtl w:val="1"/>
-                <w:szCs w:val="23"/>
-              </w:rPr>
-              <w:t xml:space="preserve"> בין הלקוחות לשרת.</w:t>
-            </w:r>
-          </w:p>
-        </w:tc>
-      </w:tr>
-    </w:tbl>
     <w:p>
       <w:pPr>
-        <w:spacing w:after="40" w:line="40" w:lineRule="exact"/>
+        <w:spacing w:after="140" w:line="293" w:lineRule="auto" w:before="160"/>
+        <w:jc w:val="right"/>
+        <w:pStyle w:val="Heading2"/>
+        <w:keepNext/>
+        <w:bidi w:val="1"/>
       </w:pPr>
+      <w:r>
+        <w:rPr>
+          <w:rFonts w:ascii="David" w:hAnsi="David" w:eastAsia="David" w:cs="David"/>
+          <w:b/>
+          <w:color w:val="174C73"/>
+          <w:sz w:val="32"/>
+          <w:rtl w:val="1"/>
+          <w:szCs w:val="32"/>
+          <w:bCs w:val="1"/>
+        </w:rPr>
+        <w:t>מותנא פרחאת</w:t>
+      </w:r>
+    </w:p>
+    <w:p>
+      <w:pPr>
+        <w:spacing w:after="140" w:line="293" w:lineRule="auto"/>
+        <w:jc w:val="right"/>
+        <w:bidi w:val="1"/>
+      </w:pPr>
+      <w:r>
+        <w:rPr>
+          <w:rFonts w:ascii="David" w:hAnsi="David" w:eastAsia="David" w:cs="David"/>
+          <w:b w:val="0"/>
+          <w:color w:val="172337"/>
+          <w:sz w:val="26"/>
+          <w:rtl w:val="1"/>
+          <w:szCs w:val="26"/>
+        </w:rPr>
+        <w:t xml:space="preserve">תחום האחריות של מותנא בפרויקט היה חיבור </w:t>
+      </w:r>
+      <w:r>
+        <w:rPr>
+          <w:rFonts w:ascii="Times New Roman" w:hAnsi="Times New Roman" w:eastAsia="Times New Roman" w:cs="Times New Roman"/>
+          <w:b w:val="0"/>
+          <w:color w:val="172337"/>
+          <w:sz w:val="26"/>
+          <w:rtl w:val="0"/>
+          <w:szCs w:val="26"/>
+        </w:rPr>
+        <w:t>TCP</w:t>
+      </w:r>
+      <w:r>
+        <w:rPr>
+          <w:rFonts w:ascii="David" w:hAnsi="David" w:eastAsia="David" w:cs="David"/>
+          <w:b w:val="0"/>
+          <w:color w:val="172337"/>
+          <w:sz w:val="26"/>
+          <w:rtl w:val="1"/>
+          <w:szCs w:val="26"/>
+        </w:rPr>
+        <w:t xml:space="preserve"> בין לקוחות </w:t>
+      </w:r>
+      <w:r>
+        <w:rPr>
+          <w:rFonts w:ascii="Times New Roman" w:hAnsi="Times New Roman" w:eastAsia="Times New Roman" w:cs="Times New Roman"/>
+          <w:b w:val="0"/>
+          <w:color w:val="172337"/>
+          <w:sz w:val="26"/>
+          <w:rtl w:val="0"/>
+          <w:szCs w:val="26"/>
+        </w:rPr>
+        <w:t>JavaFX</w:t>
+      </w:r>
+      <w:r>
+        <w:rPr>
+          <w:rFonts w:ascii="David" w:hAnsi="David" w:eastAsia="David" w:cs="David"/>
+          <w:b w:val="0"/>
+          <w:color w:val="172337"/>
+          <w:sz w:val="26"/>
+          <w:rtl w:val="1"/>
+          <w:szCs w:val="26"/>
+        </w:rPr>
+        <w:t xml:space="preserve"> לשרת. תחום זה כולל פתיחת חיבורים והעברת בקשות ותשובות, כך ששני השחקנים מציגים מצב משחק מסונכרן.</w:t>
+      </w:r>
     </w:p>
     <w:p>
       <w:pPr>

</xml_diff>